<commit_message>
formai dolgok egybehozása a doksiban
</commit_message>
<xml_diff>
--- a/doc/kesz_doksi/uj_osszeallitott_doksi.docx
+++ b/doc/kesz_doksi/uj_osszeallitott_doksi.docx
@@ -15806,7 +15806,7 @@
         <w:ind w:firstLine="708"/>
       </w:pPr>
       <w:r>
-        <w:t xml:space="preserve">Az oldalréteg az alkalmazás navigálható nézeteit tartalmazza. Minden oldal egy </w:t>
+        <w:t xml:space="preserve">Az alkalmazás navigálható nézetei. Minden oldal egy </w:t>
       </w:r>
       <w:proofErr w:type="spellStart"/>
       <w:r>
@@ -16092,7 +16092,29 @@
       </w:r>
       <w:proofErr w:type="spellEnd"/>
       <w:r>
-        <w:t xml:space="preserve"> komponensből áll. A </w:t>
+        <w:t xml:space="preserve"> komponensből áll</w:t>
+      </w:r>
+      <w:r>
+        <w:t xml:space="preserve">, amelyek </w:t>
+      </w:r>
+      <w:proofErr w:type="spellStart"/>
+      <w:r>
+        <w:t>React</w:t>
+      </w:r>
+      <w:proofErr w:type="spellEnd"/>
+      <w:r>
+        <w:t xml:space="preserve"> Router struktúrának megfelelő </w:t>
+      </w:r>
+      <w:proofErr w:type="spellStart"/>
+      <w:r>
+        <w:t>loader</w:t>
+      </w:r>
+      <w:proofErr w:type="spellEnd"/>
+      <w:r>
+        <w:t xml:space="preserve"> függvények</w:t>
+      </w:r>
+      <w:r>
+        <w:t xml:space="preserve">. A </w:t>
       </w:r>
       <w:proofErr w:type="spellStart"/>
       <w:r>
@@ -16174,6 +16196,24 @@
       <w:r>
         <w:t xml:space="preserve"> hiányában vagy nem megfelelő jogosultság esetén azonnal visszairányítja a felhasználót a bejelentkezési oldalra.</w:t>
       </w:r>
+    </w:p>
+    <w:p>
+      <w:pPr>
+        <w:spacing w:after="120" w:line="360" w:lineRule="auto"/>
+        <w:jc w:val="both"/>
+      </w:pPr>
+    </w:p>
+    <w:p>
+      <w:pPr>
+        <w:spacing w:after="120" w:line="360" w:lineRule="auto"/>
+        <w:jc w:val="both"/>
+      </w:pPr>
+    </w:p>
+    <w:p>
+      <w:pPr>
+        <w:spacing w:after="120" w:line="360" w:lineRule="auto"/>
+        <w:jc w:val="both"/>
+      </w:pPr>
     </w:p>
     <w:p>
       <w:pPr>
@@ -16284,7 +16324,6 @@
         </w:rPr>
       </w:pPr>
       <w:r>
-        <w:lastRenderedPageBreak/>
         <w:fldChar w:fldCharType="begin"/>
       </w:r>
       <w:r>
@@ -22718,13 +22757,13 @@
     <w:p/>
     <w:p>
       <w:pPr>
+        <w:pStyle w:val="Cmsor2"/>
         <w:rPr>
           <w:b/>
           <w:bCs/>
           <w:lang w:val="en-GB"/>
         </w:rPr>
       </w:pPr>
-      <w:proofErr w:type="spellStart"/>
       <w:r>
         <w:rPr>
           <w:b/>
@@ -22732,587 +22771,67 @@
           <w:lang w:val="en-GB"/>
         </w:rPr>
         <w:lastRenderedPageBreak/>
-        <w:t>Teszt</w:t>
-      </w:r>
-      <w:proofErr w:type="spellEnd"/>
+        <w:t xml:space="preserve">1. </w:t>
+      </w:r>
+      <w:proofErr w:type="spellStart"/>
       <w:r>
         <w:rPr>
           <w:b/>
           <w:bCs/>
           <w:lang w:val="en-GB"/>
         </w:rPr>
+        <w:t>Bevezetés</w:t>
+      </w:r>
+      <w:proofErr w:type="spellEnd"/>
+    </w:p>
+    <w:p>
+      <w:pPr>
+        <w:rPr>
+          <w:lang w:val="en-GB"/>
+        </w:rPr>
+      </w:pPr>
+    </w:p>
+    <w:p>
+      <w:pPr>
+        <w:pStyle w:val="Cmsor3"/>
+        <w:rPr>
+          <w:lang w:val="en-GB"/>
+        </w:rPr>
+      </w:pPr>
+      <w:r>
+        <w:rPr>
+          <w:lang w:val="en-GB"/>
+        </w:rPr>
+        <w:t xml:space="preserve">1.1 A </w:t>
+      </w:r>
+      <w:proofErr w:type="spellStart"/>
+      <w:r>
+        <w:rPr>
+          <w:lang w:val="en-GB"/>
+        </w:rPr>
+        <w:t>tesztrendszer</w:t>
+      </w:r>
+      <w:proofErr w:type="spellEnd"/>
+      <w:r>
+        <w:rPr>
+          <w:lang w:val="en-GB"/>
+        </w:rPr>
         <w:t xml:space="preserve"> </w:t>
       </w:r>
       <w:proofErr w:type="spellStart"/>
       <w:r>
         <w:rPr>
-          <w:b/>
-          <w:bCs/>
-          <w:lang w:val="en-GB"/>
-        </w:rPr>
-        <w:t>Dokumentáció</w:t>
-      </w:r>
-      <w:proofErr w:type="spellEnd"/>
-    </w:p>
-    <w:p>
-      <w:pPr>
-        <w:rPr>
-          <w:lang w:val="en-GB"/>
-        </w:rPr>
-      </w:pPr>
-      <w:proofErr w:type="spellStart"/>
-      <w:r>
-        <w:rPr>
-          <w:b/>
-          <w:bCs/>
-          <w:lang w:val="en-GB"/>
-        </w:rPr>
-        <w:t>CrossCountryBuilds</w:t>
-      </w:r>
-      <w:proofErr w:type="spellEnd"/>
-      <w:r>
-        <w:rPr>
-          <w:b/>
-          <w:bCs/>
-          <w:lang w:val="en-GB"/>
-        </w:rPr>
-        <w:t xml:space="preserve"> </w:t>
-      </w:r>
-      <w:proofErr w:type="spellStart"/>
-      <w:r>
-        <w:rPr>
-          <w:b/>
-          <w:bCs/>
-          <w:lang w:val="en-GB"/>
-        </w:rPr>
-        <w:t>Webshop</w:t>
-      </w:r>
-      <w:proofErr w:type="spellEnd"/>
-      <w:r>
-        <w:rPr>
-          <w:b/>
-          <w:bCs/>
-          <w:lang w:val="en-GB"/>
-        </w:rPr>
-        <w:t xml:space="preserve"> - Backend API </w:t>
-      </w:r>
-      <w:proofErr w:type="spellStart"/>
-      <w:r>
-        <w:rPr>
-          <w:b/>
-          <w:bCs/>
-          <w:lang w:val="en-GB"/>
-        </w:rPr>
-        <w:t>Tesztek</w:t>
-      </w:r>
-      <w:proofErr w:type="spellEnd"/>
-    </w:p>
-    <w:p>
-      <w:pPr>
-        <w:rPr>
-          <w:lang w:val="en-GB"/>
-        </w:rPr>
-      </w:pPr>
-      <w:proofErr w:type="spellStart"/>
-      <w:r>
-        <w:rPr>
-          <w:lang w:val="en-GB"/>
-        </w:rPr>
-        <w:t>Készült</w:t>
-      </w:r>
-      <w:proofErr w:type="spellEnd"/>
-      <w:r>
-        <w:rPr>
-          <w:lang w:val="en-GB"/>
-        </w:rPr>
-        <w:t xml:space="preserve">: 2026. </w:t>
-      </w:r>
-      <w:proofErr w:type="spellStart"/>
-      <w:r>
-        <w:rPr>
-          <w:lang w:val="en-GB"/>
-        </w:rPr>
-        <w:t>március</w:t>
-      </w:r>
-      <w:proofErr w:type="spellEnd"/>
-      <w:r>
-        <w:rPr>
-          <w:lang w:val="en-GB"/>
-        </w:rPr>
-        <w:t xml:space="preserve"> 26.</w:t>
-      </w:r>
-    </w:p>
-    <w:p>
-      <w:pPr>
-        <w:rPr>
-          <w:b/>
-          <w:bCs/>
-          <w:lang w:val="en-GB"/>
-        </w:rPr>
-      </w:pPr>
-      <w:proofErr w:type="spellStart"/>
-      <w:r>
-        <w:rPr>
-          <w:b/>
-          <w:bCs/>
-          <w:lang w:val="en-GB"/>
-        </w:rPr>
-        <w:t>Tartalomjegyzék</w:t>
-      </w:r>
-      <w:proofErr w:type="spellEnd"/>
-    </w:p>
-    <w:p>
-      <w:pPr>
-        <w:numPr>
-          <w:ilvl w:val="0"/>
-          <w:numId w:val="16"/>
-        </w:numPr>
-        <w:rPr>
-          <w:lang w:val="en-GB"/>
-        </w:rPr>
-      </w:pPr>
-      <w:r>
-        <w:rPr>
-          <w:lang w:val="en-GB"/>
-        </w:rPr>
-        <w:t xml:space="preserve">1. </w:t>
-      </w:r>
-      <w:proofErr w:type="spellStart"/>
-      <w:r>
-        <w:rPr>
-          <w:lang w:val="en-GB"/>
-        </w:rPr>
-        <w:t>Bevezetés</w:t>
-      </w:r>
-      <w:proofErr w:type="spellEnd"/>
-    </w:p>
-    <w:p>
-      <w:pPr>
-        <w:numPr>
-          <w:ilvl w:val="0"/>
-          <w:numId w:val="16"/>
-        </w:numPr>
-        <w:rPr>
-          <w:lang w:val="en-GB"/>
-        </w:rPr>
-      </w:pPr>
-      <w:r>
-        <w:rPr>
-          <w:lang w:val="en-GB"/>
-        </w:rPr>
-        <w:t xml:space="preserve">2. </w:t>
-      </w:r>
-      <w:proofErr w:type="spellStart"/>
-      <w:r>
-        <w:rPr>
-          <w:lang w:val="en-GB"/>
-        </w:rPr>
-        <w:t>Tesztkörnyezet</w:t>
-      </w:r>
-      <w:proofErr w:type="spellEnd"/>
-      <w:r>
-        <w:rPr>
-          <w:lang w:val="en-GB"/>
-        </w:rPr>
-        <w:t xml:space="preserve"> </w:t>
-      </w:r>
-      <w:proofErr w:type="spellStart"/>
-      <w:r>
-        <w:rPr>
-          <w:lang w:val="en-GB"/>
-        </w:rPr>
-        <w:t>konfigurációja</w:t>
-      </w:r>
-      <w:proofErr w:type="spellEnd"/>
-    </w:p>
-    <w:p>
-      <w:pPr>
-        <w:numPr>
-          <w:ilvl w:val="0"/>
-          <w:numId w:val="16"/>
-        </w:numPr>
-        <w:rPr>
-          <w:lang w:val="en-GB"/>
-        </w:rPr>
-      </w:pPr>
-      <w:r>
-        <w:rPr>
-          <w:lang w:val="en-GB"/>
-        </w:rPr>
-        <w:t xml:space="preserve">3. API </w:t>
-      </w:r>
-      <w:proofErr w:type="spellStart"/>
-      <w:r>
-        <w:rPr>
-          <w:lang w:val="en-GB"/>
-        </w:rPr>
-        <w:t>Tesztek</w:t>
-      </w:r>
-      <w:proofErr w:type="spellEnd"/>
-      <w:r>
-        <w:rPr>
-          <w:lang w:val="en-GB"/>
-        </w:rPr>
-        <w:t xml:space="preserve"> </w:t>
-      </w:r>
-      <w:proofErr w:type="spellStart"/>
-      <w:r>
-        <w:rPr>
-          <w:lang w:val="en-GB"/>
-        </w:rPr>
-        <w:t>áttekintése</w:t>
-      </w:r>
-      <w:proofErr w:type="spellEnd"/>
-    </w:p>
-    <w:p>
-      <w:pPr>
-        <w:numPr>
-          <w:ilvl w:val="0"/>
-          <w:numId w:val="16"/>
-        </w:numPr>
-        <w:rPr>
-          <w:lang w:val="en-GB"/>
-        </w:rPr>
-      </w:pPr>
-      <w:r>
-        <w:rPr>
-          <w:lang w:val="en-GB"/>
-        </w:rPr>
-        <w:t xml:space="preserve">4. </w:t>
-      </w:r>
-      <w:proofErr w:type="spellStart"/>
-      <w:r>
-        <w:rPr>
-          <w:lang w:val="en-GB"/>
-        </w:rPr>
-        <w:t>Részletes</w:t>
-      </w:r>
-      <w:proofErr w:type="spellEnd"/>
-      <w:r>
-        <w:rPr>
-          <w:lang w:val="en-GB"/>
-        </w:rPr>
-        <w:t xml:space="preserve"> </w:t>
-      </w:r>
-      <w:proofErr w:type="spellStart"/>
-      <w:r>
-        <w:rPr>
-          <w:lang w:val="en-GB"/>
-        </w:rPr>
-        <w:t>tesztesetek</w:t>
-      </w:r>
-      <w:proofErr w:type="spellEnd"/>
-      <w:r>
-        <w:rPr>
-          <w:lang w:val="en-GB"/>
-        </w:rPr>
-        <w:t xml:space="preserve"> </w:t>
-      </w:r>
-      <w:proofErr w:type="spellStart"/>
-      <w:r>
-        <w:rPr>
-          <w:lang w:val="en-GB"/>
-        </w:rPr>
-        <w:t>leírása</w:t>
-      </w:r>
-      <w:proofErr w:type="spellEnd"/>
-    </w:p>
-    <w:p>
-      <w:pPr>
-        <w:numPr>
-          <w:ilvl w:val="1"/>
-          <w:numId w:val="16"/>
-        </w:numPr>
-        <w:rPr>
-          <w:lang w:val="en-GB"/>
-        </w:rPr>
-      </w:pPr>
-      <w:r>
-        <w:rPr>
-          <w:lang w:val="en-GB"/>
-        </w:rPr>
-        <w:t xml:space="preserve">4.1 </w:t>
-      </w:r>
-      <w:proofErr w:type="spellStart"/>
-      <w:r>
-        <w:rPr>
-          <w:lang w:val="en-GB"/>
-        </w:rPr>
-        <w:t>Hitelesítés</w:t>
-      </w:r>
-      <w:proofErr w:type="spellEnd"/>
-      <w:r>
-        <w:rPr>
-          <w:lang w:val="en-GB"/>
-        </w:rPr>
-        <w:t xml:space="preserve"> (auth.test.js)</w:t>
-      </w:r>
-    </w:p>
-    <w:p>
-      <w:pPr>
-        <w:numPr>
-          <w:ilvl w:val="1"/>
-          <w:numId w:val="16"/>
-        </w:numPr>
-        <w:rPr>
-          <w:lang w:val="en-GB"/>
-        </w:rPr>
-      </w:pPr>
-      <w:r>
-        <w:rPr>
-          <w:lang w:val="en-GB"/>
-        </w:rPr>
-        <w:t xml:space="preserve">4.2 </w:t>
-      </w:r>
-      <w:proofErr w:type="spellStart"/>
-      <w:r>
-        <w:rPr>
-          <w:lang w:val="en-GB"/>
-        </w:rPr>
-        <w:t>Termékek</w:t>
-      </w:r>
-      <w:proofErr w:type="spellEnd"/>
-      <w:r>
-        <w:rPr>
-          <w:lang w:val="en-GB"/>
-        </w:rPr>
-        <w:t xml:space="preserve"> (products.test.js)</w:t>
-      </w:r>
-    </w:p>
-    <w:p>
-      <w:pPr>
-        <w:numPr>
-          <w:ilvl w:val="1"/>
-          <w:numId w:val="16"/>
-        </w:numPr>
-        <w:rPr>
-          <w:lang w:val="en-GB"/>
-        </w:rPr>
-      </w:pPr>
-      <w:r>
-        <w:rPr>
-          <w:lang w:val="en-GB"/>
-        </w:rPr>
-        <w:t xml:space="preserve">4.3 </w:t>
-      </w:r>
-      <w:proofErr w:type="spellStart"/>
-      <w:r>
-        <w:rPr>
-          <w:lang w:val="en-GB"/>
-        </w:rPr>
-        <w:t>Megrendelések</w:t>
-      </w:r>
-      <w:proofErr w:type="spellEnd"/>
-      <w:r>
-        <w:rPr>
-          <w:lang w:val="en-GB"/>
-        </w:rPr>
-        <w:t xml:space="preserve"> (orders.test.js)</w:t>
-      </w:r>
-    </w:p>
-    <w:p>
-      <w:pPr>
-        <w:numPr>
-          <w:ilvl w:val="1"/>
-          <w:numId w:val="16"/>
-        </w:numPr>
-        <w:rPr>
-          <w:lang w:val="en-GB"/>
-        </w:rPr>
-      </w:pPr>
-      <w:r>
-        <w:rPr>
-          <w:lang w:val="en-GB"/>
-        </w:rPr>
-        <w:t xml:space="preserve">4.4 </w:t>
-      </w:r>
-      <w:proofErr w:type="spellStart"/>
-      <w:r>
-        <w:rPr>
-          <w:lang w:val="en-GB"/>
-        </w:rPr>
-        <w:t>Időpontok</w:t>
-      </w:r>
-      <w:proofErr w:type="spellEnd"/>
-      <w:r>
-        <w:rPr>
-          <w:lang w:val="en-GB"/>
-        </w:rPr>
-        <w:t xml:space="preserve"> (appointments.test.js)</w:t>
-      </w:r>
-    </w:p>
-    <w:p>
-      <w:pPr>
-        <w:numPr>
-          <w:ilvl w:val="1"/>
-          <w:numId w:val="16"/>
-        </w:numPr>
-        <w:rPr>
-          <w:lang w:val="en-GB"/>
-        </w:rPr>
-      </w:pPr>
-      <w:r>
-        <w:rPr>
-          <w:lang w:val="en-GB"/>
-        </w:rPr>
-        <w:t xml:space="preserve">4.5 </w:t>
-      </w:r>
-      <w:proofErr w:type="spellStart"/>
-      <w:r>
-        <w:rPr>
-          <w:lang w:val="en-GB"/>
-        </w:rPr>
-        <w:t>Felhasználók</w:t>
-      </w:r>
-      <w:proofErr w:type="spellEnd"/>
-      <w:r>
-        <w:rPr>
-          <w:lang w:val="en-GB"/>
-        </w:rPr>
-        <w:t xml:space="preserve"> (users.test.js)</w:t>
-      </w:r>
-    </w:p>
-    <w:p>
-      <w:pPr>
-        <w:numPr>
-          <w:ilvl w:val="1"/>
-          <w:numId w:val="16"/>
-        </w:numPr>
-        <w:rPr>
-          <w:lang w:val="en-GB"/>
-        </w:rPr>
-      </w:pPr>
-      <w:r>
-        <w:rPr>
-          <w:lang w:val="en-GB"/>
-        </w:rPr>
-        <w:t xml:space="preserve">4.6 </w:t>
-      </w:r>
-      <w:proofErr w:type="spellStart"/>
-      <w:r>
-        <w:rPr>
-          <w:lang w:val="en-GB"/>
-        </w:rPr>
-        <w:t>Egyéb</w:t>
-      </w:r>
-      <w:proofErr w:type="spellEnd"/>
-      <w:r>
-        <w:rPr>
-          <w:lang w:val="en-GB"/>
-        </w:rPr>
-        <w:t xml:space="preserve"> </w:t>
-      </w:r>
-      <w:proofErr w:type="spellStart"/>
-      <w:r>
-        <w:rPr>
-          <w:lang w:val="en-GB"/>
-        </w:rPr>
-        <w:t>tesztek</w:t>
-      </w:r>
-      <w:proofErr w:type="spellEnd"/>
-      <w:r>
-        <w:rPr>
-          <w:lang w:val="en-GB"/>
-        </w:rPr>
-        <w:t xml:space="preserve"> (misc.test.js)</w:t>
-      </w:r>
-    </w:p>
-    <w:p>
-      <w:pPr>
-        <w:numPr>
-          <w:ilvl w:val="0"/>
-          <w:numId w:val="16"/>
-        </w:numPr>
-        <w:rPr>
-          <w:lang w:val="en-GB"/>
-        </w:rPr>
-      </w:pPr>
-      <w:r>
-        <w:rPr>
-          <w:lang w:val="en-GB"/>
-        </w:rPr>
-        <w:t xml:space="preserve">5. </w:t>
-      </w:r>
-      <w:proofErr w:type="spellStart"/>
-      <w:r>
-        <w:rPr>
-          <w:lang w:val="en-GB"/>
-        </w:rPr>
-        <w:t>Összefoglalás</w:t>
-      </w:r>
-      <w:proofErr w:type="spellEnd"/>
-    </w:p>
-    <w:p>
-      <w:pPr>
-        <w:rPr>
-          <w:b/>
-          <w:bCs/>
-          <w:lang w:val="en-GB"/>
-        </w:rPr>
-      </w:pPr>
-      <w:r>
-        <w:rPr>
-          <w:b/>
-          <w:bCs/>
-          <w:lang w:val="en-GB"/>
-        </w:rPr>
-        <w:t xml:space="preserve">1. </w:t>
-      </w:r>
-      <w:proofErr w:type="spellStart"/>
-      <w:r>
-        <w:rPr>
-          <w:b/>
-          <w:bCs/>
-          <w:lang w:val="en-GB"/>
-        </w:rPr>
-        <w:t>Bevezetés</w:t>
-      </w:r>
-      <w:proofErr w:type="spellEnd"/>
-    </w:p>
-    <w:p>
-      <w:pPr>
-        <w:rPr>
-          <w:b/>
-          <w:bCs/>
-          <w:lang w:val="en-GB"/>
-        </w:rPr>
-      </w:pPr>
-      <w:r>
-        <w:rPr>
-          <w:b/>
-          <w:bCs/>
-          <w:lang w:val="en-GB"/>
-        </w:rPr>
-        <w:t xml:space="preserve">1.1 A </w:t>
-      </w:r>
-      <w:proofErr w:type="spellStart"/>
-      <w:r>
-        <w:rPr>
-          <w:b/>
-          <w:bCs/>
-          <w:lang w:val="en-GB"/>
-        </w:rPr>
-        <w:t>tesztrendszer</w:t>
-      </w:r>
-      <w:proofErr w:type="spellEnd"/>
-      <w:r>
-        <w:rPr>
-          <w:b/>
-          <w:bCs/>
-          <w:lang w:val="en-GB"/>
-        </w:rPr>
-        <w:t xml:space="preserve"> </w:t>
-      </w:r>
-      <w:proofErr w:type="spellStart"/>
-      <w:r>
-        <w:rPr>
-          <w:b/>
-          <w:bCs/>
           <w:lang w:val="en-GB"/>
         </w:rPr>
         <w:t>célja</w:t>
       </w:r>
       <w:proofErr w:type="spellEnd"/>
+      <w:r>
+        <w:rPr>
+          <w:lang w:val="en-GB"/>
+        </w:rPr>
+        <w:t>:</w:t>
+      </w:r>
     </w:p>
     <w:p>
       <w:pPr>
@@ -23906,26 +23425,20 @@
     </w:p>
     <w:p>
       <w:pPr>
-        <w:rPr>
-          <w:b/>
-          <w:bCs/>
-          <w:lang w:val="en-GB"/>
-        </w:rPr>
-      </w:pPr>
-      <w:r>
-        <w:rPr>
-          <w:b/>
-          <w:bCs/>
-          <w:lang w:val="en-GB"/>
-        </w:rPr>
-        <w:lastRenderedPageBreak/>
+        <w:pStyle w:val="Cmsor3"/>
+        <w:rPr>
+          <w:lang w:val="en-GB"/>
+        </w:rPr>
+      </w:pPr>
+      <w:r>
+        <w:rPr>
+          <w:lang w:val="en-GB"/>
+        </w:rPr>
         <w:t xml:space="preserve">1.2 </w:t>
       </w:r>
       <w:proofErr w:type="spellStart"/>
       <w:r>
         <w:rPr>
-          <w:b/>
-          <w:bCs/>
           <w:lang w:val="en-GB"/>
         </w:rPr>
         <w:t>Használt</w:t>
@@ -23933,8 +23446,6 @@
       <w:proofErr w:type="spellEnd"/>
       <w:r>
         <w:rPr>
-          <w:b/>
-          <w:bCs/>
           <w:lang w:val="en-GB"/>
         </w:rPr>
         <w:t xml:space="preserve"> </w:t>
@@ -23942,13 +23453,17 @@
       <w:proofErr w:type="spellStart"/>
       <w:r>
         <w:rPr>
-          <w:b/>
-          <w:bCs/>
           <w:lang w:val="en-GB"/>
         </w:rPr>
         <w:t>technológiák</w:t>
       </w:r>
       <w:proofErr w:type="spellEnd"/>
+      <w:r>
+        <w:rPr>
+          <w:lang w:val="en-GB"/>
+        </w:rPr>
+        <w:t>:</w:t>
+      </w:r>
     </w:p>
     <w:p>
       <w:pPr>
@@ -24079,6 +23594,223 @@
     </w:p>
     <w:p>
       <w:pPr>
+        <w:pStyle w:val="Cmsor3"/>
+        <w:rPr>
+          <w:lang w:val="en-GB"/>
+        </w:rPr>
+      </w:pPr>
+      <w:r>
+        <w:rPr>
+          <w:lang w:val="en-GB"/>
+        </w:rPr>
+        <w:t xml:space="preserve">1.3 </w:t>
+      </w:r>
+      <w:proofErr w:type="spellStart"/>
+      <w:r>
+        <w:rPr>
+          <w:lang w:val="en-GB"/>
+        </w:rPr>
+        <w:t>Teszt</w:t>
+      </w:r>
+      <w:proofErr w:type="spellEnd"/>
+      <w:r>
+        <w:rPr>
+          <w:lang w:val="en-GB"/>
+        </w:rPr>
+        <w:t xml:space="preserve"> </w:t>
+      </w:r>
+      <w:proofErr w:type="spellStart"/>
+      <w:r>
+        <w:rPr>
+          <w:lang w:val="en-GB"/>
+        </w:rPr>
+        <w:t>futtatás</w:t>
+      </w:r>
+      <w:proofErr w:type="spellEnd"/>
+      <w:r>
+        <w:rPr>
+          <w:lang w:val="en-GB"/>
+        </w:rPr>
+        <w:t>:</w:t>
+      </w:r>
+    </w:p>
+    <w:p>
+      <w:pPr>
+        <w:rPr>
+          <w:lang w:val="en-GB"/>
+        </w:rPr>
+      </w:pPr>
+      <w:r>
+        <w:rPr>
+          <w:lang w:val="en-GB"/>
+        </w:rPr>
+        <w:t>cd projekt_backend2/tests</w:t>
+      </w:r>
+    </w:p>
+    <w:p>
+      <w:pPr>
+        <w:rPr>
+          <w:lang w:val="en-GB"/>
+        </w:rPr>
+      </w:pPr>
+      <w:proofErr w:type="spellStart"/>
+      <w:r>
+        <w:rPr>
+          <w:lang w:val="en-GB"/>
+        </w:rPr>
+        <w:t>npm</w:t>
+      </w:r>
+      <w:proofErr w:type="spellEnd"/>
+      <w:r>
+        <w:rPr>
+          <w:lang w:val="en-GB"/>
+        </w:rPr>
+        <w:t xml:space="preserve"> test</w:t>
+      </w:r>
+    </w:p>
+    <w:p>
+      <w:pPr>
+        <w:rPr>
+          <w:lang w:val="en-GB"/>
+        </w:rPr>
+      </w:pPr>
+      <w:r>
+        <w:rPr>
+          <w:lang w:val="en-GB"/>
+        </w:rPr>
+        <w:t xml:space="preserve">A </w:t>
+      </w:r>
+      <w:proofErr w:type="spellStart"/>
+      <w:r>
+        <w:rPr>
+          <w:lang w:val="en-GB"/>
+        </w:rPr>
+        <w:t>tesztek</w:t>
+      </w:r>
+      <w:proofErr w:type="spellEnd"/>
+      <w:r>
+        <w:rPr>
+          <w:lang w:val="en-GB"/>
+        </w:rPr>
+        <w:t xml:space="preserve"> a BASE_URL </w:t>
+      </w:r>
+      <w:proofErr w:type="spellStart"/>
+      <w:r>
+        <w:rPr>
+          <w:lang w:val="en-GB"/>
+        </w:rPr>
+        <w:t>környezeti</w:t>
+      </w:r>
+      <w:proofErr w:type="spellEnd"/>
+      <w:r>
+        <w:rPr>
+          <w:lang w:val="en-GB"/>
+        </w:rPr>
+        <w:t xml:space="preserve"> </w:t>
+      </w:r>
+      <w:proofErr w:type="spellStart"/>
+      <w:r>
+        <w:rPr>
+          <w:lang w:val="en-GB"/>
+        </w:rPr>
+        <w:t>változóban</w:t>
+      </w:r>
+      <w:proofErr w:type="spellEnd"/>
+      <w:r>
+        <w:rPr>
+          <w:lang w:val="en-GB"/>
+        </w:rPr>
+        <w:t xml:space="preserve"> </w:t>
+      </w:r>
+      <w:proofErr w:type="spellStart"/>
+      <w:r>
+        <w:rPr>
+          <w:lang w:val="en-GB"/>
+        </w:rPr>
+        <w:t>megadott</w:t>
+      </w:r>
+      <w:proofErr w:type="spellEnd"/>
+      <w:r>
+        <w:rPr>
+          <w:lang w:val="en-GB"/>
+        </w:rPr>
+        <w:t xml:space="preserve"> </w:t>
+      </w:r>
+      <w:proofErr w:type="spellStart"/>
+      <w:r>
+        <w:rPr>
+          <w:lang w:val="en-GB"/>
+        </w:rPr>
+        <w:t>szerverre</w:t>
+      </w:r>
+      <w:proofErr w:type="spellEnd"/>
+      <w:r>
+        <w:rPr>
+          <w:lang w:val="en-GB"/>
+        </w:rPr>
+        <w:t xml:space="preserve"> </w:t>
+      </w:r>
+      <w:proofErr w:type="spellStart"/>
+      <w:r>
+        <w:rPr>
+          <w:lang w:val="en-GB"/>
+        </w:rPr>
+        <w:t>futnak</w:t>
+      </w:r>
+      <w:proofErr w:type="spellEnd"/>
+      <w:r>
+        <w:rPr>
+          <w:lang w:val="en-GB"/>
+        </w:rPr>
+        <w:t xml:space="preserve"> (</w:t>
+      </w:r>
+      <w:proofErr w:type="spellStart"/>
+      <w:r>
+        <w:rPr>
+          <w:lang w:val="en-GB"/>
+        </w:rPr>
+        <w:t>alapértelmezett</w:t>
+      </w:r>
+      <w:proofErr w:type="spellEnd"/>
+      <w:r>
+        <w:rPr>
+          <w:lang w:val="en-GB"/>
+        </w:rPr>
+        <w:t xml:space="preserve">: </w:t>
+      </w:r>
+      <w:hyperlink r:id="rId8" w:history="1">
+        <w:r>
+          <w:rPr>
+            <w:rStyle w:val="Hiperhivatkozs"/>
+            <w:lang w:val="en-GB"/>
+          </w:rPr>
+          <w:t>http://localhost:3000</w:t>
+        </w:r>
+      </w:hyperlink>
+      <w:r>
+        <w:rPr>
+          <w:lang w:val="en-GB"/>
+        </w:rPr>
+        <w:t>).</w:t>
+      </w:r>
+    </w:p>
+    <w:p>
+      <w:pPr>
+        <w:rPr>
+          <w:lang w:val="en-GB"/>
+        </w:rPr>
+      </w:pPr>
+    </w:p>
+    <w:p>
+      <w:pPr>
+        <w:rPr>
+          <w:lang w:val="en-GB"/>
+        </w:rPr>
+      </w:pPr>
+    </w:p>
+    <w:p>
+      <w:pPr>
+        <w:pStyle w:val="Cmsor2"/>
         <w:rPr>
           <w:b/>
           <w:bCs/>
@@ -24091,211 +23823,82 @@
           <w:bCs/>
           <w:lang w:val="en-GB"/>
         </w:rPr>
-        <w:t xml:space="preserve">1.3 </w:t>
-      </w:r>
-      <w:proofErr w:type="spellStart"/>
+        <w:t>2</w:t>
+      </w:r>
       <w:r>
         <w:rPr>
           <w:b/>
           <w:bCs/>
           <w:lang w:val="en-GB"/>
         </w:rPr>
-        <w:t>Teszt</w:t>
-      </w:r>
-      <w:proofErr w:type="spellEnd"/>
+        <w:t xml:space="preserve">. API </w:t>
+      </w:r>
+      <w:proofErr w:type="spellStart"/>
       <w:r>
         <w:rPr>
           <w:b/>
           <w:bCs/>
           <w:lang w:val="en-GB"/>
         </w:rPr>
-        <w:t xml:space="preserve"> </w:t>
-      </w:r>
-      <w:proofErr w:type="spellStart"/>
+        <w:t>Tesztek</w:t>
+      </w:r>
+      <w:proofErr w:type="spellEnd"/>
       <w:r>
         <w:rPr>
           <w:b/>
           <w:bCs/>
           <w:lang w:val="en-GB"/>
         </w:rPr>
-        <w:t>futtatás</w:t>
-      </w:r>
-      <w:proofErr w:type="spellEnd"/>
-    </w:p>
-    <w:p>
-      <w:pPr>
-        <w:rPr>
-          <w:lang w:val="en-GB"/>
-        </w:rPr>
-      </w:pPr>
-      <w:r>
-        <w:rPr>
-          <w:lang w:val="en-GB"/>
-        </w:rPr>
-        <w:t>cd projekt_backend2/tests</w:t>
-      </w:r>
-    </w:p>
-    <w:p>
-      <w:pPr>
-        <w:rPr>
-          <w:lang w:val="en-GB"/>
-        </w:rPr>
-      </w:pPr>
-      <w:proofErr w:type="spellStart"/>
-      <w:r>
-        <w:rPr>
-          <w:lang w:val="en-GB"/>
-        </w:rPr>
-        <w:t>npm</w:t>
-      </w:r>
-      <w:proofErr w:type="spellEnd"/>
-      <w:r>
-        <w:rPr>
-          <w:lang w:val="en-GB"/>
-        </w:rPr>
-        <w:t xml:space="preserve"> test</w:t>
-      </w:r>
-    </w:p>
-    <w:p>
-      <w:pPr>
-        <w:rPr>
-          <w:lang w:val="en-GB"/>
-        </w:rPr>
-      </w:pPr>
-      <w:r>
-        <w:rPr>
-          <w:lang w:val="en-GB"/>
-        </w:rPr>
-        <w:t xml:space="preserve">A </w:t>
-      </w:r>
-      <w:proofErr w:type="spellStart"/>
-      <w:r>
-        <w:rPr>
-          <w:lang w:val="en-GB"/>
-        </w:rPr>
-        <w:t>tesztek</w:t>
-      </w:r>
-      <w:proofErr w:type="spellEnd"/>
-      <w:r>
-        <w:rPr>
-          <w:lang w:val="en-GB"/>
-        </w:rPr>
-        <w:t xml:space="preserve"> a BASE_URL </w:t>
-      </w:r>
-      <w:proofErr w:type="spellStart"/>
-      <w:r>
-        <w:rPr>
-          <w:lang w:val="en-GB"/>
-        </w:rPr>
-        <w:t>környezeti</w:t>
-      </w:r>
-      <w:proofErr w:type="spellEnd"/>
-      <w:r>
-        <w:rPr>
-          <w:lang w:val="en-GB"/>
-        </w:rPr>
         <w:t xml:space="preserve"> </w:t>
       </w:r>
       <w:proofErr w:type="spellStart"/>
       <w:r>
-        <w:rPr>
-          <w:lang w:val="en-GB"/>
-        </w:rPr>
-        <w:t>változóban</w:t>
-      </w:r>
-      <w:proofErr w:type="spellEnd"/>
-      <w:r>
-        <w:rPr>
-          <w:lang w:val="en-GB"/>
-        </w:rPr>
-        <w:t xml:space="preserve"> </w:t>
-      </w:r>
-      <w:proofErr w:type="spellStart"/>
-      <w:r>
-        <w:rPr>
-          <w:lang w:val="en-GB"/>
-        </w:rPr>
-        <w:t>megadott</w:t>
-      </w:r>
-      <w:proofErr w:type="spellEnd"/>
-      <w:r>
-        <w:rPr>
-          <w:lang w:val="en-GB"/>
-        </w:rPr>
-        <w:t xml:space="preserve"> </w:t>
-      </w:r>
-      <w:proofErr w:type="spellStart"/>
-      <w:r>
-        <w:rPr>
-          <w:lang w:val="en-GB"/>
-        </w:rPr>
-        <w:t>szerverre</w:t>
-      </w:r>
-      <w:proofErr w:type="spellEnd"/>
-      <w:r>
-        <w:rPr>
-          <w:lang w:val="en-GB"/>
-        </w:rPr>
-        <w:t xml:space="preserve"> </w:t>
-      </w:r>
-      <w:proofErr w:type="spellStart"/>
-      <w:r>
-        <w:rPr>
-          <w:lang w:val="en-GB"/>
-        </w:rPr>
-        <w:t>futnak</w:t>
-      </w:r>
-      <w:proofErr w:type="spellEnd"/>
-      <w:r>
-        <w:rPr>
-          <w:lang w:val="en-GB"/>
-        </w:rPr>
-        <w:t xml:space="preserve"> (</w:t>
-      </w:r>
-      <w:proofErr w:type="spellStart"/>
-      <w:r>
-        <w:rPr>
-          <w:lang w:val="en-GB"/>
-        </w:rPr>
-        <w:t>alapértelmezett</w:t>
-      </w:r>
-      <w:proofErr w:type="spellEnd"/>
-      <w:r>
-        <w:rPr>
-          <w:lang w:val="en-GB"/>
-        </w:rPr>
-        <w:t>: http://localhost:3000).</w:t>
-      </w:r>
-    </w:p>
-    <w:p>
-      <w:pPr>
         <w:rPr>
           <w:b/>
           <w:bCs/>
           <w:lang w:val="en-GB"/>
         </w:rPr>
-      </w:pPr>
+        <w:t>áttekintése</w:t>
+      </w:r>
+      <w:proofErr w:type="spellEnd"/>
       <w:r>
         <w:rPr>
           <w:b/>
           <w:bCs/>
           <w:lang w:val="en-GB"/>
         </w:rPr>
+        <w:t>:</w:t>
+      </w:r>
+    </w:p>
+    <w:p>
+      <w:pPr>
+        <w:rPr>
+          <w:lang w:val="en-GB"/>
+        </w:rPr>
+      </w:pPr>
+    </w:p>
+    <w:p>
+      <w:pPr>
+        <w:pStyle w:val="Cmsor3"/>
+        <w:rPr>
+          <w:lang w:val="en-GB"/>
+        </w:rPr>
+      </w:pPr>
+      <w:r>
+        <w:rPr>
+          <w:lang w:val="en-GB"/>
+        </w:rPr>
         <w:t>2</w:t>
       </w:r>
       <w:r>
         <w:rPr>
-          <w:b/>
-          <w:bCs/>
-          <w:lang w:val="en-GB"/>
-        </w:rPr>
-        <w:t xml:space="preserve">. API </w:t>
-      </w:r>
-      <w:proofErr w:type="spellStart"/>
-      <w:r>
-        <w:rPr>
-          <w:b/>
-          <w:bCs/>
+          <w:lang w:val="en-GB"/>
+        </w:rPr>
+        <w:t xml:space="preserve">.1 </w:t>
+      </w:r>
+      <w:proofErr w:type="spellStart"/>
+      <w:r>
+        <w:rPr>
           <w:lang w:val="en-GB"/>
         </w:rPr>
         <w:t>Tesztek</w:t>
@@ -24303,8 +23906,6 @@
       <w:proofErr w:type="spellEnd"/>
       <w:r>
         <w:rPr>
-          <w:b/>
-          <w:bCs/>
           <w:lang w:val="en-GB"/>
         </w:rPr>
         <w:t xml:space="preserve"> </w:t>
@@ -24312,66 +23913,17 @@
       <w:proofErr w:type="spellStart"/>
       <w:r>
         <w:rPr>
-          <w:b/>
-          <w:bCs/>
-          <w:lang w:val="en-GB"/>
-        </w:rPr>
-        <w:t>áttekintése</w:t>
-      </w:r>
-      <w:proofErr w:type="spellEnd"/>
-    </w:p>
-    <w:p>
-      <w:pPr>
-        <w:rPr>
-          <w:b/>
-          <w:bCs/>
-          <w:lang w:val="en-GB"/>
-        </w:rPr>
-      </w:pPr>
-      <w:r>
-        <w:rPr>
-          <w:b/>
-          <w:bCs/>
-          <w:lang w:val="en-GB"/>
-        </w:rPr>
-        <w:t>2</w:t>
-      </w:r>
-      <w:r>
-        <w:rPr>
-          <w:b/>
-          <w:bCs/>
-          <w:lang w:val="en-GB"/>
-        </w:rPr>
-        <w:t xml:space="preserve">.1 </w:t>
-      </w:r>
-      <w:proofErr w:type="spellStart"/>
-      <w:r>
-        <w:rPr>
-          <w:b/>
-          <w:bCs/>
-          <w:lang w:val="en-GB"/>
-        </w:rPr>
-        <w:t>Tesztek</w:t>
-      </w:r>
-      <w:proofErr w:type="spellEnd"/>
-      <w:r>
-        <w:rPr>
-          <w:b/>
-          <w:bCs/>
-          <w:lang w:val="en-GB"/>
-        </w:rPr>
-        <w:t xml:space="preserve"> </w:t>
-      </w:r>
-      <w:proofErr w:type="spellStart"/>
-      <w:r>
-        <w:rPr>
-          <w:b/>
-          <w:bCs/>
           <w:lang w:val="en-GB"/>
         </w:rPr>
         <w:t>összesítése</w:t>
       </w:r>
       <w:proofErr w:type="spellEnd"/>
+      <w:r>
+        <w:rPr>
+          <w:lang w:val="en-GB"/>
+        </w:rPr>
+        <w:t>:</w:t>
+      </w:r>
     </w:p>
     <w:p>
       <w:pPr>
@@ -24450,6 +24002,7 @@
           <w:bCs/>
           <w:lang w:val="en-GB"/>
         </w:rPr>
+        <w:lastRenderedPageBreak/>
         <w:t>products.test.js</w:t>
       </w:r>
       <w:r>
@@ -24756,94 +24309,108 @@
     <w:p>
       <w:pPr>
         <w:rPr>
-          <w:lang w:val="en-GB"/>
-        </w:rPr>
-      </w:pPr>
-      <w:proofErr w:type="spellStart"/>
-      <w:r>
-        <w:rPr>
           <w:b/>
           <w:bCs/>
           <w:lang w:val="en-GB"/>
         </w:rPr>
-        <w:t>Összesen</w:t>
-      </w:r>
-      <w:proofErr w:type="spellEnd"/>
+      </w:pPr>
+      <w:proofErr w:type="spellStart"/>
       <w:r>
         <w:rPr>
           <w:b/>
           <w:bCs/>
           <w:lang w:val="en-GB"/>
         </w:rPr>
-        <w:t xml:space="preserve">: 83 </w:t>
-      </w:r>
-      <w:proofErr w:type="spellStart"/>
+        <w:t>Összesen</w:t>
+      </w:r>
+      <w:proofErr w:type="spellEnd"/>
       <w:r>
         <w:rPr>
           <w:b/>
           <w:bCs/>
           <w:lang w:val="en-GB"/>
         </w:rPr>
-        <w:t>teszt</w:t>
-      </w:r>
-      <w:proofErr w:type="spellEnd"/>
-    </w:p>
-    <w:p>
-      <w:pPr>
+        <w:t xml:space="preserve">: 83 </w:t>
+      </w:r>
+      <w:proofErr w:type="spellStart"/>
+      <w:r>
         <w:rPr>
           <w:b/>
           <w:bCs/>
           <w:lang w:val="en-GB"/>
         </w:rPr>
-      </w:pPr>
-      <w:r>
+        <w:t>teszt</w:t>
+      </w:r>
+      <w:proofErr w:type="spellEnd"/>
+    </w:p>
+    <w:p>
+      <w:pPr>
+        <w:rPr>
+          <w:lang w:val="en-GB"/>
+        </w:rPr>
+      </w:pPr>
+    </w:p>
+    <w:p>
+      <w:pPr>
+        <w:pStyle w:val="Cmsor3"/>
+        <w:rPr>
+          <w:lang w:val="en-GB"/>
+        </w:rPr>
+      </w:pPr>
+      <w:r>
+        <w:rPr>
+          <w:lang w:val="en-GB"/>
+        </w:rPr>
+        <w:t>2</w:t>
+      </w:r>
+      <w:r>
+        <w:rPr>
+          <w:lang w:val="en-GB"/>
+        </w:rPr>
+        <w:t xml:space="preserve">.2 </w:t>
+      </w:r>
+      <w:proofErr w:type="spellStart"/>
+      <w:r>
+        <w:rPr>
+          <w:lang w:val="en-GB"/>
+        </w:rPr>
+        <w:t>Végpontok</w:t>
+      </w:r>
+      <w:proofErr w:type="spellEnd"/>
+      <w:r>
+        <w:rPr>
+          <w:lang w:val="en-GB"/>
+        </w:rPr>
+        <w:t xml:space="preserve"> </w:t>
+      </w:r>
+      <w:proofErr w:type="spellStart"/>
+      <w:r>
+        <w:rPr>
+          <w:lang w:val="en-GB"/>
+        </w:rPr>
+        <w:t>lefedettsége</w:t>
+      </w:r>
+      <w:proofErr w:type="spellEnd"/>
+      <w:r>
+        <w:rPr>
+          <w:lang w:val="en-GB"/>
+        </w:rPr>
+        <w:t>:</w:t>
+      </w:r>
+    </w:p>
+    <w:p>
+      <w:pPr>
+        <w:rPr>
+          <w:lang w:val="en-GB"/>
+        </w:rPr>
+      </w:pPr>
+    </w:p>
+    <w:p>
+      <w:pPr>
+        <w:pStyle w:val="Cmsor4"/>
         <w:rPr>
           <w:b/>
           <w:bCs/>
-          <w:lang w:val="en-GB"/>
-        </w:rPr>
-        <w:t>2</w:t>
-      </w:r>
-      <w:r>
-        <w:rPr>
-          <w:b/>
-          <w:bCs/>
-          <w:lang w:val="en-GB"/>
-        </w:rPr>
-        <w:t xml:space="preserve">.2 </w:t>
-      </w:r>
-      <w:proofErr w:type="spellStart"/>
-      <w:r>
-        <w:rPr>
-          <w:b/>
-          <w:bCs/>
-          <w:lang w:val="en-GB"/>
-        </w:rPr>
-        <w:t>Végpontok</w:t>
-      </w:r>
-      <w:proofErr w:type="spellEnd"/>
-      <w:r>
-        <w:rPr>
-          <w:b/>
-          <w:bCs/>
-          <w:lang w:val="en-GB"/>
-        </w:rPr>
-        <w:t xml:space="preserve"> </w:t>
-      </w:r>
-      <w:proofErr w:type="spellStart"/>
-      <w:r>
-        <w:rPr>
-          <w:b/>
-          <w:bCs/>
-          <w:lang w:val="en-GB"/>
-        </w:rPr>
-        <w:t>lefedettsége</w:t>
-      </w:r>
-      <w:proofErr w:type="spellEnd"/>
-    </w:p>
-    <w:p>
-      <w:pPr>
-        <w:rPr>
           <w:lang w:val="en-GB"/>
         </w:rPr>
       </w:pPr>
@@ -25120,7 +24687,10 @@
     </w:p>
     <w:p>
       <w:pPr>
-        <w:rPr>
+        <w:pStyle w:val="Cmsor4"/>
+        <w:rPr>
+          <w:b/>
+          <w:bCs/>
           <w:lang w:val="en-GB"/>
         </w:rPr>
       </w:pPr>
@@ -25264,7 +24834,6 @@
         <w:rPr>
           <w:lang w:val="en-GB"/>
         </w:rPr>
-        <w:lastRenderedPageBreak/>
         <w:t>POST /</w:t>
       </w:r>
       <w:proofErr w:type="spellStart"/>
@@ -25359,7 +24928,10 @@
     </w:p>
     <w:p>
       <w:pPr>
-        <w:rPr>
+        <w:pStyle w:val="Cmsor4"/>
+        <w:rPr>
+          <w:b/>
+          <w:bCs/>
           <w:lang w:val="en-GB"/>
         </w:rPr>
       </w:pPr>
@@ -25853,6 +25425,7 @@
         <w:rPr>
           <w:lang w:val="en-GB"/>
         </w:rPr>
+        <w:lastRenderedPageBreak/>
         <w:t>GET /</w:t>
       </w:r>
       <w:proofErr w:type="spellStart"/>
@@ -26134,6 +25707,7 @@
     </w:p>
     <w:p>
       <w:pPr>
+        <w:pStyle w:val="Cmsor2"/>
         <w:rPr>
           <w:b/>
           <w:bCs/>
@@ -26166,27 +25740,37 @@
         <w:t>Összefoglalás</w:t>
       </w:r>
       <w:proofErr w:type="spellEnd"/>
-    </w:p>
-    <w:p>
-      <w:pPr>
+      <w:r>
         <w:rPr>
           <w:b/>
           <w:bCs/>
           <w:lang w:val="en-GB"/>
         </w:rPr>
-      </w:pPr>
-      <w:r>
-        <w:rPr>
-          <w:b/>
-          <w:bCs/>
+        <w:t>:</w:t>
+      </w:r>
+    </w:p>
+    <w:p>
+      <w:pPr>
+        <w:rPr>
+          <w:lang w:val="en-GB"/>
+        </w:rPr>
+      </w:pPr>
+    </w:p>
+    <w:p>
+      <w:pPr>
+        <w:pStyle w:val="Cmsor3"/>
+        <w:rPr>
+          <w:lang w:val="en-GB"/>
+        </w:rPr>
+      </w:pPr>
+      <w:r>
+        <w:rPr>
           <w:lang w:val="en-GB"/>
         </w:rPr>
         <w:t>3</w:t>
       </w:r>
       <w:r>
         <w:rPr>
-          <w:b/>
-          <w:bCs/>
           <w:lang w:val="en-GB"/>
         </w:rPr>
         <w:t xml:space="preserve">.1 </w:t>
@@ -26194,8 +25778,6 @@
       <w:proofErr w:type="spellStart"/>
       <w:r>
         <w:rPr>
-          <w:b/>
-          <w:bCs/>
           <w:lang w:val="en-GB"/>
         </w:rPr>
         <w:t>Teszt</w:t>
@@ -26203,8 +25785,6 @@
       <w:proofErr w:type="spellEnd"/>
       <w:r>
         <w:rPr>
-          <w:b/>
-          <w:bCs/>
           <w:lang w:val="en-GB"/>
         </w:rPr>
         <w:t xml:space="preserve"> </w:t>
@@ -26212,13 +25792,17 @@
       <w:proofErr w:type="spellStart"/>
       <w:r>
         <w:rPr>
-          <w:b/>
-          <w:bCs/>
           <w:lang w:val="en-GB"/>
         </w:rPr>
         <w:t>statisztikák</w:t>
       </w:r>
       <w:proofErr w:type="spellEnd"/>
+      <w:r>
+        <w:rPr>
+          <w:lang w:val="en-GB"/>
+        </w:rPr>
+        <w:t>:</w:t>
+      </w:r>
     </w:p>
     <w:p>
       <w:pPr>
@@ -26371,24 +25955,27 @@
     </w:p>
     <w:p>
       <w:pPr>
-        <w:rPr>
-          <w:b/>
-          <w:bCs/>
-          <w:lang w:val="en-GB"/>
-        </w:rPr>
-      </w:pPr>
-      <w:r>
-        <w:rPr>
-          <w:b/>
-          <w:bCs/>
+        <w:ind w:left="709"/>
+        <w:rPr>
+          <w:lang w:val="en-GB"/>
+        </w:rPr>
+      </w:pPr>
+    </w:p>
+    <w:p>
+      <w:pPr>
+        <w:pStyle w:val="Cmsor3"/>
+        <w:rPr>
+          <w:lang w:val="en-GB"/>
+        </w:rPr>
+      </w:pPr>
+      <w:r>
+        <w:rPr>
           <w:lang w:val="en-GB"/>
         </w:rPr>
         <w:t>3</w:t>
       </w:r>
       <w:r>
         <w:rPr>
-          <w:b/>
-          <w:bCs/>
           <w:lang w:val="en-GB"/>
         </w:rPr>
         <w:t xml:space="preserve">.2 HTTP </w:t>
@@ -26396,8 +25983,6 @@
       <w:proofErr w:type="spellStart"/>
       <w:r>
         <w:rPr>
-          <w:b/>
-          <w:bCs/>
           <w:lang w:val="en-GB"/>
         </w:rPr>
         <w:t>státuszkódok</w:t>
@@ -26405,8 +25990,6 @@
       <w:proofErr w:type="spellEnd"/>
       <w:r>
         <w:rPr>
-          <w:b/>
-          <w:bCs/>
           <w:lang w:val="en-GB"/>
         </w:rPr>
         <w:t xml:space="preserve"> </w:t>
@@ -26414,13 +25997,17 @@
       <w:proofErr w:type="spellStart"/>
       <w:r>
         <w:rPr>
-          <w:b/>
-          <w:bCs/>
           <w:lang w:val="en-GB"/>
         </w:rPr>
         <w:t>összesítése</w:t>
       </w:r>
       <w:proofErr w:type="spellEnd"/>
+      <w:r>
+        <w:rPr>
+          <w:lang w:val="en-GB"/>
+        </w:rPr>
+        <w:t>:</w:t>
+      </w:r>
     </w:p>
     <w:p>
       <w:pPr>
@@ -26861,6 +26448,15 @@
     </w:p>
     <w:p>
       <w:pPr>
+        <w:ind w:left="709"/>
+        <w:rPr>
+          <w:lang w:val="en-GB"/>
+        </w:rPr>
+      </w:pPr>
+    </w:p>
+    <w:p>
+      <w:pPr>
+        <w:pStyle w:val="Cmsor3"/>
         <w:rPr>
           <w:b/>
           <w:bCs/>
@@ -26873,7 +26469,6 @@
           <w:bCs/>
           <w:lang w:val="en-GB"/>
         </w:rPr>
-        <w:lastRenderedPageBreak/>
         <w:t>3</w:t>
       </w:r>
       <w:r>
@@ -26884,20 +26479,212 @@
         </w:rPr>
         <w:t xml:space="preserve">.3 </w:t>
       </w:r>
-      <w:proofErr w:type="spellStart"/>
-      <w:r>
-        <w:rPr>
+      <w:r>
+        <w:rPr>
+          <w:rStyle w:val="Cmsor2Char"/>
+        </w:rPr>
+        <w:t xml:space="preserve">Tesztek eloszlása </w:t>
+      </w:r>
+      <w:proofErr w:type="spellStart"/>
+      <w:r>
+        <w:rPr>
+          <w:rStyle w:val="Cmsor2Char"/>
+        </w:rPr>
+        <w:t>funkciónként</w:t>
+      </w:r>
+      <w:proofErr w:type="spellEnd"/>
+      <w:r>
+        <w:rPr>
+          <w:rStyle w:val="Cmsor2Char"/>
+        </w:rPr>
+        <w:t>:</w:t>
+      </w:r>
+    </w:p>
+    <w:p>
+      <w:pPr>
+        <w:pStyle w:val="Cmsor4"/>
+        <w:rPr>
+          <w:lang w:val="en-GB"/>
+        </w:rPr>
+      </w:pPr>
+      <w:r>
+        <w:rPr>
+          <w:rStyle w:val="Cmsor3Char"/>
           <w:b/>
           <w:bCs/>
-          <w:lang w:val="en-GB"/>
-        </w:rPr>
-        <w:t>Tesztek</w:t>
-      </w:r>
-      <w:proofErr w:type="spellEnd"/>
-      <w:r>
-        <w:rPr>
+        </w:rPr>
+        <w:t>Hitelesítés:</w:t>
+      </w:r>
+      <w:r>
+        <w:rPr>
+          <w:lang w:val="en-GB"/>
+        </w:rPr>
+        <w:t xml:space="preserve"> </w:t>
+      </w:r>
+    </w:p>
+    <w:p>
+      <w:pPr>
+        <w:ind w:left="709"/>
+        <w:rPr>
+          <w:lang w:val="en-GB"/>
+        </w:rPr>
+      </w:pPr>
+      <w:r>
+        <w:rPr>
+          <w:lang w:val="en-GB"/>
+        </w:rPr>
+        <w:t xml:space="preserve">12 </w:t>
+      </w:r>
+      <w:proofErr w:type="spellStart"/>
+      <w:r>
+        <w:rPr>
+          <w:lang w:val="en-GB"/>
+        </w:rPr>
+        <w:t>teszt</w:t>
+      </w:r>
+      <w:proofErr w:type="spellEnd"/>
+      <w:r>
+        <w:rPr>
+          <w:lang w:val="en-GB"/>
+        </w:rPr>
+        <w:t xml:space="preserve"> - </w:t>
+      </w:r>
+      <w:proofErr w:type="spellStart"/>
+      <w:r>
+        <w:rPr>
+          <w:lang w:val="en-GB"/>
+        </w:rPr>
+        <w:t>Bejelentkezés</w:t>
+      </w:r>
+      <w:proofErr w:type="spellEnd"/>
+      <w:r>
+        <w:rPr>
+          <w:lang w:val="en-GB"/>
+        </w:rPr>
+        <w:t xml:space="preserve">, </w:t>
+      </w:r>
+      <w:proofErr w:type="spellStart"/>
+      <w:r>
+        <w:rPr>
+          <w:lang w:val="en-GB"/>
+        </w:rPr>
+        <w:t>regisztráció</w:t>
+      </w:r>
+      <w:proofErr w:type="spellEnd"/>
+      <w:r>
+        <w:rPr>
+          <w:lang w:val="en-GB"/>
+        </w:rPr>
+        <w:t xml:space="preserve">, </w:t>
+      </w:r>
+      <w:proofErr w:type="spellStart"/>
+      <w:r>
+        <w:rPr>
+          <w:lang w:val="en-GB"/>
+        </w:rPr>
+        <w:t>kijelentkezés</w:t>
+      </w:r>
+      <w:proofErr w:type="spellEnd"/>
+      <w:r>
+        <w:rPr>
+          <w:lang w:val="en-GB"/>
+        </w:rPr>
+        <w:t xml:space="preserve">, </w:t>
+      </w:r>
+      <w:proofErr w:type="spellStart"/>
+      <w:r>
+        <w:rPr>
+          <w:lang w:val="en-GB"/>
+        </w:rPr>
+        <w:t>felhasználói</w:t>
+      </w:r>
+      <w:proofErr w:type="spellEnd"/>
+      <w:r>
+        <w:rPr>
+          <w:lang w:val="en-GB"/>
+        </w:rPr>
+        <w:t xml:space="preserve"> </w:t>
+      </w:r>
+      <w:proofErr w:type="spellStart"/>
+      <w:r>
+        <w:rPr>
+          <w:lang w:val="en-GB"/>
+        </w:rPr>
+        <w:t>adatok</w:t>
+      </w:r>
+      <w:proofErr w:type="spellEnd"/>
+    </w:p>
+    <w:p>
+      <w:pPr>
+        <w:pStyle w:val="Cmsor4"/>
+        <w:rPr>
+          <w:rStyle w:val="Cmsor3Char"/>
+          <w:rFonts w:eastAsiaTheme="minorHAnsi" w:cstheme="minorBidi"/>
+          <w:sz w:val="24"/>
+          <w:szCs w:val="22"/>
+          <w:lang w:val="en-GB"/>
+        </w:rPr>
+      </w:pPr>
+      <w:r>
+        <w:rPr>
+          <w:rStyle w:val="Cmsor3Char"/>
           <w:b/>
           <w:bCs/>
+        </w:rPr>
+        <w:t>Termékek:</w:t>
+      </w:r>
+    </w:p>
+    <w:p>
+      <w:pPr>
+        <w:ind w:left="709"/>
+        <w:rPr>
+          <w:lang w:val="en-GB"/>
+        </w:rPr>
+      </w:pPr>
+      <w:r>
+        <w:rPr>
+          <w:lang w:val="en-GB"/>
+        </w:rPr>
+        <w:t xml:space="preserve">20 </w:t>
+      </w:r>
+      <w:proofErr w:type="spellStart"/>
+      <w:r>
+        <w:rPr>
+          <w:lang w:val="en-GB"/>
+        </w:rPr>
+        <w:t>teszt</w:t>
+      </w:r>
+      <w:proofErr w:type="spellEnd"/>
+      <w:r>
+        <w:rPr>
+          <w:lang w:val="en-GB"/>
+        </w:rPr>
+        <w:t xml:space="preserve"> - CRUD </w:t>
+      </w:r>
+      <w:proofErr w:type="spellStart"/>
+      <w:r>
+        <w:rPr>
+          <w:lang w:val="en-GB"/>
+        </w:rPr>
+        <w:t>műveletek</w:t>
+      </w:r>
+      <w:proofErr w:type="spellEnd"/>
+      <w:r>
+        <w:rPr>
+          <w:lang w:val="en-GB"/>
+        </w:rPr>
+        <w:t xml:space="preserve">, </w:t>
+      </w:r>
+      <w:proofErr w:type="spellStart"/>
+      <w:r>
+        <w:rPr>
+          <w:lang w:val="en-GB"/>
+        </w:rPr>
+        <w:t>lista</w:t>
+      </w:r>
+      <w:proofErr w:type="spellEnd"/>
+      <w:r>
+        <w:rPr>
           <w:lang w:val="en-GB"/>
         </w:rPr>
         <w:t xml:space="preserve"> </w:t>
@@ -26905,128 +26692,439 @@
       <w:proofErr w:type="spellStart"/>
       <w:r>
         <w:rPr>
+          <w:lang w:val="en-GB"/>
+        </w:rPr>
+        <w:t>lekérése</w:t>
+      </w:r>
+      <w:proofErr w:type="spellEnd"/>
+      <w:r>
+        <w:rPr>
+          <w:lang w:val="en-GB"/>
+        </w:rPr>
+        <w:t xml:space="preserve">, </w:t>
+      </w:r>
+      <w:proofErr w:type="spellStart"/>
+      <w:r>
+        <w:rPr>
+          <w:lang w:val="en-GB"/>
+        </w:rPr>
+        <w:t>szűrés</w:t>
+      </w:r>
+      <w:proofErr w:type="spellEnd"/>
+    </w:p>
+    <w:p>
+      <w:pPr>
+        <w:ind w:left="709"/>
+        <w:rPr>
+          <w:lang w:val="en-GB"/>
+        </w:rPr>
+      </w:pPr>
+    </w:p>
+    <w:p>
+      <w:pPr>
+        <w:pStyle w:val="Cmsor4"/>
+        <w:rPr>
+          <w:lang w:val="en-GB"/>
+        </w:rPr>
+      </w:pPr>
+      <w:r>
+        <w:rPr>
+          <w:rStyle w:val="Cmsor3Char"/>
           <w:b/>
           <w:bCs/>
-          <w:lang w:val="en-GB"/>
-        </w:rPr>
-        <w:t>eloszlása</w:t>
-      </w:r>
-      <w:proofErr w:type="spellEnd"/>
-      <w:r>
-        <w:rPr>
+        </w:rPr>
+        <w:lastRenderedPageBreak/>
+        <w:t>Megrendelések:</w:t>
+      </w:r>
+      <w:r>
+        <w:rPr>
+          <w:lang w:val="en-GB"/>
+        </w:rPr>
+        <w:t xml:space="preserve"> </w:t>
+      </w:r>
+    </w:p>
+    <w:p>
+      <w:pPr>
+        <w:ind w:left="709"/>
+        <w:rPr>
+          <w:lang w:val="en-GB"/>
+        </w:rPr>
+      </w:pPr>
+      <w:r>
+        <w:rPr>
+          <w:lang w:val="en-GB"/>
+        </w:rPr>
+        <w:t xml:space="preserve">14 </w:t>
+      </w:r>
+      <w:proofErr w:type="spellStart"/>
+      <w:r>
+        <w:rPr>
+          <w:lang w:val="en-GB"/>
+        </w:rPr>
+        <w:t>teszt</w:t>
+      </w:r>
+      <w:proofErr w:type="spellEnd"/>
+      <w:r>
+        <w:rPr>
+          <w:lang w:val="en-GB"/>
+        </w:rPr>
+        <w:t xml:space="preserve"> - </w:t>
+      </w:r>
+      <w:proofErr w:type="spellStart"/>
+      <w:r>
+        <w:rPr>
+          <w:lang w:val="en-GB"/>
+        </w:rPr>
+        <w:t>Rendelés</w:t>
+      </w:r>
+      <w:proofErr w:type="spellEnd"/>
+      <w:r>
+        <w:rPr>
+          <w:lang w:val="en-GB"/>
+        </w:rPr>
+        <w:t xml:space="preserve"> </w:t>
+      </w:r>
+      <w:proofErr w:type="spellStart"/>
+      <w:r>
+        <w:rPr>
+          <w:lang w:val="en-GB"/>
+        </w:rPr>
+        <w:t>létrehozás</w:t>
+      </w:r>
+      <w:proofErr w:type="spellEnd"/>
+      <w:r>
+        <w:rPr>
+          <w:lang w:val="en-GB"/>
+        </w:rPr>
+        <w:t xml:space="preserve">, </w:t>
+      </w:r>
+      <w:proofErr w:type="spellStart"/>
+      <w:r>
+        <w:rPr>
+          <w:lang w:val="en-GB"/>
+        </w:rPr>
+        <w:t>lista</w:t>
+      </w:r>
+      <w:proofErr w:type="spellEnd"/>
+      <w:r>
+        <w:rPr>
+          <w:lang w:val="en-GB"/>
+        </w:rPr>
+        <w:t xml:space="preserve">, </w:t>
+      </w:r>
+      <w:proofErr w:type="spellStart"/>
+      <w:r>
+        <w:rPr>
+          <w:lang w:val="en-GB"/>
+        </w:rPr>
+        <w:t>státusz</w:t>
+      </w:r>
+      <w:proofErr w:type="spellEnd"/>
+      <w:r>
+        <w:rPr>
+          <w:lang w:val="en-GB"/>
+        </w:rPr>
+        <w:t xml:space="preserve"> </w:t>
+      </w:r>
+      <w:proofErr w:type="spellStart"/>
+      <w:r>
+        <w:rPr>
+          <w:lang w:val="en-GB"/>
+        </w:rPr>
+        <w:t>módosítás</w:t>
+      </w:r>
+      <w:proofErr w:type="spellEnd"/>
+      <w:r>
+        <w:rPr>
+          <w:lang w:val="en-GB"/>
+        </w:rPr>
+        <w:t xml:space="preserve">, </w:t>
+      </w:r>
+      <w:proofErr w:type="spellStart"/>
+      <w:r>
+        <w:rPr>
+          <w:lang w:val="en-GB"/>
+        </w:rPr>
+        <w:t>törlés</w:t>
+      </w:r>
+      <w:proofErr w:type="spellEnd"/>
+    </w:p>
+    <w:p>
+      <w:pPr>
+        <w:pStyle w:val="Cmsor4"/>
+        <w:rPr>
+          <w:lang w:val="en-GB"/>
+        </w:rPr>
+      </w:pPr>
+      <w:r>
+        <w:rPr>
+          <w:rStyle w:val="Cmsor3Char"/>
           <w:b/>
           <w:bCs/>
-          <w:lang w:val="en-GB"/>
-        </w:rPr>
-        <w:t xml:space="preserve"> </w:t>
-      </w:r>
-      <w:proofErr w:type="spellStart"/>
-      <w:r>
-        <w:rPr>
+        </w:rPr>
+        <w:t>Időpontok</w:t>
+      </w:r>
+      <w:r>
+        <w:rPr>
+          <w:lang w:val="en-GB"/>
+        </w:rPr>
+        <w:t xml:space="preserve">: </w:t>
+      </w:r>
+    </w:p>
+    <w:p>
+      <w:pPr>
+        <w:ind w:left="709"/>
+        <w:rPr>
+          <w:lang w:val="en-GB"/>
+        </w:rPr>
+      </w:pPr>
+      <w:r>
+        <w:rPr>
+          <w:lang w:val="en-GB"/>
+        </w:rPr>
+        <w:t xml:space="preserve">20 </w:t>
+      </w:r>
+      <w:proofErr w:type="spellStart"/>
+      <w:r>
+        <w:rPr>
+          <w:lang w:val="en-GB"/>
+        </w:rPr>
+        <w:t>teszt</w:t>
+      </w:r>
+      <w:proofErr w:type="spellEnd"/>
+      <w:r>
+        <w:rPr>
+          <w:lang w:val="en-GB"/>
+        </w:rPr>
+        <w:t xml:space="preserve"> - </w:t>
+      </w:r>
+      <w:proofErr w:type="spellStart"/>
+      <w:r>
+        <w:rPr>
+          <w:lang w:val="en-GB"/>
+        </w:rPr>
+        <w:t>Időpont</w:t>
+      </w:r>
+      <w:proofErr w:type="spellEnd"/>
+      <w:r>
+        <w:rPr>
+          <w:lang w:val="en-GB"/>
+        </w:rPr>
+        <w:t xml:space="preserve"> CRUD, </w:t>
+      </w:r>
+      <w:proofErr w:type="spellStart"/>
+      <w:r>
+        <w:rPr>
+          <w:lang w:val="en-GB"/>
+        </w:rPr>
+        <w:t>foglalás</w:t>
+      </w:r>
+      <w:proofErr w:type="spellEnd"/>
+      <w:r>
+        <w:rPr>
+          <w:lang w:val="en-GB"/>
+        </w:rPr>
+        <w:t xml:space="preserve">, </w:t>
+      </w:r>
+      <w:proofErr w:type="spellStart"/>
+      <w:r>
+        <w:rPr>
+          <w:lang w:val="en-GB"/>
+        </w:rPr>
+        <w:t>véglegesítés</w:t>
+      </w:r>
+      <w:proofErr w:type="spellEnd"/>
+    </w:p>
+    <w:p>
+      <w:pPr>
+        <w:pStyle w:val="Cmsor4"/>
+        <w:rPr>
+          <w:lang w:val="en-GB"/>
+        </w:rPr>
+      </w:pPr>
+      <w:r>
+        <w:rPr>
+          <w:rStyle w:val="Cmsor3Char"/>
           <w:b/>
           <w:bCs/>
-          <w:lang w:val="en-GB"/>
-        </w:rPr>
-        <w:t>funkciónként</w:t>
-      </w:r>
-      <w:proofErr w:type="spellEnd"/>
-    </w:p>
-    <w:p>
-      <w:pPr>
-        <w:numPr>
-          <w:ilvl w:val="0"/>
-          <w:numId w:val="27"/>
-        </w:numPr>
-        <w:rPr>
-          <w:lang w:val="en-GB"/>
-        </w:rPr>
-      </w:pPr>
-      <w:proofErr w:type="spellStart"/>
-      <w:r>
-        <w:rPr>
+        </w:rPr>
+        <w:t>Felhasználók:</w:t>
+      </w:r>
+      <w:r>
+        <w:rPr>
+          <w:lang w:val="en-GB"/>
+        </w:rPr>
+        <w:t xml:space="preserve"> </w:t>
+      </w:r>
+    </w:p>
+    <w:p>
+      <w:pPr>
+        <w:ind w:left="709"/>
+        <w:rPr>
+          <w:lang w:val="en-GB"/>
+        </w:rPr>
+      </w:pPr>
+      <w:r>
+        <w:rPr>
+          <w:lang w:val="en-GB"/>
+        </w:rPr>
+        <w:t xml:space="preserve">8 </w:t>
+      </w:r>
+      <w:proofErr w:type="spellStart"/>
+      <w:r>
+        <w:rPr>
+          <w:lang w:val="en-GB"/>
+        </w:rPr>
+        <w:t>teszt</w:t>
+      </w:r>
+      <w:proofErr w:type="spellEnd"/>
+      <w:r>
+        <w:rPr>
+          <w:lang w:val="en-GB"/>
+        </w:rPr>
+        <w:t xml:space="preserve"> - Admin </w:t>
+      </w:r>
+      <w:proofErr w:type="spellStart"/>
+      <w:r>
+        <w:rPr>
+          <w:lang w:val="en-GB"/>
+        </w:rPr>
+        <w:t>felhasználó</w:t>
+      </w:r>
+      <w:proofErr w:type="spellEnd"/>
+      <w:r>
+        <w:rPr>
+          <w:lang w:val="en-GB"/>
+        </w:rPr>
+        <w:t xml:space="preserve"> </w:t>
+      </w:r>
+      <w:proofErr w:type="spellStart"/>
+      <w:r>
+        <w:rPr>
+          <w:lang w:val="en-GB"/>
+        </w:rPr>
+        <w:t>kezelés</w:t>
+      </w:r>
+      <w:proofErr w:type="spellEnd"/>
+    </w:p>
+    <w:p>
+      <w:pPr>
+        <w:pStyle w:val="Cmsor4"/>
+        <w:rPr>
+          <w:rStyle w:val="Cmsor3Char"/>
+          <w:rFonts w:eastAsiaTheme="minorHAnsi" w:cstheme="minorBidi"/>
+          <w:sz w:val="24"/>
+          <w:szCs w:val="22"/>
+          <w:lang w:val="en-GB"/>
+        </w:rPr>
+      </w:pPr>
+      <w:r>
+        <w:rPr>
+          <w:rStyle w:val="Cmsor3Char"/>
           <w:b/>
           <w:bCs/>
-          <w:lang w:val="en-GB"/>
-        </w:rPr>
-        <w:t>Hitelesítés</w:t>
-      </w:r>
-      <w:proofErr w:type="spellEnd"/>
-      <w:r>
-        <w:rPr>
-          <w:b/>
-          <w:bCs/>
+        </w:rPr>
+        <w:t>Egyéb:</w:t>
+      </w:r>
+    </w:p>
+    <w:p>
+      <w:pPr>
+        <w:ind w:left="709"/>
+        <w:rPr>
+          <w:lang w:val="en-GB"/>
+        </w:rPr>
+      </w:pPr>
+      <w:r>
+        <w:rPr>
+          <w:lang w:val="en-GB"/>
+        </w:rPr>
+        <w:t xml:space="preserve"> 9 </w:t>
+      </w:r>
+      <w:proofErr w:type="spellStart"/>
+      <w:r>
+        <w:rPr>
+          <w:lang w:val="en-GB"/>
+        </w:rPr>
+        <w:t>teszt</w:t>
+      </w:r>
+      <w:proofErr w:type="spellEnd"/>
+      <w:r>
+        <w:rPr>
+          <w:lang w:val="en-GB"/>
+        </w:rPr>
+        <w:t xml:space="preserve"> - CORS, 404, token </w:t>
+      </w:r>
+      <w:proofErr w:type="spellStart"/>
+      <w:r>
+        <w:rPr>
+          <w:lang w:val="en-GB"/>
+        </w:rPr>
+        <w:t>validáció</w:t>
+      </w:r>
+      <w:proofErr w:type="spellEnd"/>
+    </w:p>
+    <w:p>
+      <w:pPr>
+        <w:ind w:left="709"/>
+        <w:rPr>
+          <w:lang w:val="en-GB"/>
+        </w:rPr>
+      </w:pPr>
+    </w:p>
+    <w:p>
+      <w:pPr>
+        <w:pStyle w:val="Cmsor2"/>
+        <w:rPr>
+          <w:lang w:val="en-GB"/>
+        </w:rPr>
+      </w:pPr>
+      <w:r>
+        <w:rPr>
+          <w:lang w:val="en-GB"/>
+        </w:rPr>
+        <w:t>3</w:t>
+      </w:r>
+      <w:r>
+        <w:rPr>
+          <w:lang w:val="en-GB"/>
+        </w:rPr>
+        <w:t xml:space="preserve">.4 </w:t>
+      </w:r>
+      <w:proofErr w:type="spellStart"/>
+      <w:r>
+        <w:rPr>
+          <w:lang w:val="en-GB"/>
+        </w:rPr>
+        <w:t>Megállapítások</w:t>
+      </w:r>
+      <w:proofErr w:type="spellEnd"/>
+      <w:r>
+        <w:rPr>
           <w:lang w:val="en-GB"/>
         </w:rPr>
         <w:t>:</w:t>
       </w:r>
-      <w:r>
-        <w:rPr>
-          <w:lang w:val="en-GB"/>
-        </w:rPr>
-        <w:t xml:space="preserve"> 12 </w:t>
-      </w:r>
-      <w:proofErr w:type="spellStart"/>
-      <w:r>
-        <w:rPr>
-          <w:lang w:val="en-GB"/>
-        </w:rPr>
-        <w:t>teszt</w:t>
-      </w:r>
-      <w:proofErr w:type="spellEnd"/>
-      <w:r>
-        <w:rPr>
-          <w:lang w:val="en-GB"/>
-        </w:rPr>
-        <w:t xml:space="preserve"> - </w:t>
-      </w:r>
-      <w:proofErr w:type="spellStart"/>
-      <w:r>
-        <w:rPr>
-          <w:lang w:val="en-GB"/>
-        </w:rPr>
-        <w:t>Bejelentkezés</w:t>
-      </w:r>
-      <w:proofErr w:type="spellEnd"/>
-      <w:r>
-        <w:rPr>
-          <w:lang w:val="en-GB"/>
-        </w:rPr>
-        <w:t xml:space="preserve">, </w:t>
-      </w:r>
-      <w:proofErr w:type="spellStart"/>
-      <w:r>
-        <w:rPr>
-          <w:lang w:val="en-GB"/>
-        </w:rPr>
-        <w:t>regisztráció</w:t>
-      </w:r>
-      <w:proofErr w:type="spellEnd"/>
-      <w:r>
-        <w:rPr>
-          <w:lang w:val="en-GB"/>
-        </w:rPr>
-        <w:t xml:space="preserve">, </w:t>
-      </w:r>
-      <w:proofErr w:type="spellStart"/>
-      <w:r>
-        <w:rPr>
-          <w:lang w:val="en-GB"/>
-        </w:rPr>
-        <w:t>kijelentkezés</w:t>
-      </w:r>
-      <w:proofErr w:type="spellEnd"/>
-      <w:r>
-        <w:rPr>
-          <w:lang w:val="en-GB"/>
-        </w:rPr>
-        <w:t xml:space="preserve">, </w:t>
-      </w:r>
-      <w:proofErr w:type="spellStart"/>
-      <w:r>
-        <w:rPr>
-          <w:lang w:val="en-GB"/>
-        </w:rPr>
-        <w:t>felhasználói</w:t>
+    </w:p>
+    <w:p>
+      <w:pPr>
+        <w:rPr>
+          <w:lang w:val="en-GB"/>
+        </w:rPr>
+      </w:pPr>
+    </w:p>
+    <w:p>
+      <w:pPr>
+        <w:pStyle w:val="Cmsor3"/>
+        <w:rPr>
+          <w:lang w:val="en-GB"/>
+        </w:rPr>
+      </w:pPr>
+      <w:proofErr w:type="spellStart"/>
+      <w:r>
+        <w:rPr>
+          <w:lang w:val="en-GB"/>
+        </w:rPr>
+        <w:t>Pozitív</w:t>
       </w:r>
       <w:proofErr w:type="spellEnd"/>
       <w:r>
@@ -27040,522 +27138,11 @@
         <w:rPr>
           <w:lang w:val="en-GB"/>
         </w:rPr>
-        <w:t>adatok</w:t>
-      </w:r>
-      <w:proofErr w:type="spellEnd"/>
-    </w:p>
-    <w:p>
-      <w:pPr>
-        <w:numPr>
-          <w:ilvl w:val="0"/>
-          <w:numId w:val="27"/>
-        </w:numPr>
-        <w:rPr>
-          <w:lang w:val="en-GB"/>
-        </w:rPr>
-      </w:pPr>
-      <w:proofErr w:type="spellStart"/>
-      <w:r>
-        <w:rPr>
-          <w:b/>
-          <w:bCs/>
-          <w:lang w:val="en-GB"/>
-        </w:rPr>
-        <w:t>Termékek</w:t>
-      </w:r>
-      <w:proofErr w:type="spellEnd"/>
-      <w:r>
-        <w:rPr>
-          <w:b/>
-          <w:bCs/>
-          <w:lang w:val="en-GB"/>
-        </w:rPr>
-        <w:t>:</w:t>
-      </w:r>
-      <w:r>
-        <w:rPr>
-          <w:lang w:val="en-GB"/>
-        </w:rPr>
-        <w:t xml:space="preserve"> 20 </w:t>
-      </w:r>
-      <w:proofErr w:type="spellStart"/>
-      <w:r>
-        <w:rPr>
-          <w:lang w:val="en-GB"/>
-        </w:rPr>
-        <w:t>teszt</w:t>
-      </w:r>
-      <w:proofErr w:type="spellEnd"/>
-      <w:r>
-        <w:rPr>
-          <w:lang w:val="en-GB"/>
-        </w:rPr>
-        <w:t xml:space="preserve"> - CRUD </w:t>
-      </w:r>
-      <w:proofErr w:type="spellStart"/>
-      <w:r>
-        <w:rPr>
-          <w:lang w:val="en-GB"/>
-        </w:rPr>
-        <w:t>műveletek</w:t>
-      </w:r>
-      <w:proofErr w:type="spellEnd"/>
-      <w:r>
-        <w:rPr>
-          <w:lang w:val="en-GB"/>
-        </w:rPr>
-        <w:t xml:space="preserve">, </w:t>
-      </w:r>
-      <w:proofErr w:type="spellStart"/>
-      <w:r>
-        <w:rPr>
-          <w:lang w:val="en-GB"/>
-        </w:rPr>
-        <w:t>lista</w:t>
-      </w:r>
-      <w:proofErr w:type="spellEnd"/>
-      <w:r>
-        <w:rPr>
-          <w:lang w:val="en-GB"/>
-        </w:rPr>
-        <w:t xml:space="preserve"> </w:t>
-      </w:r>
-      <w:proofErr w:type="spellStart"/>
-      <w:r>
-        <w:rPr>
-          <w:lang w:val="en-GB"/>
-        </w:rPr>
-        <w:t>lekérése</w:t>
-      </w:r>
-      <w:proofErr w:type="spellEnd"/>
-      <w:r>
-        <w:rPr>
-          <w:lang w:val="en-GB"/>
-        </w:rPr>
-        <w:t xml:space="preserve">, </w:t>
-      </w:r>
-      <w:proofErr w:type="spellStart"/>
-      <w:r>
-        <w:rPr>
-          <w:lang w:val="en-GB"/>
-        </w:rPr>
-        <w:t>szűrés</w:t>
-      </w:r>
-      <w:proofErr w:type="spellEnd"/>
-    </w:p>
-    <w:p>
-      <w:pPr>
-        <w:numPr>
-          <w:ilvl w:val="0"/>
-          <w:numId w:val="27"/>
-        </w:numPr>
-        <w:rPr>
-          <w:lang w:val="en-GB"/>
-        </w:rPr>
-      </w:pPr>
-      <w:proofErr w:type="spellStart"/>
-      <w:r>
-        <w:rPr>
-          <w:b/>
-          <w:bCs/>
-          <w:lang w:val="en-GB"/>
-        </w:rPr>
-        <w:t>Megrendelések</w:t>
-      </w:r>
-      <w:proofErr w:type="spellEnd"/>
-      <w:r>
-        <w:rPr>
-          <w:b/>
-          <w:bCs/>
-          <w:lang w:val="en-GB"/>
-        </w:rPr>
-        <w:t>:</w:t>
-      </w:r>
-      <w:r>
-        <w:rPr>
-          <w:lang w:val="en-GB"/>
-        </w:rPr>
-        <w:t xml:space="preserve"> 14 </w:t>
-      </w:r>
-      <w:proofErr w:type="spellStart"/>
-      <w:r>
-        <w:rPr>
-          <w:lang w:val="en-GB"/>
-        </w:rPr>
-        <w:t>teszt</w:t>
-      </w:r>
-      <w:proofErr w:type="spellEnd"/>
-      <w:r>
-        <w:rPr>
-          <w:lang w:val="en-GB"/>
-        </w:rPr>
-        <w:t xml:space="preserve"> - </w:t>
-      </w:r>
-      <w:proofErr w:type="spellStart"/>
-      <w:r>
-        <w:rPr>
-          <w:lang w:val="en-GB"/>
-        </w:rPr>
-        <w:t>Rendelés</w:t>
-      </w:r>
-      <w:proofErr w:type="spellEnd"/>
-      <w:r>
-        <w:rPr>
-          <w:lang w:val="en-GB"/>
-        </w:rPr>
-        <w:t xml:space="preserve"> </w:t>
-      </w:r>
-      <w:proofErr w:type="spellStart"/>
-      <w:r>
-        <w:rPr>
-          <w:lang w:val="en-GB"/>
-        </w:rPr>
-        <w:t>létrehozás</w:t>
-      </w:r>
-      <w:proofErr w:type="spellEnd"/>
-      <w:r>
-        <w:rPr>
-          <w:lang w:val="en-GB"/>
-        </w:rPr>
-        <w:t xml:space="preserve">, </w:t>
-      </w:r>
-      <w:proofErr w:type="spellStart"/>
-      <w:r>
-        <w:rPr>
-          <w:lang w:val="en-GB"/>
-        </w:rPr>
-        <w:t>lista</w:t>
-      </w:r>
-      <w:proofErr w:type="spellEnd"/>
-      <w:r>
-        <w:rPr>
-          <w:lang w:val="en-GB"/>
-        </w:rPr>
-        <w:t xml:space="preserve">, </w:t>
-      </w:r>
-      <w:proofErr w:type="spellStart"/>
-      <w:r>
-        <w:rPr>
-          <w:lang w:val="en-GB"/>
-        </w:rPr>
-        <w:t>státusz</w:t>
-      </w:r>
-      <w:proofErr w:type="spellEnd"/>
-      <w:r>
-        <w:rPr>
-          <w:lang w:val="en-GB"/>
-        </w:rPr>
-        <w:t xml:space="preserve"> </w:t>
-      </w:r>
-      <w:proofErr w:type="spellStart"/>
-      <w:r>
-        <w:rPr>
-          <w:lang w:val="en-GB"/>
-        </w:rPr>
-        <w:t>módosítás</w:t>
-      </w:r>
-      <w:proofErr w:type="spellEnd"/>
-      <w:r>
-        <w:rPr>
-          <w:lang w:val="en-GB"/>
-        </w:rPr>
-        <w:t xml:space="preserve">, </w:t>
-      </w:r>
-      <w:proofErr w:type="spellStart"/>
-      <w:r>
-        <w:rPr>
-          <w:lang w:val="en-GB"/>
-        </w:rPr>
-        <w:t>törlés</w:t>
-      </w:r>
-      <w:proofErr w:type="spellEnd"/>
-    </w:p>
-    <w:p>
-      <w:pPr>
-        <w:numPr>
-          <w:ilvl w:val="0"/>
-          <w:numId w:val="27"/>
-        </w:numPr>
-        <w:rPr>
-          <w:lang w:val="en-GB"/>
-        </w:rPr>
-      </w:pPr>
-      <w:proofErr w:type="spellStart"/>
-      <w:r>
-        <w:rPr>
-          <w:b/>
-          <w:bCs/>
-          <w:lang w:val="en-GB"/>
-        </w:rPr>
-        <w:t>Időpontok</w:t>
-      </w:r>
-      <w:proofErr w:type="spellEnd"/>
-      <w:r>
-        <w:rPr>
-          <w:b/>
-          <w:bCs/>
-          <w:lang w:val="en-GB"/>
-        </w:rPr>
-        <w:t>:</w:t>
-      </w:r>
-      <w:r>
-        <w:rPr>
-          <w:lang w:val="en-GB"/>
-        </w:rPr>
-        <w:t xml:space="preserve"> 20 </w:t>
-      </w:r>
-      <w:proofErr w:type="spellStart"/>
-      <w:r>
-        <w:rPr>
-          <w:lang w:val="en-GB"/>
-        </w:rPr>
-        <w:t>teszt</w:t>
-      </w:r>
-      <w:proofErr w:type="spellEnd"/>
-      <w:r>
-        <w:rPr>
-          <w:lang w:val="en-GB"/>
-        </w:rPr>
-        <w:t xml:space="preserve"> - </w:t>
-      </w:r>
-      <w:proofErr w:type="spellStart"/>
-      <w:r>
-        <w:rPr>
-          <w:lang w:val="en-GB"/>
-        </w:rPr>
-        <w:t>Időpont</w:t>
-      </w:r>
-      <w:proofErr w:type="spellEnd"/>
-      <w:r>
-        <w:rPr>
-          <w:lang w:val="en-GB"/>
-        </w:rPr>
-        <w:t xml:space="preserve"> CRUD, </w:t>
-      </w:r>
-      <w:proofErr w:type="spellStart"/>
-      <w:r>
-        <w:rPr>
-          <w:lang w:val="en-GB"/>
-        </w:rPr>
-        <w:t>foglalás</w:t>
-      </w:r>
-      <w:proofErr w:type="spellEnd"/>
-      <w:r>
-        <w:rPr>
-          <w:lang w:val="en-GB"/>
-        </w:rPr>
-        <w:t xml:space="preserve">, </w:t>
-      </w:r>
-      <w:proofErr w:type="spellStart"/>
-      <w:r>
-        <w:rPr>
-          <w:lang w:val="en-GB"/>
-        </w:rPr>
-        <w:t>véglegesítés</w:t>
-      </w:r>
-      <w:proofErr w:type="spellEnd"/>
-    </w:p>
-    <w:p>
-      <w:pPr>
-        <w:numPr>
-          <w:ilvl w:val="0"/>
-          <w:numId w:val="27"/>
-        </w:numPr>
-        <w:rPr>
-          <w:lang w:val="en-GB"/>
-        </w:rPr>
-      </w:pPr>
-      <w:proofErr w:type="spellStart"/>
-      <w:r>
-        <w:rPr>
-          <w:b/>
-          <w:bCs/>
-          <w:lang w:val="en-GB"/>
-        </w:rPr>
-        <w:t>Felhasználók</w:t>
-      </w:r>
-      <w:proofErr w:type="spellEnd"/>
-      <w:r>
-        <w:rPr>
-          <w:b/>
-          <w:bCs/>
-          <w:lang w:val="en-GB"/>
-        </w:rPr>
-        <w:t>:</w:t>
-      </w:r>
-      <w:r>
-        <w:rPr>
-          <w:lang w:val="en-GB"/>
-        </w:rPr>
-        <w:t xml:space="preserve"> 8 </w:t>
-      </w:r>
-      <w:proofErr w:type="spellStart"/>
-      <w:r>
-        <w:rPr>
-          <w:lang w:val="en-GB"/>
-        </w:rPr>
-        <w:t>teszt</w:t>
-      </w:r>
-      <w:proofErr w:type="spellEnd"/>
-      <w:r>
-        <w:rPr>
-          <w:lang w:val="en-GB"/>
-        </w:rPr>
-        <w:t xml:space="preserve"> - Admin </w:t>
-      </w:r>
-      <w:proofErr w:type="spellStart"/>
-      <w:r>
-        <w:rPr>
-          <w:lang w:val="en-GB"/>
-        </w:rPr>
-        <w:t>felhasználó</w:t>
-      </w:r>
-      <w:proofErr w:type="spellEnd"/>
-      <w:r>
-        <w:rPr>
-          <w:lang w:val="en-GB"/>
-        </w:rPr>
-        <w:t xml:space="preserve"> </w:t>
-      </w:r>
-      <w:proofErr w:type="spellStart"/>
-      <w:r>
-        <w:rPr>
-          <w:lang w:val="en-GB"/>
-        </w:rPr>
-        <w:t>kezelés</w:t>
-      </w:r>
-      <w:proofErr w:type="spellEnd"/>
-    </w:p>
-    <w:p>
-      <w:pPr>
-        <w:numPr>
-          <w:ilvl w:val="0"/>
-          <w:numId w:val="27"/>
-        </w:numPr>
-        <w:rPr>
-          <w:lang w:val="en-GB"/>
-        </w:rPr>
-      </w:pPr>
-      <w:proofErr w:type="spellStart"/>
-      <w:r>
-        <w:rPr>
-          <w:b/>
-          <w:bCs/>
-          <w:lang w:val="en-GB"/>
-        </w:rPr>
-        <w:t>Egyéb</w:t>
-      </w:r>
-      <w:proofErr w:type="spellEnd"/>
-      <w:r>
-        <w:rPr>
-          <w:b/>
-          <w:bCs/>
-          <w:lang w:val="en-GB"/>
-        </w:rPr>
-        <w:t>:</w:t>
-      </w:r>
-      <w:r>
-        <w:rPr>
-          <w:lang w:val="en-GB"/>
-        </w:rPr>
-        <w:t xml:space="preserve"> 9 </w:t>
-      </w:r>
-      <w:proofErr w:type="spellStart"/>
-      <w:r>
-        <w:rPr>
-          <w:lang w:val="en-GB"/>
-        </w:rPr>
-        <w:t>teszt</w:t>
-      </w:r>
-      <w:proofErr w:type="spellEnd"/>
-      <w:r>
-        <w:rPr>
-          <w:lang w:val="en-GB"/>
-        </w:rPr>
-        <w:t xml:space="preserve"> - CORS, 404, token </w:t>
-      </w:r>
-      <w:proofErr w:type="spellStart"/>
-      <w:r>
-        <w:rPr>
-          <w:lang w:val="en-GB"/>
-        </w:rPr>
-        <w:t>validáció</w:t>
-      </w:r>
-      <w:proofErr w:type="spellEnd"/>
-    </w:p>
-    <w:p>
-      <w:pPr>
-        <w:rPr>
-          <w:b/>
-          <w:bCs/>
-          <w:lang w:val="en-GB"/>
-        </w:rPr>
-      </w:pPr>
-      <w:r>
-        <w:rPr>
-          <w:b/>
-          <w:bCs/>
-          <w:lang w:val="en-GB"/>
-        </w:rPr>
-        <w:t>3</w:t>
-      </w:r>
-      <w:r>
-        <w:rPr>
-          <w:b/>
-          <w:bCs/>
-          <w:lang w:val="en-GB"/>
-        </w:rPr>
-        <w:t xml:space="preserve">.4 </w:t>
-      </w:r>
-      <w:proofErr w:type="spellStart"/>
-      <w:r>
-        <w:rPr>
-          <w:b/>
-          <w:bCs/>
-          <w:lang w:val="en-GB"/>
-        </w:rPr>
-        <w:t>Megállapítások</w:t>
-      </w:r>
-      <w:proofErr w:type="spellEnd"/>
-    </w:p>
-    <w:p>
-      <w:pPr>
-        <w:rPr>
-          <w:lang w:val="en-GB"/>
-        </w:rPr>
-      </w:pPr>
-      <w:proofErr w:type="spellStart"/>
-      <w:r>
-        <w:rPr>
-          <w:b/>
-          <w:bCs/>
-          <w:lang w:val="en-GB"/>
-        </w:rPr>
-        <w:t>Pozitív</w:t>
-      </w:r>
-      <w:proofErr w:type="spellEnd"/>
-      <w:r>
-        <w:rPr>
-          <w:b/>
-          <w:bCs/>
-          <w:lang w:val="en-GB"/>
-        </w:rPr>
-        <w:t xml:space="preserve"> </w:t>
-      </w:r>
-      <w:proofErr w:type="spellStart"/>
-      <w:r>
-        <w:rPr>
-          <w:b/>
-          <w:bCs/>
-          <w:lang w:val="en-GB"/>
-        </w:rPr>
         <w:t>megállapítások</w:t>
       </w:r>
       <w:proofErr w:type="spellEnd"/>
       <w:r>
         <w:rPr>
-          <w:b/>
-          <w:bCs/>
           <w:lang w:val="en-GB"/>
         </w:rPr>
         <w:t>:</w:t>
@@ -27873,15 +27460,14 @@
     </w:p>
     <w:p>
       <w:pPr>
-        <w:rPr>
-          <w:lang w:val="en-GB"/>
-        </w:rPr>
-      </w:pPr>
-      <w:proofErr w:type="spellStart"/>
-      <w:r>
-        <w:rPr>
-          <w:b/>
-          <w:bCs/>
+        <w:pStyle w:val="Cmsor3"/>
+        <w:rPr>
+          <w:lang w:val="en-GB"/>
+        </w:rPr>
+      </w:pPr>
+      <w:proofErr w:type="spellStart"/>
+      <w:r>
+        <w:rPr>
           <w:lang w:val="en-GB"/>
         </w:rPr>
         <w:t>Javaslatok</w:t>
@@ -27889,8 +27475,6 @@
       <w:proofErr w:type="spellEnd"/>
       <w:r>
         <w:rPr>
-          <w:b/>
-          <w:bCs/>
           <w:lang w:val="en-GB"/>
         </w:rPr>
         <w:t>:</w:t>
@@ -28133,9 +27717,6 @@
       </w:r>
       <w:proofErr w:type="spellEnd"/>
     </w:p>
-    <w:p/>
-    <w:p/>
-    <w:p/>
     <w:p/>
     <w:p/>
     <w:p/>
@@ -31298,7 +30879,7 @@
                     <pic:cNvPicPr/>
                   </pic:nvPicPr>
                   <pic:blipFill>
-                    <a:blip r:embed="rId8"/>
+                    <a:blip r:embed="rId9"/>
                     <a:stretch>
                       <a:fillRect/>
                     </a:stretch>
@@ -31346,7 +30927,7 @@
                     <pic:cNvPicPr/>
                   </pic:nvPicPr>
                   <pic:blipFill>
-                    <a:blip r:embed="rId9"/>
+                    <a:blip r:embed="rId10"/>
                     <a:stretch>
                       <a:fillRect/>
                     </a:stretch>
@@ -31407,7 +30988,7 @@
                     <pic:cNvPicPr/>
                   </pic:nvPicPr>
                   <pic:blipFill>
-                    <a:blip r:embed="rId10"/>
+                    <a:blip r:embed="rId11"/>
                     <a:stretch>
                       <a:fillRect/>
                     </a:stretch>
@@ -31583,7 +31164,7 @@
                     <pic:cNvPicPr/>
                   </pic:nvPicPr>
                   <pic:blipFill>
-                    <a:blip r:embed="rId11"/>
+                    <a:blip r:embed="rId12"/>
                     <a:stretch>
                       <a:fillRect/>
                     </a:stretch>
@@ -31647,7 +31228,7 @@
                     <pic:cNvPicPr/>
                   </pic:nvPicPr>
                   <pic:blipFill>
-                    <a:blip r:embed="rId12"/>
+                    <a:blip r:embed="rId13"/>
                     <a:stretch>
                       <a:fillRect/>
                     </a:stretch>
@@ -31709,7 +31290,7 @@
                     <pic:cNvPicPr/>
                   </pic:nvPicPr>
                   <pic:blipFill>
-                    <a:blip r:embed="rId13"/>
+                    <a:blip r:embed="rId14"/>
                     <a:stretch>
                       <a:fillRect/>
                     </a:stretch>
@@ -31772,7 +31353,7 @@
                     <pic:cNvPicPr/>
                   </pic:nvPicPr>
                   <pic:blipFill>
-                    <a:blip r:embed="rId14"/>
+                    <a:blip r:embed="rId15"/>
                     <a:stretch>
                       <a:fillRect/>
                     </a:stretch>
@@ -31827,7 +31408,7 @@
                     <pic:cNvPicPr/>
                   </pic:nvPicPr>
                   <pic:blipFill>
-                    <a:blip r:embed="rId15"/>
+                    <a:blip r:embed="rId16"/>
                     <a:stretch>
                       <a:fillRect/>
                     </a:stretch>
@@ -31889,7 +31470,7 @@
                     <pic:cNvPicPr/>
                   </pic:nvPicPr>
                   <pic:blipFill>
-                    <a:blip r:embed="rId16"/>
+                    <a:blip r:embed="rId17"/>
                     <a:stretch>
                       <a:fillRect/>
                     </a:stretch>
@@ -32002,7 +31583,7 @@
                     <pic:cNvPicPr/>
                   </pic:nvPicPr>
                   <pic:blipFill>
-                    <a:blip r:embed="rId17"/>
+                    <a:blip r:embed="rId18"/>
                     <a:stretch>
                       <a:fillRect/>
                     </a:stretch>
@@ -32052,7 +31633,7 @@
                     <pic:cNvPicPr/>
                   </pic:nvPicPr>
                   <pic:blipFill>
-                    <a:blip r:embed="rId18"/>
+                    <a:blip r:embed="rId19"/>
                     <a:stretch>
                       <a:fillRect/>
                     </a:stretch>
@@ -32223,7 +31804,7 @@
                     <pic:cNvPicPr/>
                   </pic:nvPicPr>
                   <pic:blipFill>
-                    <a:blip r:embed="rId19"/>
+                    <a:blip r:embed="rId20"/>
                     <a:stretch>
                       <a:fillRect/>
                     </a:stretch>
@@ -32289,7 +31870,7 @@
                     <pic:cNvPicPr/>
                   </pic:nvPicPr>
                   <pic:blipFill>
-                    <a:blip r:embed="rId20"/>
+                    <a:blip r:embed="rId21"/>
                     <a:stretch>
                       <a:fillRect/>
                     </a:stretch>
@@ -32356,7 +31937,7 @@
                     <pic:cNvPicPr/>
                   </pic:nvPicPr>
                   <pic:blipFill>
-                    <a:blip r:embed="rId21"/>
+                    <a:blip r:embed="rId22"/>
                     <a:stretch>
                       <a:fillRect/>
                     </a:stretch>
@@ -32419,7 +32000,7 @@
                     <pic:cNvPicPr/>
                   </pic:nvPicPr>
                   <pic:blipFill>
-                    <a:blip r:embed="rId22"/>
+                    <a:blip r:embed="rId23"/>
                     <a:stretch>
                       <a:fillRect/>
                     </a:stretch>
@@ -32515,7 +32096,7 @@
                     <pic:cNvPicPr/>
                   </pic:nvPicPr>
                   <pic:blipFill>
-                    <a:blip r:embed="rId23"/>
+                    <a:blip r:embed="rId24"/>
                     <a:stretch>
                       <a:fillRect/>
                     </a:stretch>
@@ -32569,7 +32150,7 @@
                     <pic:cNvPicPr/>
                   </pic:nvPicPr>
                   <pic:blipFill>
-                    <a:blip r:embed="rId24"/>
+                    <a:blip r:embed="rId25"/>
                     <a:stretch>
                       <a:fillRect/>
                     </a:stretch>
@@ -32738,7 +32319,7 @@
                     <pic:cNvPicPr/>
                   </pic:nvPicPr>
                   <pic:blipFill>
-                    <a:blip r:embed="rId25"/>
+                    <a:blip r:embed="rId26"/>
                     <a:stretch>
                       <a:fillRect/>
                     </a:stretch>
@@ -32794,7 +32375,7 @@
                     <pic:cNvPicPr/>
                   </pic:nvPicPr>
                   <pic:blipFill>
-                    <a:blip r:embed="rId26"/>
+                    <a:blip r:embed="rId27"/>
                     <a:stretch>
                       <a:fillRect/>
                     </a:stretch>
@@ -32857,7 +32438,7 @@
                     <pic:cNvPicPr/>
                   </pic:nvPicPr>
                   <pic:blipFill>
-                    <a:blip r:embed="rId27"/>
+                    <a:blip r:embed="rId28"/>
                     <a:stretch>
                       <a:fillRect/>
                     </a:stretch>
@@ -32919,7 +32500,7 @@
                     <pic:cNvPicPr/>
                   </pic:nvPicPr>
                   <pic:blipFill>
-                    <a:blip r:embed="rId28"/>
+                    <a:blip r:embed="rId29"/>
                     <a:stretch>
                       <a:fillRect/>
                     </a:stretch>
@@ -33112,7 +32693,7 @@
                     <pic:cNvPicPr/>
                   </pic:nvPicPr>
                   <pic:blipFill>
-                    <a:blip r:embed="rId29"/>
+                    <a:blip r:embed="rId30"/>
                     <a:stretch>
                       <a:fillRect/>
                     </a:stretch>
@@ -33176,7 +32757,7 @@
                     <pic:cNvPicPr/>
                   </pic:nvPicPr>
                   <pic:blipFill>
-                    <a:blip r:embed="rId30"/>
+                    <a:blip r:embed="rId31"/>
                     <a:stretch>
                       <a:fillRect/>
                     </a:stretch>
@@ -33263,7 +32844,7 @@
                     <pic:cNvPicPr/>
                   </pic:nvPicPr>
                   <pic:blipFill>
-                    <a:blip r:embed="rId31"/>
+                    <a:blip r:embed="rId32"/>
                     <a:stretch>
                       <a:fillRect/>
                     </a:stretch>
@@ -33327,7 +32908,7 @@
                     <pic:cNvPicPr/>
                   </pic:nvPicPr>
                   <pic:blipFill>
-                    <a:blip r:embed="rId32"/>
+                    <a:blip r:embed="rId33"/>
                     <a:stretch>
                       <a:fillRect/>
                     </a:stretch>
@@ -33390,7 +32971,7 @@
                     <pic:cNvPicPr/>
                   </pic:nvPicPr>
                   <pic:blipFill>
-                    <a:blip r:embed="rId33"/>
+                    <a:blip r:embed="rId34"/>
                     <a:stretch>
                       <a:fillRect/>
                     </a:stretch>
@@ -33471,7 +33052,7 @@
                     <pic:cNvPicPr/>
                   </pic:nvPicPr>
                   <pic:blipFill>
-                    <a:blip r:embed="rId34"/>
+                    <a:blip r:embed="rId35"/>
                     <a:stretch>
                       <a:fillRect/>
                     </a:stretch>
@@ -33534,7 +33115,7 @@
                     <pic:cNvPicPr/>
                   </pic:nvPicPr>
                   <pic:blipFill>
-                    <a:blip r:embed="rId35"/>
+                    <a:blip r:embed="rId36"/>
                     <a:stretch>
                       <a:fillRect/>
                     </a:stretch>
@@ -33607,7 +33188,7 @@
                     <pic:cNvPicPr/>
                   </pic:nvPicPr>
                   <pic:blipFill>
-                    <a:blip r:embed="rId29"/>
+                    <a:blip r:embed="rId30"/>
                     <a:stretch>
                       <a:fillRect/>
                     </a:stretch>
@@ -33671,7 +33252,7 @@
                     <pic:cNvPicPr/>
                   </pic:nvPicPr>
                   <pic:blipFill>
-                    <a:blip r:embed="rId30"/>
+                    <a:blip r:embed="rId31"/>
                     <a:stretch>
                       <a:fillRect/>
                     </a:stretch>
@@ -33783,63 +33364,6 @@
                 <pic:pic xmlns:pic="http://schemas.openxmlformats.org/drawingml/2006/picture">
                   <pic:nvPicPr>
                     <pic:cNvPr id="1044114452" name=""/>
-                    <pic:cNvPicPr/>
-                  </pic:nvPicPr>
-                  <pic:blipFill>
-                    <a:blip r:embed="rId36"/>
-                    <a:stretch>
-                      <a:fillRect/>
-                    </a:stretch>
-                  </pic:blipFill>
-                  <pic:spPr>
-                    <a:xfrm>
-                      <a:off x="0" y="0"/>
-                      <a:ext cx="5219700" cy="2428875"/>
-                    </a:xfrm>
-                    <a:prstGeom prst="rect">
-                      <a:avLst/>
-                    </a:prstGeom>
-                  </pic:spPr>
-                </pic:pic>
-              </a:graphicData>
-            </a:graphic>
-          </wp:inline>
-        </w:drawing>
-      </w:r>
-    </w:p>
-    <w:p>
-      <w:pPr>
-        <w:pStyle w:val="Listaszerbekezds"/>
-        <w:ind w:left="567"/>
-        <w:contextualSpacing w:val="0"/>
-      </w:pPr>
-      <w:r>
-        <w:t>az űrlap kitöltése után pedig a „Hozzáad!” gombra kattintva,</w:t>
-      </w:r>
-    </w:p>
-    <w:p>
-      <w:pPr>
-        <w:pStyle w:val="Listaszerbekezds"/>
-        <w:ind w:left="567"/>
-        <w:contextualSpacing w:val="0"/>
-      </w:pPr>
-      <w:r>
-        <w:rPr>
-          <w:noProof/>
-        </w:rPr>
-        <w:drawing>
-          <wp:inline distT="0" distB="0" distL="0" distR="0" wp14:anchorId="6EC1B856" wp14:editId="18C9B993">
-            <wp:extent cx="5219700" cy="2428875"/>
-            <wp:effectExtent l="0" t="0" r="0" b="9525"/>
-            <wp:docPr id="150282080" name="Kép 1"/>
-            <wp:cNvGraphicFramePr>
-              <a:graphicFrameLocks xmlns:a="http://schemas.openxmlformats.org/drawingml/2006/main" noChangeAspect="1"/>
-            </wp:cNvGraphicFramePr>
-            <a:graphic xmlns:a="http://schemas.openxmlformats.org/drawingml/2006/main">
-              <a:graphicData uri="http://schemas.openxmlformats.org/drawingml/2006/picture">
-                <pic:pic xmlns:pic="http://schemas.openxmlformats.org/drawingml/2006/picture">
-                  <pic:nvPicPr>
-                    <pic:cNvPr id="150282080" name=""/>
                     <pic:cNvPicPr/>
                   </pic:nvPicPr>
                   <pic:blipFill>
@@ -33863,6 +33387,63 @@
           </wp:inline>
         </w:drawing>
       </w:r>
+    </w:p>
+    <w:p>
+      <w:pPr>
+        <w:pStyle w:val="Listaszerbekezds"/>
+        <w:ind w:left="567"/>
+        <w:contextualSpacing w:val="0"/>
+      </w:pPr>
+      <w:r>
+        <w:t>az űrlap kitöltése után pedig a „Hozzáad!” gombra kattintva,</w:t>
+      </w:r>
+    </w:p>
+    <w:p>
+      <w:pPr>
+        <w:pStyle w:val="Listaszerbekezds"/>
+        <w:ind w:left="567"/>
+        <w:contextualSpacing w:val="0"/>
+      </w:pPr>
+      <w:r>
+        <w:rPr>
+          <w:noProof/>
+        </w:rPr>
+        <w:drawing>
+          <wp:inline distT="0" distB="0" distL="0" distR="0" wp14:anchorId="6EC1B856" wp14:editId="18C9B993">
+            <wp:extent cx="5219700" cy="2428875"/>
+            <wp:effectExtent l="0" t="0" r="0" b="9525"/>
+            <wp:docPr id="150282080" name="Kép 1"/>
+            <wp:cNvGraphicFramePr>
+              <a:graphicFrameLocks xmlns:a="http://schemas.openxmlformats.org/drawingml/2006/main" noChangeAspect="1"/>
+            </wp:cNvGraphicFramePr>
+            <a:graphic xmlns:a="http://schemas.openxmlformats.org/drawingml/2006/main">
+              <a:graphicData uri="http://schemas.openxmlformats.org/drawingml/2006/picture">
+                <pic:pic xmlns:pic="http://schemas.openxmlformats.org/drawingml/2006/picture">
+                  <pic:nvPicPr>
+                    <pic:cNvPr id="150282080" name=""/>
+                    <pic:cNvPicPr/>
+                  </pic:nvPicPr>
+                  <pic:blipFill>
+                    <a:blip r:embed="rId38"/>
+                    <a:stretch>
+                      <a:fillRect/>
+                    </a:stretch>
+                  </pic:blipFill>
+                  <pic:spPr>
+                    <a:xfrm>
+                      <a:off x="0" y="0"/>
+                      <a:ext cx="5219700" cy="2428875"/>
+                    </a:xfrm>
+                    <a:prstGeom prst="rect">
+                      <a:avLst/>
+                    </a:prstGeom>
+                  </pic:spPr>
+                </pic:pic>
+              </a:graphicData>
+            </a:graphic>
+          </wp:inline>
+        </w:drawing>
+      </w:r>
       <w:r>
         <w:br/>
         <w:t>a termék bekerül a listába.</w:t>
@@ -33887,7 +33468,7 @@
                     <pic:cNvPicPr/>
                   </pic:nvPicPr>
                   <pic:blipFill>
-                    <a:blip r:embed="rId38"/>
+                    <a:blip r:embed="rId39"/>
                     <a:stretch>
                       <a:fillRect/>
                     </a:stretch>
@@ -34903,7 +34484,7 @@
                     </pic:cNvPicPr>
                   </pic:nvPicPr>
                   <pic:blipFill>
-                    <a:blip r:embed="rId39">
+                    <a:blip r:embed="rId40">
                       <a:extLst>
                         <a:ext uri="{28A0092B-C50C-407E-A947-70E740481C1C}">
                           <a14:useLocalDpi xmlns:a14="http://schemas.microsoft.com/office/drawing/2010/main" val="0"/>
@@ -34994,7 +34575,7 @@
                     </pic:cNvPicPr>
                   </pic:nvPicPr>
                   <pic:blipFill>
-                    <a:blip r:embed="rId40" cstate="print">
+                    <a:blip r:embed="rId41" cstate="print">
                       <a:extLst>
                         <a:ext uri="{28A0092B-C50C-407E-A947-70E740481C1C}">
                           <a14:useLocalDpi xmlns:a14="http://schemas.microsoft.com/office/drawing/2010/main" val="0"/>
@@ -35087,7 +34668,7 @@
                     </pic:cNvPicPr>
                   </pic:nvPicPr>
                   <pic:blipFill>
-                    <a:blip r:embed="rId41">
+                    <a:blip r:embed="rId42">
                       <a:extLst>
                         <a:ext uri="{28A0092B-C50C-407E-A947-70E740481C1C}">
                           <a14:useLocalDpi xmlns:a14="http://schemas.microsoft.com/office/drawing/2010/main" val="0"/>
@@ -35251,7 +34832,7 @@
                     </pic:cNvPicPr>
                   </pic:nvPicPr>
                   <pic:blipFill>
-                    <a:blip r:embed="rId42">
+                    <a:blip r:embed="rId43">
                       <a:extLst>
                         <a:ext uri="{28A0092B-C50C-407E-A947-70E740481C1C}">
                           <a14:useLocalDpi xmlns:a14="http://schemas.microsoft.com/office/drawing/2010/main" val="0"/>
@@ -35335,7 +34916,7 @@
                     </pic:cNvPicPr>
                   </pic:nvPicPr>
                   <pic:blipFill>
-                    <a:blip r:embed="rId43">
+                    <a:blip r:embed="rId44">
                       <a:extLst>
                         <a:ext uri="{28A0092B-C50C-407E-A947-70E740481C1C}">
                           <a14:useLocalDpi xmlns:a14="http://schemas.microsoft.com/office/drawing/2010/main" val="0"/>
@@ -35412,7 +34993,7 @@
                     </pic:cNvPicPr>
                   </pic:nvPicPr>
                   <pic:blipFill>
-                    <a:blip r:embed="rId44">
+                    <a:blip r:embed="rId45">
                       <a:extLst>
                         <a:ext uri="{28A0092B-C50C-407E-A947-70E740481C1C}">
                           <a14:useLocalDpi xmlns:a14="http://schemas.microsoft.com/office/drawing/2010/main" val="0"/>
@@ -35467,7 +35048,6 @@
       </w:pPr>
       <w:bookmarkStart w:id="282" w:name="_Toc227014840"/>
       <w:r>
-        <w:lastRenderedPageBreak/>
         <w:t>Szervizidőpontfoglalás</w:t>
       </w:r>
       <w:bookmarkEnd w:id="282"/>
@@ -35496,7 +35076,7 @@
                     </pic:cNvPicPr>
                   </pic:nvPicPr>
                   <pic:blipFill>
-                    <a:blip r:embed="rId45">
+                    <a:blip r:embed="rId46">
                       <a:extLst>
                         <a:ext uri="{28A0092B-C50C-407E-A947-70E740481C1C}">
                           <a14:useLocalDpi xmlns:a14="http://schemas.microsoft.com/office/drawing/2010/main" val="0"/>
@@ -39420,7 +39000,7 @@
     <w:uiPriority w:val="9"/>
     <w:unhideWhenUsed/>
     <w:qFormat/>
-    <w:rsid w:val="00E54A53"/>
+    <w:rsid w:val="007630F5"/>
     <w:pPr>
       <w:keepNext/>
       <w:keepLines/>
@@ -39430,7 +39010,7 @@
     <w:rPr>
       <w:rFonts w:eastAsiaTheme="majorEastAsia" w:cstheme="majorBidi"/>
       <w:color w:val="000000" w:themeColor="text1"/>
-      <w:sz w:val="32"/>
+      <w:sz w:val="36"/>
       <w:szCs w:val="32"/>
     </w:rPr>
   </w:style>
@@ -39461,10 +39041,9 @@
     <w:next w:val="Norml"/>
     <w:link w:val="Cmsor4Char"/>
     <w:uiPriority w:val="9"/>
-    <w:semiHidden/>
     <w:unhideWhenUsed/>
     <w:qFormat/>
-    <w:rsid w:val="00B217E8"/>
+    <w:rsid w:val="007630F5"/>
     <w:pPr>
       <w:keepNext/>
       <w:keepLines/>
@@ -39473,8 +39052,8 @@
     </w:pPr>
     <w:rPr>
       <w:rFonts w:eastAsiaTheme="majorEastAsia" w:cstheme="majorBidi"/>
-      <w:i/>
       <w:iCs/>
+      <w:sz w:val="28"/>
     </w:rPr>
   </w:style>
   <w:style w:type="paragraph" w:styleId="Cmsor5">
@@ -39633,12 +39212,12 @@
     <w:basedOn w:val="Bekezdsalapbettpusa"/>
     <w:link w:val="Cmsor2"/>
     <w:uiPriority w:val="9"/>
-    <w:rsid w:val="00E54A53"/>
+    <w:rsid w:val="007630F5"/>
     <w:rPr>
       <w:rFonts w:ascii="Times New Roman" w:eastAsiaTheme="majorEastAsia" w:hAnsi="Times New Roman" w:cstheme="majorBidi"/>
       <w:color w:val="000000" w:themeColor="text1"/>
       <w:kern w:val="0"/>
-      <w:sz w:val="32"/>
+      <w:sz w:val="36"/>
       <w:szCs w:val="32"/>
       <w14:ligatures w14:val="none"/>
     </w:rPr>
@@ -39662,13 +39241,12 @@
     <w:basedOn w:val="Bekezdsalapbettpusa"/>
     <w:link w:val="Cmsor4"/>
     <w:uiPriority w:val="9"/>
-    <w:semiHidden/>
-    <w:rsid w:val="00B217E8"/>
+    <w:rsid w:val="007630F5"/>
     <w:rPr>
       <w:rFonts w:ascii="Times New Roman" w:eastAsiaTheme="majorEastAsia" w:hAnsi="Times New Roman" w:cstheme="majorBidi"/>
-      <w:i/>
       <w:iCs/>
       <w:kern w:val="0"/>
+      <w:sz w:val="28"/>
       <w:szCs w:val="22"/>
       <w14:ligatures w14:val="none"/>
     </w:rPr>

</xml_diff>

<commit_message>
felesleges rest api tartalomjegyzék törlése
</commit_message>
<xml_diff>
--- a/doc/kesz_doksi/uj_osszeallitott_doksi.docx
+++ b/doc/kesz_doksi/uj_osszeallitott_doksi.docx
@@ -16138,15 +16138,7 @@
       </w:r>
       <w:proofErr w:type="spellEnd"/>
       <w:r>
-        <w:t xml:space="preserve"> </w:t>
-      </w:r>
-      <w:proofErr w:type="gramStart"/>
-      <w:r>
-        <w:t>megakadályozza</w:t>
-      </w:r>
-      <w:proofErr w:type="gramEnd"/>
-      <w:r>
-        <w:t xml:space="preserve"> hogy bejelentkezett felhasználók elérjék a bejelentkezési oldalakat, a </w:t>
+        <w:t xml:space="preserve"> megakadályozza hogy bejelentkezett felhasználók elérjék a bejelentkezési oldalakat, a </w:t>
       </w:r>
       <w:proofErr w:type="spellStart"/>
       <w:r>
@@ -16154,15 +16146,7 @@
       </w:r>
       <w:proofErr w:type="spellEnd"/>
       <w:r>
-        <w:t xml:space="preserve"> pedig </w:t>
-      </w:r>
-      <w:proofErr w:type="gramStart"/>
-      <w:r>
-        <w:t>biztosítja</w:t>
-      </w:r>
-      <w:proofErr w:type="gramEnd"/>
-      <w:r>
-        <w:t xml:space="preserve"> hogy a rendelési folyamat csak nem üres kosárral indítható el. Az </w:t>
+        <w:t xml:space="preserve"> pedig biztosítja hogy a rendelési folyamat csak nem üres kosárral indítható el. Az </w:t>
       </w:r>
       <w:proofErr w:type="spellStart"/>
       <w:r>
@@ -16294,2431 +16278,12 @@
     <w:p/>
     <w:p/>
     <w:p/>
-    <w:p/>
-    <w:p/>
-    <w:p/>
-    <w:p>
-      <w:pPr>
-        <w:pStyle w:val="Tartalomjegyzkcmsora"/>
-        <w:rPr>
-          <w:b w:val="0"/>
-        </w:rPr>
-      </w:pPr>
-      <w:r>
-        <w:rPr>
-          <w:b w:val="0"/>
-        </w:rPr>
-        <w:t>Tartalomjegyzék</w:t>
-      </w:r>
-    </w:p>
-    <w:p>
-      <w:pPr>
-        <w:pStyle w:val="TJ1"/>
-        <w:tabs>
-          <w:tab w:val="left" w:pos="480"/>
-        </w:tabs>
-        <w:rPr>
-          <w:rFonts w:asciiTheme="minorHAnsi" w:eastAsiaTheme="minorEastAsia" w:hAnsiTheme="minorHAnsi" w:cstheme="minorBidi"/>
-          <w:noProof/>
-          <w:lang w:eastAsia="hu-HU"/>
-        </w:rPr>
-      </w:pPr>
-      <w:r>
-        <w:fldChar w:fldCharType="begin"/>
-      </w:r>
-      <w:r>
-        <w:instrText xml:space="preserve"> TOC \o "1-3" \h \z \t "Cmsor1,1,Cmsor2,2" </w:instrText>
-      </w:r>
-      <w:r>
-        <w:fldChar w:fldCharType="separate"/>
-      </w:r>
-      <w:hyperlink w:anchor="_Toc224735084" w:history="1">
-        <w:r>
-          <w:rPr>
-            <w:rStyle w:val="Hiperhivatkozs"/>
-            <w:noProof/>
-          </w:rPr>
-          <w:t>1.</w:t>
-        </w:r>
-        <w:r>
-          <w:rPr>
-            <w:rFonts w:asciiTheme="minorHAnsi" w:eastAsiaTheme="minorEastAsia" w:hAnsiTheme="minorHAnsi" w:cstheme="minorBidi"/>
-            <w:noProof/>
-            <w:lang w:eastAsia="hu-HU"/>
-          </w:rPr>
-          <w:tab/>
-        </w:r>
-        <w:r>
-          <w:rPr>
-            <w:rStyle w:val="Hiperhivatkozs"/>
-            <w:noProof/>
-          </w:rPr>
-          <w:t>Bejelentkezés:</w:t>
-        </w:r>
-        <w:r>
-          <w:rPr>
-            <w:noProof/>
-            <w:webHidden/>
-          </w:rPr>
-          <w:tab/>
-        </w:r>
-        <w:r>
-          <w:rPr>
-            <w:noProof/>
-            <w:webHidden/>
-          </w:rPr>
-          <w:fldChar w:fldCharType="begin"/>
-        </w:r>
-        <w:r>
-          <w:rPr>
-            <w:noProof/>
-            <w:webHidden/>
-          </w:rPr>
-          <w:instrText xml:space="preserve"> PAGEREF _Toc224735084 \h </w:instrText>
-        </w:r>
-        <w:r>
-          <w:rPr>
-            <w:noProof/>
-            <w:webHidden/>
-          </w:rPr>
-        </w:r>
-        <w:r>
-          <w:rPr>
-            <w:noProof/>
-            <w:webHidden/>
-          </w:rPr>
-          <w:fldChar w:fldCharType="separate"/>
-        </w:r>
-        <w:r>
-          <w:rPr>
-            <w:noProof/>
-            <w:webHidden/>
-          </w:rPr>
-          <w:t>2</w:t>
-        </w:r>
-        <w:r>
-          <w:rPr>
-            <w:noProof/>
-            <w:webHidden/>
-          </w:rPr>
-          <w:fldChar w:fldCharType="end"/>
-        </w:r>
-      </w:hyperlink>
-    </w:p>
-    <w:p>
-      <w:pPr>
-        <w:pStyle w:val="TJ1"/>
-        <w:tabs>
-          <w:tab w:val="left" w:pos="480"/>
-        </w:tabs>
-        <w:rPr>
-          <w:rFonts w:asciiTheme="minorHAnsi" w:eastAsiaTheme="minorEastAsia" w:hAnsiTheme="minorHAnsi" w:cstheme="minorBidi"/>
-          <w:noProof/>
-          <w:lang w:eastAsia="hu-HU"/>
-        </w:rPr>
-      </w:pPr>
-      <w:hyperlink w:anchor="_Toc224735085" w:history="1">
-        <w:r>
-          <w:rPr>
-            <w:rStyle w:val="Hiperhivatkozs"/>
-            <w:noProof/>
-          </w:rPr>
-          <w:t>2.</w:t>
-        </w:r>
-        <w:r>
-          <w:rPr>
-            <w:rFonts w:asciiTheme="minorHAnsi" w:eastAsiaTheme="minorEastAsia" w:hAnsiTheme="minorHAnsi" w:cstheme="minorBidi"/>
-            <w:noProof/>
-            <w:lang w:eastAsia="hu-HU"/>
-          </w:rPr>
-          <w:tab/>
-        </w:r>
-        <w:r>
-          <w:rPr>
-            <w:rStyle w:val="Hiperhivatkozs"/>
-            <w:noProof/>
-          </w:rPr>
-          <w:t>Regisztráció:</w:t>
-        </w:r>
-        <w:r>
-          <w:rPr>
-            <w:noProof/>
-            <w:webHidden/>
-          </w:rPr>
-          <w:tab/>
-        </w:r>
-        <w:r>
-          <w:rPr>
-            <w:noProof/>
-            <w:webHidden/>
-          </w:rPr>
-          <w:fldChar w:fldCharType="begin"/>
-        </w:r>
-        <w:r>
-          <w:rPr>
-            <w:noProof/>
-            <w:webHidden/>
-          </w:rPr>
-          <w:instrText xml:space="preserve"> PAGEREF _Toc224735085 \h </w:instrText>
-        </w:r>
-        <w:r>
-          <w:rPr>
-            <w:noProof/>
-            <w:webHidden/>
-          </w:rPr>
-        </w:r>
-        <w:r>
-          <w:rPr>
-            <w:noProof/>
-            <w:webHidden/>
-          </w:rPr>
-          <w:fldChar w:fldCharType="separate"/>
-        </w:r>
-        <w:r>
-          <w:rPr>
-            <w:noProof/>
-            <w:webHidden/>
-          </w:rPr>
-          <w:t>3</w:t>
-        </w:r>
-        <w:r>
-          <w:rPr>
-            <w:noProof/>
-            <w:webHidden/>
-          </w:rPr>
-          <w:fldChar w:fldCharType="end"/>
-        </w:r>
-      </w:hyperlink>
-    </w:p>
-    <w:p>
-      <w:pPr>
-        <w:pStyle w:val="TJ1"/>
-        <w:tabs>
-          <w:tab w:val="left" w:pos="480"/>
-        </w:tabs>
-        <w:rPr>
-          <w:rFonts w:asciiTheme="minorHAnsi" w:eastAsiaTheme="minorEastAsia" w:hAnsiTheme="minorHAnsi" w:cstheme="minorBidi"/>
-          <w:noProof/>
-          <w:lang w:eastAsia="hu-HU"/>
-        </w:rPr>
-      </w:pPr>
-      <w:hyperlink w:anchor="_Toc224735086" w:history="1">
-        <w:r>
-          <w:rPr>
-            <w:rStyle w:val="Hiperhivatkozs"/>
-            <w:noProof/>
-          </w:rPr>
-          <w:t>3.</w:t>
-        </w:r>
-        <w:r>
-          <w:rPr>
-            <w:rFonts w:asciiTheme="minorHAnsi" w:eastAsiaTheme="minorEastAsia" w:hAnsiTheme="minorHAnsi" w:cstheme="minorBidi"/>
-            <w:noProof/>
-            <w:lang w:eastAsia="hu-HU"/>
-          </w:rPr>
-          <w:tab/>
-        </w:r>
-        <w:r>
-          <w:rPr>
-            <w:rStyle w:val="Hiperhivatkozs"/>
-            <w:noProof/>
-          </w:rPr>
-          <w:t>Kijelentkezés:</w:t>
-        </w:r>
-        <w:r>
-          <w:rPr>
-            <w:noProof/>
-            <w:webHidden/>
-          </w:rPr>
-          <w:tab/>
-        </w:r>
-        <w:r>
-          <w:rPr>
-            <w:noProof/>
-            <w:webHidden/>
-          </w:rPr>
-          <w:fldChar w:fldCharType="begin"/>
-        </w:r>
-        <w:r>
-          <w:rPr>
-            <w:noProof/>
-            <w:webHidden/>
-          </w:rPr>
-          <w:instrText xml:space="preserve"> PAGEREF _Toc224735086 \h </w:instrText>
-        </w:r>
-        <w:r>
-          <w:rPr>
-            <w:noProof/>
-            <w:webHidden/>
-          </w:rPr>
-        </w:r>
-        <w:r>
-          <w:rPr>
-            <w:noProof/>
-            <w:webHidden/>
-          </w:rPr>
-          <w:fldChar w:fldCharType="separate"/>
-        </w:r>
-        <w:r>
-          <w:rPr>
-            <w:noProof/>
-            <w:webHidden/>
-          </w:rPr>
-          <w:t>4</w:t>
-        </w:r>
-        <w:r>
-          <w:rPr>
-            <w:noProof/>
-            <w:webHidden/>
-          </w:rPr>
-          <w:fldChar w:fldCharType="end"/>
-        </w:r>
-      </w:hyperlink>
-    </w:p>
-    <w:p>
-      <w:pPr>
-        <w:pStyle w:val="TJ1"/>
-        <w:tabs>
-          <w:tab w:val="left" w:pos="480"/>
-        </w:tabs>
-        <w:rPr>
-          <w:rFonts w:asciiTheme="minorHAnsi" w:eastAsiaTheme="minorEastAsia" w:hAnsiTheme="minorHAnsi" w:cstheme="minorBidi"/>
-          <w:noProof/>
-          <w:lang w:eastAsia="hu-HU"/>
-        </w:rPr>
-      </w:pPr>
-      <w:hyperlink w:anchor="_Toc224735087" w:history="1">
-        <w:r>
-          <w:rPr>
-            <w:rStyle w:val="Hiperhivatkozs"/>
-            <w:noProof/>
-          </w:rPr>
-          <w:t>4.</w:t>
-        </w:r>
-        <w:r>
-          <w:rPr>
-            <w:rFonts w:asciiTheme="minorHAnsi" w:eastAsiaTheme="minorEastAsia" w:hAnsiTheme="minorHAnsi" w:cstheme="minorBidi"/>
-            <w:noProof/>
-            <w:lang w:eastAsia="hu-HU"/>
-          </w:rPr>
-          <w:tab/>
-        </w:r>
-        <w:r>
-          <w:rPr>
-            <w:rStyle w:val="Hiperhivatkozs"/>
-            <w:noProof/>
-          </w:rPr>
-          <w:t>Felhasználó saját adatai:</w:t>
-        </w:r>
-        <w:r>
-          <w:rPr>
-            <w:noProof/>
-            <w:webHidden/>
-          </w:rPr>
-          <w:tab/>
-        </w:r>
-        <w:r>
-          <w:rPr>
-            <w:noProof/>
-            <w:webHidden/>
-          </w:rPr>
-          <w:fldChar w:fldCharType="begin"/>
-        </w:r>
-        <w:r>
-          <w:rPr>
-            <w:noProof/>
-            <w:webHidden/>
-          </w:rPr>
-          <w:instrText xml:space="preserve"> PAGEREF _Toc224735087 \h </w:instrText>
-        </w:r>
-        <w:r>
-          <w:rPr>
-            <w:noProof/>
-            <w:webHidden/>
-          </w:rPr>
-        </w:r>
-        <w:r>
-          <w:rPr>
-            <w:noProof/>
-            <w:webHidden/>
-          </w:rPr>
-          <w:fldChar w:fldCharType="separate"/>
-        </w:r>
-        <w:r>
-          <w:rPr>
-            <w:noProof/>
-            <w:webHidden/>
-          </w:rPr>
-          <w:t>5</w:t>
-        </w:r>
-        <w:r>
-          <w:rPr>
-            <w:noProof/>
-            <w:webHidden/>
-          </w:rPr>
-          <w:fldChar w:fldCharType="end"/>
-        </w:r>
-      </w:hyperlink>
-    </w:p>
-    <w:p>
-      <w:pPr>
-        <w:pStyle w:val="TJ1"/>
-        <w:tabs>
-          <w:tab w:val="left" w:pos="480"/>
-        </w:tabs>
-        <w:rPr>
-          <w:rFonts w:asciiTheme="minorHAnsi" w:eastAsiaTheme="minorEastAsia" w:hAnsiTheme="minorHAnsi" w:cstheme="minorBidi"/>
-          <w:noProof/>
-          <w:lang w:eastAsia="hu-HU"/>
-        </w:rPr>
-      </w:pPr>
-      <w:hyperlink w:anchor="_Toc224735088" w:history="1">
-        <w:r>
-          <w:rPr>
-            <w:rStyle w:val="Hiperhivatkozs"/>
-            <w:noProof/>
-          </w:rPr>
-          <w:t>5.</w:t>
-        </w:r>
-        <w:r>
-          <w:rPr>
-            <w:rFonts w:asciiTheme="minorHAnsi" w:eastAsiaTheme="minorEastAsia" w:hAnsiTheme="minorHAnsi" w:cstheme="minorBidi"/>
-            <w:noProof/>
-            <w:lang w:eastAsia="hu-HU"/>
-          </w:rPr>
-          <w:tab/>
-        </w:r>
-        <w:r>
-          <w:rPr>
-            <w:rStyle w:val="Hiperhivatkozs"/>
-            <w:noProof/>
-          </w:rPr>
-          <w:t>Időpontfoglalás:</w:t>
-        </w:r>
-        <w:r>
-          <w:rPr>
-            <w:noProof/>
-            <w:webHidden/>
-          </w:rPr>
-          <w:tab/>
-        </w:r>
-        <w:r>
-          <w:rPr>
-            <w:noProof/>
-            <w:webHidden/>
-          </w:rPr>
-          <w:fldChar w:fldCharType="begin"/>
-        </w:r>
-        <w:r>
-          <w:rPr>
-            <w:noProof/>
-            <w:webHidden/>
-          </w:rPr>
-          <w:instrText xml:space="preserve"> PAGEREF _Toc224735088 \h </w:instrText>
-        </w:r>
-        <w:r>
-          <w:rPr>
-            <w:noProof/>
-            <w:webHidden/>
-          </w:rPr>
-        </w:r>
-        <w:r>
-          <w:rPr>
-            <w:noProof/>
-            <w:webHidden/>
-          </w:rPr>
-          <w:fldChar w:fldCharType="separate"/>
-        </w:r>
-        <w:r>
-          <w:rPr>
-            <w:noProof/>
-            <w:webHidden/>
-          </w:rPr>
-          <w:t>5</w:t>
-        </w:r>
-        <w:r>
-          <w:rPr>
-            <w:noProof/>
-            <w:webHidden/>
-          </w:rPr>
-          <w:fldChar w:fldCharType="end"/>
-        </w:r>
-      </w:hyperlink>
-    </w:p>
-    <w:p>
-      <w:pPr>
-        <w:pStyle w:val="TJ1"/>
-        <w:tabs>
-          <w:tab w:val="left" w:pos="480"/>
-        </w:tabs>
-        <w:rPr>
-          <w:rFonts w:asciiTheme="minorHAnsi" w:eastAsiaTheme="minorEastAsia" w:hAnsiTheme="minorHAnsi" w:cstheme="minorBidi"/>
-          <w:noProof/>
-          <w:lang w:eastAsia="hu-HU"/>
-        </w:rPr>
-      </w:pPr>
-      <w:hyperlink w:anchor="_Toc224735089" w:history="1">
-        <w:r>
-          <w:rPr>
-            <w:rStyle w:val="Hiperhivatkozs"/>
-            <w:noProof/>
-          </w:rPr>
-          <w:t>6.</w:t>
-        </w:r>
-        <w:r>
-          <w:rPr>
-            <w:rFonts w:asciiTheme="minorHAnsi" w:eastAsiaTheme="minorEastAsia" w:hAnsiTheme="minorHAnsi" w:cstheme="minorBidi"/>
-            <w:noProof/>
-            <w:lang w:eastAsia="hu-HU"/>
-          </w:rPr>
-          <w:tab/>
-        </w:r>
-        <w:r>
-          <w:rPr>
-            <w:rStyle w:val="Hiperhivatkozs"/>
-            <w:noProof/>
-          </w:rPr>
-          <w:t>Megrendelés rögzítése:</w:t>
-        </w:r>
-        <w:r>
-          <w:rPr>
-            <w:noProof/>
-            <w:webHidden/>
-          </w:rPr>
-          <w:tab/>
-        </w:r>
-        <w:r>
-          <w:rPr>
-            <w:noProof/>
-            <w:webHidden/>
-          </w:rPr>
-          <w:fldChar w:fldCharType="begin"/>
-        </w:r>
-        <w:r>
-          <w:rPr>
-            <w:noProof/>
-            <w:webHidden/>
-          </w:rPr>
-          <w:instrText xml:space="preserve"> PAGEREF _Toc224735089 \h </w:instrText>
-        </w:r>
-        <w:r>
-          <w:rPr>
-            <w:noProof/>
-            <w:webHidden/>
-          </w:rPr>
-        </w:r>
-        <w:r>
-          <w:rPr>
-            <w:noProof/>
-            <w:webHidden/>
-          </w:rPr>
-          <w:fldChar w:fldCharType="separate"/>
-        </w:r>
-        <w:r>
-          <w:rPr>
-            <w:noProof/>
-            <w:webHidden/>
-          </w:rPr>
-          <w:t>7</w:t>
-        </w:r>
-        <w:r>
-          <w:rPr>
-            <w:noProof/>
-            <w:webHidden/>
-          </w:rPr>
-          <w:fldChar w:fldCharType="end"/>
-        </w:r>
-      </w:hyperlink>
-    </w:p>
-    <w:p>
-      <w:pPr>
-        <w:pStyle w:val="TJ1"/>
-        <w:tabs>
-          <w:tab w:val="left" w:pos="480"/>
-        </w:tabs>
-        <w:rPr>
-          <w:rFonts w:asciiTheme="minorHAnsi" w:eastAsiaTheme="minorEastAsia" w:hAnsiTheme="minorHAnsi" w:cstheme="minorBidi"/>
-          <w:noProof/>
-          <w:lang w:eastAsia="hu-HU"/>
-        </w:rPr>
-      </w:pPr>
-      <w:hyperlink w:anchor="_Toc224735090" w:history="1">
-        <w:r>
-          <w:rPr>
-            <w:rStyle w:val="Hiperhivatkozs"/>
-            <w:noProof/>
-          </w:rPr>
-          <w:t>7.</w:t>
-        </w:r>
-        <w:r>
-          <w:rPr>
-            <w:rFonts w:asciiTheme="minorHAnsi" w:eastAsiaTheme="minorEastAsia" w:hAnsiTheme="minorHAnsi" w:cstheme="minorBidi"/>
-            <w:noProof/>
-            <w:lang w:eastAsia="hu-HU"/>
-          </w:rPr>
-          <w:tab/>
-        </w:r>
-        <w:r>
-          <w:rPr>
-            <w:rStyle w:val="Hiperhivatkozs"/>
-            <w:noProof/>
-          </w:rPr>
-          <w:t>Adott termék lekérése:</w:t>
-        </w:r>
-        <w:r>
-          <w:rPr>
-            <w:noProof/>
-            <w:webHidden/>
-          </w:rPr>
-          <w:tab/>
-        </w:r>
-        <w:r>
-          <w:rPr>
-            <w:noProof/>
-            <w:webHidden/>
-          </w:rPr>
-          <w:fldChar w:fldCharType="begin"/>
-        </w:r>
-        <w:r>
-          <w:rPr>
-            <w:noProof/>
-            <w:webHidden/>
-          </w:rPr>
-          <w:instrText xml:space="preserve"> PAGEREF _Toc224735090 \h </w:instrText>
-        </w:r>
-        <w:r>
-          <w:rPr>
-            <w:noProof/>
-            <w:webHidden/>
-          </w:rPr>
-        </w:r>
-        <w:r>
-          <w:rPr>
-            <w:noProof/>
-            <w:webHidden/>
-          </w:rPr>
-          <w:fldChar w:fldCharType="separate"/>
-        </w:r>
-        <w:r>
-          <w:rPr>
-            <w:noProof/>
-            <w:webHidden/>
-          </w:rPr>
-          <w:t>9</w:t>
-        </w:r>
-        <w:r>
-          <w:rPr>
-            <w:noProof/>
-            <w:webHidden/>
-          </w:rPr>
-          <w:fldChar w:fldCharType="end"/>
-        </w:r>
-      </w:hyperlink>
-    </w:p>
-    <w:p>
-      <w:pPr>
-        <w:pStyle w:val="TJ1"/>
-        <w:tabs>
-          <w:tab w:val="left" w:pos="480"/>
-        </w:tabs>
-        <w:rPr>
-          <w:rFonts w:asciiTheme="minorHAnsi" w:eastAsiaTheme="minorEastAsia" w:hAnsiTheme="minorHAnsi" w:cstheme="minorBidi"/>
-          <w:noProof/>
-          <w:lang w:eastAsia="hu-HU"/>
-        </w:rPr>
-      </w:pPr>
-      <w:hyperlink w:anchor="_Toc224735091" w:history="1">
-        <w:r>
-          <w:rPr>
-            <w:rStyle w:val="Hiperhivatkozs"/>
-            <w:noProof/>
-          </w:rPr>
-          <w:t>8.</w:t>
-        </w:r>
-        <w:r>
-          <w:rPr>
-            <w:rFonts w:asciiTheme="minorHAnsi" w:eastAsiaTheme="minorEastAsia" w:hAnsiTheme="minorHAnsi" w:cstheme="minorBidi"/>
-            <w:noProof/>
-            <w:lang w:eastAsia="hu-HU"/>
-          </w:rPr>
-          <w:tab/>
-        </w:r>
-        <w:r>
-          <w:rPr>
-            <w:rStyle w:val="Hiperhivatkozs"/>
-            <w:noProof/>
-          </w:rPr>
-          <w:t>Termékek listázása:</w:t>
-        </w:r>
-        <w:r>
-          <w:rPr>
-            <w:noProof/>
-            <w:webHidden/>
-          </w:rPr>
-          <w:tab/>
-        </w:r>
-        <w:r>
-          <w:rPr>
-            <w:noProof/>
-            <w:webHidden/>
-          </w:rPr>
-          <w:fldChar w:fldCharType="begin"/>
-        </w:r>
-        <w:r>
-          <w:rPr>
-            <w:noProof/>
-            <w:webHidden/>
-          </w:rPr>
-          <w:instrText xml:space="preserve"> PAGEREF _Toc224735091 \h </w:instrText>
-        </w:r>
-        <w:r>
-          <w:rPr>
-            <w:noProof/>
-            <w:webHidden/>
-          </w:rPr>
-        </w:r>
-        <w:r>
-          <w:rPr>
-            <w:noProof/>
-            <w:webHidden/>
-          </w:rPr>
-          <w:fldChar w:fldCharType="separate"/>
-        </w:r>
-        <w:r>
-          <w:rPr>
-            <w:noProof/>
-            <w:webHidden/>
-          </w:rPr>
-          <w:t>11</w:t>
-        </w:r>
-        <w:r>
-          <w:rPr>
-            <w:noProof/>
-            <w:webHidden/>
-          </w:rPr>
-          <w:fldChar w:fldCharType="end"/>
-        </w:r>
-      </w:hyperlink>
-    </w:p>
-    <w:p>
-      <w:pPr>
-        <w:pStyle w:val="TJ1"/>
-        <w:tabs>
-          <w:tab w:val="left" w:pos="480"/>
-        </w:tabs>
-        <w:rPr>
-          <w:rFonts w:asciiTheme="minorHAnsi" w:eastAsiaTheme="minorEastAsia" w:hAnsiTheme="minorHAnsi" w:cstheme="minorBidi"/>
-          <w:noProof/>
-          <w:lang w:eastAsia="hu-HU"/>
-        </w:rPr>
-      </w:pPr>
-      <w:hyperlink w:anchor="_Toc224735092" w:history="1">
-        <w:r>
-          <w:rPr>
-            <w:rStyle w:val="Hiperhivatkozs"/>
-            <w:noProof/>
-          </w:rPr>
-          <w:t>9.</w:t>
-        </w:r>
-        <w:r>
-          <w:rPr>
-            <w:rFonts w:asciiTheme="minorHAnsi" w:eastAsiaTheme="minorEastAsia" w:hAnsiTheme="minorHAnsi" w:cstheme="minorBidi"/>
-            <w:noProof/>
-            <w:lang w:eastAsia="hu-HU"/>
-          </w:rPr>
-          <w:tab/>
-        </w:r>
-        <w:r>
-          <w:rPr>
-            <w:rStyle w:val="Hiperhivatkozs"/>
-            <w:noProof/>
-          </w:rPr>
-          <w:t>Jelszó visszaállítás:</w:t>
-        </w:r>
-        <w:r>
-          <w:rPr>
-            <w:noProof/>
-            <w:webHidden/>
-          </w:rPr>
-          <w:tab/>
-        </w:r>
-        <w:r>
-          <w:rPr>
-            <w:noProof/>
-            <w:webHidden/>
-          </w:rPr>
-          <w:fldChar w:fldCharType="begin"/>
-        </w:r>
-        <w:r>
-          <w:rPr>
-            <w:noProof/>
-            <w:webHidden/>
-          </w:rPr>
-          <w:instrText xml:space="preserve"> PAGEREF _Toc224735092 \h </w:instrText>
-        </w:r>
-        <w:r>
-          <w:rPr>
-            <w:noProof/>
-            <w:webHidden/>
-          </w:rPr>
-        </w:r>
-        <w:r>
-          <w:rPr>
-            <w:noProof/>
-            <w:webHidden/>
-          </w:rPr>
-          <w:fldChar w:fldCharType="separate"/>
-        </w:r>
-        <w:r>
-          <w:rPr>
-            <w:noProof/>
-            <w:webHidden/>
-          </w:rPr>
-          <w:t>12</w:t>
-        </w:r>
-        <w:r>
-          <w:rPr>
-            <w:noProof/>
-            <w:webHidden/>
-          </w:rPr>
-          <w:fldChar w:fldCharType="end"/>
-        </w:r>
-      </w:hyperlink>
-    </w:p>
-    <w:p>
-      <w:pPr>
-        <w:pStyle w:val="TJ1"/>
-        <w:tabs>
-          <w:tab w:val="left" w:pos="720"/>
-        </w:tabs>
-        <w:rPr>
-          <w:rFonts w:asciiTheme="minorHAnsi" w:eastAsiaTheme="minorEastAsia" w:hAnsiTheme="minorHAnsi" w:cstheme="minorBidi"/>
-          <w:noProof/>
-          <w:lang w:eastAsia="hu-HU"/>
-        </w:rPr>
-      </w:pPr>
-      <w:hyperlink w:anchor="_Toc224735093" w:history="1">
-        <w:r>
-          <w:rPr>
-            <w:rStyle w:val="Hiperhivatkozs"/>
-            <w:noProof/>
-          </w:rPr>
-          <w:t>10.</w:t>
-        </w:r>
-        <w:r>
-          <w:rPr>
-            <w:rFonts w:asciiTheme="minorHAnsi" w:eastAsiaTheme="minorEastAsia" w:hAnsiTheme="minorHAnsi" w:cstheme="minorBidi"/>
-            <w:noProof/>
-            <w:lang w:eastAsia="hu-HU"/>
-          </w:rPr>
-          <w:tab/>
-        </w:r>
-        <w:r>
-          <w:rPr>
-            <w:rStyle w:val="Hiperhivatkozs"/>
-            <w:noProof/>
-          </w:rPr>
-          <w:t>Új jelszó létrehozása:</w:t>
-        </w:r>
-        <w:r>
-          <w:rPr>
-            <w:noProof/>
-            <w:webHidden/>
-          </w:rPr>
-          <w:tab/>
-        </w:r>
-        <w:r>
-          <w:rPr>
-            <w:noProof/>
-            <w:webHidden/>
-          </w:rPr>
-          <w:fldChar w:fldCharType="begin"/>
-        </w:r>
-        <w:r>
-          <w:rPr>
-            <w:noProof/>
-            <w:webHidden/>
-          </w:rPr>
-          <w:instrText xml:space="preserve"> PAGEREF _Toc224735093 \h </w:instrText>
-        </w:r>
-        <w:r>
-          <w:rPr>
-            <w:noProof/>
-            <w:webHidden/>
-          </w:rPr>
-        </w:r>
-        <w:r>
-          <w:rPr>
-            <w:noProof/>
-            <w:webHidden/>
-          </w:rPr>
-          <w:fldChar w:fldCharType="separate"/>
-        </w:r>
-        <w:r>
-          <w:rPr>
-            <w:noProof/>
-            <w:webHidden/>
-          </w:rPr>
-          <w:t>12</w:t>
-        </w:r>
-        <w:r>
-          <w:rPr>
-            <w:noProof/>
-            <w:webHidden/>
-          </w:rPr>
-          <w:fldChar w:fldCharType="end"/>
-        </w:r>
-      </w:hyperlink>
-    </w:p>
-    <w:p>
-      <w:pPr>
-        <w:pStyle w:val="TJ1"/>
-        <w:tabs>
-          <w:tab w:val="left" w:pos="720"/>
-        </w:tabs>
-        <w:rPr>
-          <w:rFonts w:asciiTheme="minorHAnsi" w:eastAsiaTheme="minorEastAsia" w:hAnsiTheme="minorHAnsi" w:cstheme="minorBidi"/>
-          <w:noProof/>
-          <w:lang w:eastAsia="hu-HU"/>
-        </w:rPr>
-      </w:pPr>
-      <w:hyperlink w:anchor="_Toc224735094" w:history="1">
-        <w:r>
-          <w:rPr>
-            <w:rStyle w:val="Hiperhivatkozs"/>
-            <w:noProof/>
-          </w:rPr>
-          <w:t>11.</w:t>
-        </w:r>
-        <w:r>
-          <w:rPr>
-            <w:rFonts w:asciiTheme="minorHAnsi" w:eastAsiaTheme="minorEastAsia" w:hAnsiTheme="minorHAnsi" w:cstheme="minorBidi"/>
-            <w:noProof/>
-            <w:lang w:eastAsia="hu-HU"/>
-          </w:rPr>
-          <w:tab/>
-        </w:r>
-        <w:r>
-          <w:rPr>
-            <w:rStyle w:val="Hiperhivatkozs"/>
-            <w:noProof/>
-          </w:rPr>
-          <w:t>Termékekkel kapcsolatos műveletek:</w:t>
-        </w:r>
-        <w:r>
-          <w:rPr>
-            <w:noProof/>
-            <w:webHidden/>
-          </w:rPr>
-          <w:tab/>
-        </w:r>
-        <w:r>
-          <w:rPr>
-            <w:noProof/>
-            <w:webHidden/>
-          </w:rPr>
-          <w:fldChar w:fldCharType="begin"/>
-        </w:r>
-        <w:r>
-          <w:rPr>
-            <w:noProof/>
-            <w:webHidden/>
-          </w:rPr>
-          <w:instrText xml:space="preserve"> PAGEREF _Toc224735094 \h </w:instrText>
-        </w:r>
-        <w:r>
-          <w:rPr>
-            <w:noProof/>
-            <w:webHidden/>
-          </w:rPr>
-        </w:r>
-        <w:r>
-          <w:rPr>
-            <w:noProof/>
-            <w:webHidden/>
-          </w:rPr>
-          <w:fldChar w:fldCharType="separate"/>
-        </w:r>
-        <w:r>
-          <w:rPr>
-            <w:noProof/>
-            <w:webHidden/>
-          </w:rPr>
-          <w:t>14</w:t>
-        </w:r>
-        <w:r>
-          <w:rPr>
-            <w:noProof/>
-            <w:webHidden/>
-          </w:rPr>
-          <w:fldChar w:fldCharType="end"/>
-        </w:r>
-      </w:hyperlink>
-    </w:p>
-    <w:p>
-      <w:pPr>
-        <w:pStyle w:val="TJ2"/>
-        <w:tabs>
-          <w:tab w:val="left" w:pos="1200"/>
-        </w:tabs>
-        <w:rPr>
-          <w:rFonts w:asciiTheme="minorHAnsi" w:eastAsiaTheme="minorEastAsia" w:hAnsiTheme="minorHAnsi" w:cstheme="minorBidi"/>
-          <w:noProof/>
-          <w:lang w:eastAsia="hu-HU"/>
-        </w:rPr>
-      </w:pPr>
-      <w:hyperlink w:anchor="_Toc224735095" w:history="1">
-        <w:r>
-          <w:rPr>
-            <w:rStyle w:val="Hiperhivatkozs"/>
-            <w:noProof/>
-          </w:rPr>
-          <w:t>11.1</w:t>
-        </w:r>
-        <w:r>
-          <w:rPr>
-            <w:rFonts w:asciiTheme="minorHAnsi" w:eastAsiaTheme="minorEastAsia" w:hAnsiTheme="minorHAnsi" w:cstheme="minorBidi"/>
-            <w:noProof/>
-            <w:lang w:eastAsia="hu-HU"/>
-          </w:rPr>
-          <w:tab/>
-        </w:r>
-        <w:r>
-          <w:rPr>
-            <w:rStyle w:val="Hiperhivatkozs"/>
-            <w:noProof/>
-          </w:rPr>
-          <w:t>Termékek lekérése:</w:t>
-        </w:r>
-        <w:r>
-          <w:rPr>
-            <w:noProof/>
-            <w:webHidden/>
-          </w:rPr>
-          <w:tab/>
-        </w:r>
-        <w:r>
-          <w:rPr>
-            <w:noProof/>
-            <w:webHidden/>
-          </w:rPr>
-          <w:fldChar w:fldCharType="begin"/>
-        </w:r>
-        <w:r>
-          <w:rPr>
-            <w:noProof/>
-            <w:webHidden/>
-          </w:rPr>
-          <w:instrText xml:space="preserve"> PAGEREF _Toc224735095 \h </w:instrText>
-        </w:r>
-        <w:r>
-          <w:rPr>
-            <w:noProof/>
-            <w:webHidden/>
-          </w:rPr>
-        </w:r>
-        <w:r>
-          <w:rPr>
-            <w:noProof/>
-            <w:webHidden/>
-          </w:rPr>
-          <w:fldChar w:fldCharType="separate"/>
-        </w:r>
-        <w:r>
-          <w:rPr>
-            <w:noProof/>
-            <w:webHidden/>
-          </w:rPr>
-          <w:t>14</w:t>
-        </w:r>
-        <w:r>
-          <w:rPr>
-            <w:noProof/>
-            <w:webHidden/>
-          </w:rPr>
-          <w:fldChar w:fldCharType="end"/>
-        </w:r>
-      </w:hyperlink>
-    </w:p>
-    <w:p>
-      <w:pPr>
-        <w:pStyle w:val="TJ2"/>
-        <w:tabs>
-          <w:tab w:val="left" w:pos="1200"/>
-        </w:tabs>
-        <w:rPr>
-          <w:rFonts w:asciiTheme="minorHAnsi" w:eastAsiaTheme="minorEastAsia" w:hAnsiTheme="minorHAnsi" w:cstheme="minorBidi"/>
-          <w:noProof/>
-          <w:lang w:eastAsia="hu-HU"/>
-        </w:rPr>
-      </w:pPr>
-      <w:hyperlink w:anchor="_Toc224735096" w:history="1">
-        <w:r>
-          <w:rPr>
-            <w:rStyle w:val="Hiperhivatkozs"/>
-            <w:noProof/>
-          </w:rPr>
-          <w:t>11.2</w:t>
-        </w:r>
-        <w:r>
-          <w:rPr>
-            <w:rFonts w:asciiTheme="minorHAnsi" w:eastAsiaTheme="minorEastAsia" w:hAnsiTheme="minorHAnsi" w:cstheme="minorBidi"/>
-            <w:noProof/>
-            <w:lang w:eastAsia="hu-HU"/>
-          </w:rPr>
-          <w:tab/>
-        </w:r>
-        <w:r>
-          <w:rPr>
-            <w:rStyle w:val="Hiperhivatkozs"/>
-            <w:noProof/>
-          </w:rPr>
-          <w:t>Termék frissítése:</w:t>
-        </w:r>
-        <w:r>
-          <w:rPr>
-            <w:noProof/>
-            <w:webHidden/>
-          </w:rPr>
-          <w:tab/>
-        </w:r>
-        <w:r>
-          <w:rPr>
-            <w:noProof/>
-            <w:webHidden/>
-          </w:rPr>
-          <w:fldChar w:fldCharType="begin"/>
-        </w:r>
-        <w:r>
-          <w:rPr>
-            <w:noProof/>
-            <w:webHidden/>
-          </w:rPr>
-          <w:instrText xml:space="preserve"> PAGEREF _Toc224735096 \h </w:instrText>
-        </w:r>
-        <w:r>
-          <w:rPr>
-            <w:noProof/>
-            <w:webHidden/>
-          </w:rPr>
-        </w:r>
-        <w:r>
-          <w:rPr>
-            <w:noProof/>
-            <w:webHidden/>
-          </w:rPr>
-          <w:fldChar w:fldCharType="separate"/>
-        </w:r>
-        <w:r>
-          <w:rPr>
-            <w:noProof/>
-            <w:webHidden/>
-          </w:rPr>
-          <w:t>15</w:t>
-        </w:r>
-        <w:r>
-          <w:rPr>
-            <w:noProof/>
-            <w:webHidden/>
-          </w:rPr>
-          <w:fldChar w:fldCharType="end"/>
-        </w:r>
-      </w:hyperlink>
-    </w:p>
-    <w:p>
-      <w:pPr>
-        <w:pStyle w:val="TJ2"/>
-        <w:tabs>
-          <w:tab w:val="left" w:pos="1200"/>
-        </w:tabs>
-        <w:rPr>
-          <w:rFonts w:asciiTheme="minorHAnsi" w:eastAsiaTheme="minorEastAsia" w:hAnsiTheme="minorHAnsi" w:cstheme="minorBidi"/>
-          <w:noProof/>
-          <w:lang w:eastAsia="hu-HU"/>
-        </w:rPr>
-      </w:pPr>
-      <w:hyperlink w:anchor="_Toc224735097" w:history="1">
-        <w:r>
-          <w:rPr>
-            <w:rStyle w:val="Hiperhivatkozs"/>
-            <w:noProof/>
-          </w:rPr>
-          <w:t>11.3</w:t>
-        </w:r>
-        <w:r>
-          <w:rPr>
-            <w:rFonts w:asciiTheme="minorHAnsi" w:eastAsiaTheme="minorEastAsia" w:hAnsiTheme="minorHAnsi" w:cstheme="minorBidi"/>
-            <w:noProof/>
-            <w:lang w:eastAsia="hu-HU"/>
-          </w:rPr>
-          <w:tab/>
-        </w:r>
-        <w:r>
-          <w:rPr>
-            <w:rStyle w:val="Hiperhivatkozs"/>
-            <w:noProof/>
-          </w:rPr>
-          <w:t>Új termék feltöltése:</w:t>
-        </w:r>
-        <w:r>
-          <w:rPr>
-            <w:noProof/>
-            <w:webHidden/>
-          </w:rPr>
-          <w:tab/>
-        </w:r>
-        <w:r>
-          <w:rPr>
-            <w:noProof/>
-            <w:webHidden/>
-          </w:rPr>
-          <w:fldChar w:fldCharType="begin"/>
-        </w:r>
-        <w:r>
-          <w:rPr>
-            <w:noProof/>
-            <w:webHidden/>
-          </w:rPr>
-          <w:instrText xml:space="preserve"> PAGEREF _Toc224735097 \h </w:instrText>
-        </w:r>
-        <w:r>
-          <w:rPr>
-            <w:noProof/>
-            <w:webHidden/>
-          </w:rPr>
-        </w:r>
-        <w:r>
-          <w:rPr>
-            <w:noProof/>
-            <w:webHidden/>
-          </w:rPr>
-          <w:fldChar w:fldCharType="separate"/>
-        </w:r>
-        <w:r>
-          <w:rPr>
-            <w:noProof/>
-            <w:webHidden/>
-          </w:rPr>
-          <w:t>17</w:t>
-        </w:r>
-        <w:r>
-          <w:rPr>
-            <w:noProof/>
-            <w:webHidden/>
-          </w:rPr>
-          <w:fldChar w:fldCharType="end"/>
-        </w:r>
-      </w:hyperlink>
-    </w:p>
-    <w:p>
-      <w:pPr>
-        <w:pStyle w:val="TJ2"/>
-        <w:tabs>
-          <w:tab w:val="left" w:pos="1200"/>
-        </w:tabs>
-        <w:rPr>
-          <w:rFonts w:asciiTheme="minorHAnsi" w:eastAsiaTheme="minorEastAsia" w:hAnsiTheme="minorHAnsi" w:cstheme="minorBidi"/>
-          <w:noProof/>
-          <w:lang w:eastAsia="hu-HU"/>
-        </w:rPr>
-      </w:pPr>
-      <w:hyperlink w:anchor="_Toc224735098" w:history="1">
-        <w:r>
-          <w:rPr>
-            <w:rStyle w:val="Hiperhivatkozs"/>
-            <w:noProof/>
-          </w:rPr>
-          <w:t>11.4</w:t>
-        </w:r>
-        <w:r>
-          <w:rPr>
-            <w:rFonts w:asciiTheme="minorHAnsi" w:eastAsiaTheme="minorEastAsia" w:hAnsiTheme="minorHAnsi" w:cstheme="minorBidi"/>
-            <w:noProof/>
-            <w:lang w:eastAsia="hu-HU"/>
-          </w:rPr>
-          <w:tab/>
-        </w:r>
-        <w:r>
-          <w:rPr>
-            <w:rStyle w:val="Hiperhivatkozs"/>
-            <w:noProof/>
-          </w:rPr>
-          <w:t>Termék törlése:</w:t>
-        </w:r>
-        <w:r>
-          <w:rPr>
-            <w:noProof/>
-            <w:webHidden/>
-          </w:rPr>
-          <w:tab/>
-        </w:r>
-        <w:r>
-          <w:rPr>
-            <w:noProof/>
-            <w:webHidden/>
-          </w:rPr>
-          <w:fldChar w:fldCharType="begin"/>
-        </w:r>
-        <w:r>
-          <w:rPr>
-            <w:noProof/>
-            <w:webHidden/>
-          </w:rPr>
-          <w:instrText xml:space="preserve"> PAGEREF _Toc224735098 \h </w:instrText>
-        </w:r>
-        <w:r>
-          <w:rPr>
-            <w:noProof/>
-            <w:webHidden/>
-          </w:rPr>
-        </w:r>
-        <w:r>
-          <w:rPr>
-            <w:noProof/>
-            <w:webHidden/>
-          </w:rPr>
-          <w:fldChar w:fldCharType="separate"/>
-        </w:r>
-        <w:r>
-          <w:rPr>
-            <w:noProof/>
-            <w:webHidden/>
-          </w:rPr>
-          <w:t>18</w:t>
-        </w:r>
-        <w:r>
-          <w:rPr>
-            <w:noProof/>
-            <w:webHidden/>
-          </w:rPr>
-          <w:fldChar w:fldCharType="end"/>
-        </w:r>
-      </w:hyperlink>
-    </w:p>
-    <w:p>
-      <w:pPr>
-        <w:pStyle w:val="TJ1"/>
-        <w:tabs>
-          <w:tab w:val="left" w:pos="720"/>
-        </w:tabs>
-        <w:rPr>
-          <w:rFonts w:asciiTheme="minorHAnsi" w:eastAsiaTheme="minorEastAsia" w:hAnsiTheme="minorHAnsi" w:cstheme="minorBidi"/>
-          <w:noProof/>
-          <w:lang w:eastAsia="hu-HU"/>
-        </w:rPr>
-      </w:pPr>
-      <w:hyperlink w:anchor="_Toc224735099" w:history="1">
-        <w:r>
-          <w:rPr>
-            <w:rStyle w:val="Hiperhivatkozs"/>
-            <w:noProof/>
-          </w:rPr>
-          <w:t>12.</w:t>
-        </w:r>
-        <w:r>
-          <w:rPr>
-            <w:rFonts w:asciiTheme="minorHAnsi" w:eastAsiaTheme="minorEastAsia" w:hAnsiTheme="minorHAnsi" w:cstheme="minorBidi"/>
-            <w:noProof/>
-            <w:lang w:eastAsia="hu-HU"/>
-          </w:rPr>
-          <w:tab/>
-        </w:r>
-        <w:r>
-          <w:rPr>
-            <w:rStyle w:val="Hiperhivatkozs"/>
-            <w:noProof/>
-          </w:rPr>
-          <w:t>Felhasználókkal kapcsolatos műveletek:</w:t>
-        </w:r>
-        <w:r>
-          <w:rPr>
-            <w:noProof/>
-            <w:webHidden/>
-          </w:rPr>
-          <w:tab/>
-        </w:r>
-        <w:r>
-          <w:rPr>
-            <w:noProof/>
-            <w:webHidden/>
-          </w:rPr>
-          <w:fldChar w:fldCharType="begin"/>
-        </w:r>
-        <w:r>
-          <w:rPr>
-            <w:noProof/>
-            <w:webHidden/>
-          </w:rPr>
-          <w:instrText xml:space="preserve"> PAGEREF _Toc224735099 \h </w:instrText>
-        </w:r>
-        <w:r>
-          <w:rPr>
-            <w:noProof/>
-            <w:webHidden/>
-          </w:rPr>
-        </w:r>
-        <w:r>
-          <w:rPr>
-            <w:noProof/>
-            <w:webHidden/>
-          </w:rPr>
-          <w:fldChar w:fldCharType="separate"/>
-        </w:r>
-        <w:r>
-          <w:rPr>
-            <w:noProof/>
-            <w:webHidden/>
-          </w:rPr>
-          <w:t>20</w:t>
-        </w:r>
-        <w:r>
-          <w:rPr>
-            <w:noProof/>
-            <w:webHidden/>
-          </w:rPr>
-          <w:fldChar w:fldCharType="end"/>
-        </w:r>
-      </w:hyperlink>
-    </w:p>
-    <w:p>
-      <w:pPr>
-        <w:pStyle w:val="TJ2"/>
-        <w:tabs>
-          <w:tab w:val="left" w:pos="1200"/>
-        </w:tabs>
-        <w:rPr>
-          <w:rFonts w:asciiTheme="minorHAnsi" w:eastAsiaTheme="minorEastAsia" w:hAnsiTheme="minorHAnsi" w:cstheme="minorBidi"/>
-          <w:noProof/>
-          <w:lang w:eastAsia="hu-HU"/>
-        </w:rPr>
-      </w:pPr>
-      <w:hyperlink w:anchor="_Toc224735100" w:history="1">
-        <w:r>
-          <w:rPr>
-            <w:rStyle w:val="Hiperhivatkozs"/>
-            <w:noProof/>
-          </w:rPr>
-          <w:t>12.1</w:t>
-        </w:r>
-        <w:r>
-          <w:rPr>
-            <w:rFonts w:asciiTheme="minorHAnsi" w:eastAsiaTheme="minorEastAsia" w:hAnsiTheme="minorHAnsi" w:cstheme="minorBidi"/>
-            <w:noProof/>
-            <w:lang w:eastAsia="hu-HU"/>
-          </w:rPr>
-          <w:tab/>
-        </w:r>
-        <w:r>
-          <w:rPr>
-            <w:rStyle w:val="Hiperhivatkozs"/>
-            <w:noProof/>
-          </w:rPr>
-          <w:t>Látogatók adatainak lekérése:</w:t>
-        </w:r>
-        <w:r>
-          <w:rPr>
-            <w:noProof/>
-            <w:webHidden/>
-          </w:rPr>
-          <w:tab/>
-        </w:r>
-        <w:r>
-          <w:rPr>
-            <w:noProof/>
-            <w:webHidden/>
-          </w:rPr>
-          <w:fldChar w:fldCharType="begin"/>
-        </w:r>
-        <w:r>
-          <w:rPr>
-            <w:noProof/>
-            <w:webHidden/>
-          </w:rPr>
-          <w:instrText xml:space="preserve"> PAGEREF _Toc224735100 \h </w:instrText>
-        </w:r>
-        <w:r>
-          <w:rPr>
-            <w:noProof/>
-            <w:webHidden/>
-          </w:rPr>
-        </w:r>
-        <w:r>
-          <w:rPr>
-            <w:noProof/>
-            <w:webHidden/>
-          </w:rPr>
-          <w:fldChar w:fldCharType="separate"/>
-        </w:r>
-        <w:r>
-          <w:rPr>
-            <w:noProof/>
-            <w:webHidden/>
-          </w:rPr>
-          <w:t>20</w:t>
-        </w:r>
-        <w:r>
-          <w:rPr>
-            <w:noProof/>
-            <w:webHidden/>
-          </w:rPr>
-          <w:fldChar w:fldCharType="end"/>
-        </w:r>
-      </w:hyperlink>
-    </w:p>
-    <w:p>
-      <w:pPr>
-        <w:pStyle w:val="TJ2"/>
-        <w:tabs>
-          <w:tab w:val="left" w:pos="1200"/>
-        </w:tabs>
-        <w:rPr>
-          <w:rFonts w:asciiTheme="minorHAnsi" w:eastAsiaTheme="minorEastAsia" w:hAnsiTheme="minorHAnsi" w:cstheme="minorBidi"/>
-          <w:noProof/>
-          <w:lang w:eastAsia="hu-HU"/>
-        </w:rPr>
-      </w:pPr>
-      <w:hyperlink w:anchor="_Toc224735101" w:history="1">
-        <w:r>
-          <w:rPr>
-            <w:rStyle w:val="Hiperhivatkozs"/>
-            <w:noProof/>
-          </w:rPr>
-          <w:t>12.2</w:t>
-        </w:r>
-        <w:r>
-          <w:rPr>
-            <w:rFonts w:asciiTheme="minorHAnsi" w:eastAsiaTheme="minorEastAsia" w:hAnsiTheme="minorHAnsi" w:cstheme="minorBidi"/>
-            <w:noProof/>
-            <w:lang w:eastAsia="hu-HU"/>
-          </w:rPr>
-          <w:tab/>
-        </w:r>
-        <w:r>
-          <w:rPr>
-            <w:rStyle w:val="Hiperhivatkozs"/>
-            <w:noProof/>
-          </w:rPr>
-          <w:t>Látogató törlése:</w:t>
-        </w:r>
-        <w:r>
-          <w:rPr>
-            <w:noProof/>
-            <w:webHidden/>
-          </w:rPr>
-          <w:tab/>
-        </w:r>
-        <w:r>
-          <w:rPr>
-            <w:noProof/>
-            <w:webHidden/>
-          </w:rPr>
-          <w:fldChar w:fldCharType="begin"/>
-        </w:r>
-        <w:r>
-          <w:rPr>
-            <w:noProof/>
-            <w:webHidden/>
-          </w:rPr>
-          <w:instrText xml:space="preserve"> PAGEREF _Toc224735101 \h </w:instrText>
-        </w:r>
-        <w:r>
-          <w:rPr>
-            <w:noProof/>
-            <w:webHidden/>
-          </w:rPr>
-        </w:r>
-        <w:r>
-          <w:rPr>
-            <w:noProof/>
-            <w:webHidden/>
-          </w:rPr>
-          <w:fldChar w:fldCharType="separate"/>
-        </w:r>
-        <w:r>
-          <w:rPr>
-            <w:noProof/>
-            <w:webHidden/>
-          </w:rPr>
-          <w:t>20</w:t>
-        </w:r>
-        <w:r>
-          <w:rPr>
-            <w:noProof/>
-            <w:webHidden/>
-          </w:rPr>
-          <w:fldChar w:fldCharType="end"/>
-        </w:r>
-      </w:hyperlink>
-    </w:p>
-    <w:p>
-      <w:pPr>
-        <w:pStyle w:val="TJ1"/>
-        <w:tabs>
-          <w:tab w:val="left" w:pos="720"/>
-        </w:tabs>
-        <w:rPr>
-          <w:rFonts w:asciiTheme="minorHAnsi" w:eastAsiaTheme="minorEastAsia" w:hAnsiTheme="minorHAnsi" w:cstheme="minorBidi"/>
-          <w:noProof/>
-          <w:lang w:eastAsia="hu-HU"/>
-        </w:rPr>
-      </w:pPr>
-      <w:hyperlink w:anchor="_Toc224735102" w:history="1">
-        <w:r>
-          <w:rPr>
-            <w:rStyle w:val="Hiperhivatkozs"/>
-            <w:noProof/>
-          </w:rPr>
-          <w:t>13.</w:t>
-        </w:r>
-        <w:r>
-          <w:rPr>
-            <w:rFonts w:asciiTheme="minorHAnsi" w:eastAsiaTheme="minorEastAsia" w:hAnsiTheme="minorHAnsi" w:cstheme="minorBidi"/>
-            <w:noProof/>
-            <w:lang w:eastAsia="hu-HU"/>
-          </w:rPr>
-          <w:tab/>
-        </w:r>
-        <w:r>
-          <w:rPr>
-            <w:rStyle w:val="Hiperhivatkozs"/>
-            <w:noProof/>
-          </w:rPr>
-          <w:t>Megrendelésekkel kapcsolatos műveletek:</w:t>
-        </w:r>
-        <w:r>
-          <w:rPr>
-            <w:noProof/>
-            <w:webHidden/>
-          </w:rPr>
-          <w:tab/>
-        </w:r>
-        <w:r>
-          <w:rPr>
-            <w:noProof/>
-            <w:webHidden/>
-          </w:rPr>
-          <w:fldChar w:fldCharType="begin"/>
-        </w:r>
-        <w:r>
-          <w:rPr>
-            <w:noProof/>
-            <w:webHidden/>
-          </w:rPr>
-          <w:instrText xml:space="preserve"> PAGEREF _Toc224735102 \h </w:instrText>
-        </w:r>
-        <w:r>
-          <w:rPr>
-            <w:noProof/>
-            <w:webHidden/>
-          </w:rPr>
-        </w:r>
-        <w:r>
-          <w:rPr>
-            <w:noProof/>
-            <w:webHidden/>
-          </w:rPr>
-          <w:fldChar w:fldCharType="separate"/>
-        </w:r>
-        <w:r>
-          <w:rPr>
-            <w:noProof/>
-            <w:webHidden/>
-          </w:rPr>
-          <w:t>22</w:t>
-        </w:r>
-        <w:r>
-          <w:rPr>
-            <w:noProof/>
-            <w:webHidden/>
-          </w:rPr>
-          <w:fldChar w:fldCharType="end"/>
-        </w:r>
-      </w:hyperlink>
-    </w:p>
-    <w:p>
-      <w:pPr>
-        <w:pStyle w:val="TJ2"/>
-        <w:tabs>
-          <w:tab w:val="left" w:pos="1200"/>
-        </w:tabs>
-        <w:rPr>
-          <w:rFonts w:asciiTheme="minorHAnsi" w:eastAsiaTheme="minorEastAsia" w:hAnsiTheme="minorHAnsi" w:cstheme="minorBidi"/>
-          <w:noProof/>
-          <w:lang w:eastAsia="hu-HU"/>
-        </w:rPr>
-      </w:pPr>
-      <w:hyperlink w:anchor="_Toc224735103" w:history="1">
-        <w:r>
-          <w:rPr>
-            <w:rStyle w:val="Hiperhivatkozs"/>
-            <w:noProof/>
-          </w:rPr>
-          <w:t>13.1</w:t>
-        </w:r>
-        <w:r>
-          <w:rPr>
-            <w:rFonts w:asciiTheme="minorHAnsi" w:eastAsiaTheme="minorEastAsia" w:hAnsiTheme="minorHAnsi" w:cstheme="minorBidi"/>
-            <w:noProof/>
-            <w:lang w:eastAsia="hu-HU"/>
-          </w:rPr>
-          <w:tab/>
-        </w:r>
-        <w:r>
-          <w:rPr>
-            <w:rStyle w:val="Hiperhivatkozs"/>
-            <w:noProof/>
-          </w:rPr>
-          <w:t>Megrendelések lekérése:</w:t>
-        </w:r>
-        <w:r>
-          <w:rPr>
-            <w:noProof/>
-            <w:webHidden/>
-          </w:rPr>
-          <w:tab/>
-        </w:r>
-        <w:r>
-          <w:rPr>
-            <w:noProof/>
-            <w:webHidden/>
-          </w:rPr>
-          <w:fldChar w:fldCharType="begin"/>
-        </w:r>
-        <w:r>
-          <w:rPr>
-            <w:noProof/>
-            <w:webHidden/>
-          </w:rPr>
-          <w:instrText xml:space="preserve"> PAGEREF _Toc224735103 \h </w:instrText>
-        </w:r>
-        <w:r>
-          <w:rPr>
-            <w:noProof/>
-            <w:webHidden/>
-          </w:rPr>
-        </w:r>
-        <w:r>
-          <w:rPr>
-            <w:noProof/>
-            <w:webHidden/>
-          </w:rPr>
-          <w:fldChar w:fldCharType="separate"/>
-        </w:r>
-        <w:r>
-          <w:rPr>
-            <w:noProof/>
-            <w:webHidden/>
-          </w:rPr>
-          <w:t>22</w:t>
-        </w:r>
-        <w:r>
-          <w:rPr>
-            <w:noProof/>
-            <w:webHidden/>
-          </w:rPr>
-          <w:fldChar w:fldCharType="end"/>
-        </w:r>
-      </w:hyperlink>
-    </w:p>
-    <w:p>
-      <w:pPr>
-        <w:pStyle w:val="TJ2"/>
-        <w:tabs>
-          <w:tab w:val="left" w:pos="1200"/>
-        </w:tabs>
-        <w:rPr>
-          <w:rFonts w:asciiTheme="minorHAnsi" w:eastAsiaTheme="minorEastAsia" w:hAnsiTheme="minorHAnsi" w:cstheme="minorBidi"/>
-          <w:noProof/>
-          <w:lang w:eastAsia="hu-HU"/>
-        </w:rPr>
-      </w:pPr>
-      <w:hyperlink w:anchor="_Toc224735104" w:history="1">
-        <w:r>
-          <w:rPr>
-            <w:rStyle w:val="Hiperhivatkozs"/>
-            <w:noProof/>
-          </w:rPr>
-          <w:t>13.2</w:t>
-        </w:r>
-        <w:r>
-          <w:rPr>
-            <w:rFonts w:asciiTheme="minorHAnsi" w:eastAsiaTheme="minorEastAsia" w:hAnsiTheme="minorHAnsi" w:cstheme="minorBidi"/>
-            <w:noProof/>
-            <w:lang w:eastAsia="hu-HU"/>
-          </w:rPr>
-          <w:tab/>
-        </w:r>
-        <w:r>
-          <w:rPr>
-            <w:rStyle w:val="Hiperhivatkozs"/>
-            <w:noProof/>
-          </w:rPr>
-          <w:t>Megrendelés állapotának módosítása:</w:t>
-        </w:r>
-        <w:r>
-          <w:rPr>
-            <w:noProof/>
-            <w:webHidden/>
-          </w:rPr>
-          <w:tab/>
-        </w:r>
-        <w:r>
-          <w:rPr>
-            <w:noProof/>
-            <w:webHidden/>
-          </w:rPr>
-          <w:fldChar w:fldCharType="begin"/>
-        </w:r>
-        <w:r>
-          <w:rPr>
-            <w:noProof/>
-            <w:webHidden/>
-          </w:rPr>
-          <w:instrText xml:space="preserve"> PAGEREF _Toc224735104 \h </w:instrText>
-        </w:r>
-        <w:r>
-          <w:rPr>
-            <w:noProof/>
-            <w:webHidden/>
-          </w:rPr>
-        </w:r>
-        <w:r>
-          <w:rPr>
-            <w:noProof/>
-            <w:webHidden/>
-          </w:rPr>
-          <w:fldChar w:fldCharType="separate"/>
-        </w:r>
-        <w:r>
-          <w:rPr>
-            <w:noProof/>
-            <w:webHidden/>
-          </w:rPr>
-          <w:t>23</w:t>
-        </w:r>
-        <w:r>
-          <w:rPr>
-            <w:noProof/>
-            <w:webHidden/>
-          </w:rPr>
-          <w:fldChar w:fldCharType="end"/>
-        </w:r>
-      </w:hyperlink>
-    </w:p>
-    <w:p>
-      <w:pPr>
-        <w:pStyle w:val="TJ2"/>
-        <w:tabs>
-          <w:tab w:val="left" w:pos="1200"/>
-        </w:tabs>
-        <w:rPr>
-          <w:rFonts w:asciiTheme="minorHAnsi" w:eastAsiaTheme="minorEastAsia" w:hAnsiTheme="minorHAnsi" w:cstheme="minorBidi"/>
-          <w:noProof/>
-          <w:lang w:eastAsia="hu-HU"/>
-        </w:rPr>
-      </w:pPr>
-      <w:hyperlink w:anchor="_Toc224735105" w:history="1">
-        <w:r>
-          <w:rPr>
-            <w:rStyle w:val="Hiperhivatkozs"/>
-            <w:noProof/>
-          </w:rPr>
-          <w:t>13.3</w:t>
-        </w:r>
-        <w:r>
-          <w:rPr>
-            <w:rFonts w:asciiTheme="minorHAnsi" w:eastAsiaTheme="minorEastAsia" w:hAnsiTheme="minorHAnsi" w:cstheme="minorBidi"/>
-            <w:noProof/>
-            <w:lang w:eastAsia="hu-HU"/>
-          </w:rPr>
-          <w:tab/>
-        </w:r>
-        <w:r>
-          <w:rPr>
-            <w:rStyle w:val="Hiperhivatkozs"/>
-            <w:noProof/>
-          </w:rPr>
-          <w:t>Rendelés törlése:</w:t>
-        </w:r>
-        <w:r>
-          <w:rPr>
-            <w:noProof/>
-            <w:webHidden/>
-          </w:rPr>
-          <w:tab/>
-        </w:r>
-        <w:r>
-          <w:rPr>
-            <w:noProof/>
-            <w:webHidden/>
-          </w:rPr>
-          <w:fldChar w:fldCharType="begin"/>
-        </w:r>
-        <w:r>
-          <w:rPr>
-            <w:noProof/>
-            <w:webHidden/>
-          </w:rPr>
-          <w:instrText xml:space="preserve"> PAGEREF _Toc224735105 \h </w:instrText>
-        </w:r>
-        <w:r>
-          <w:rPr>
-            <w:noProof/>
-            <w:webHidden/>
-          </w:rPr>
-        </w:r>
-        <w:r>
-          <w:rPr>
-            <w:noProof/>
-            <w:webHidden/>
-          </w:rPr>
-          <w:fldChar w:fldCharType="separate"/>
-        </w:r>
-        <w:r>
-          <w:rPr>
-            <w:noProof/>
-            <w:webHidden/>
-          </w:rPr>
-          <w:t>24</w:t>
-        </w:r>
-        <w:r>
-          <w:rPr>
-            <w:noProof/>
-            <w:webHidden/>
-          </w:rPr>
-          <w:fldChar w:fldCharType="end"/>
-        </w:r>
-      </w:hyperlink>
-    </w:p>
-    <w:p>
-      <w:pPr>
-        <w:pStyle w:val="TJ1"/>
-        <w:tabs>
-          <w:tab w:val="left" w:pos="720"/>
-        </w:tabs>
-        <w:rPr>
-          <w:rFonts w:asciiTheme="minorHAnsi" w:eastAsiaTheme="minorEastAsia" w:hAnsiTheme="minorHAnsi" w:cstheme="minorBidi"/>
-          <w:noProof/>
-          <w:lang w:eastAsia="hu-HU"/>
-        </w:rPr>
-      </w:pPr>
-      <w:hyperlink w:anchor="_Toc224735106" w:history="1">
-        <w:r>
-          <w:rPr>
-            <w:rStyle w:val="Hiperhivatkozs"/>
-            <w:noProof/>
-          </w:rPr>
-          <w:t>14.</w:t>
-        </w:r>
-        <w:r>
-          <w:rPr>
-            <w:rFonts w:asciiTheme="minorHAnsi" w:eastAsiaTheme="minorEastAsia" w:hAnsiTheme="minorHAnsi" w:cstheme="minorBidi"/>
-            <w:noProof/>
-            <w:lang w:eastAsia="hu-HU"/>
-          </w:rPr>
-          <w:tab/>
-        </w:r>
-        <w:r>
-          <w:rPr>
-            <w:rStyle w:val="Hiperhivatkozs"/>
-            <w:noProof/>
-          </w:rPr>
-          <w:t>Időpontfoglalással(szerviz) kapcsolatos műveletek:</w:t>
-        </w:r>
-        <w:r>
-          <w:rPr>
-            <w:noProof/>
-            <w:webHidden/>
-          </w:rPr>
-          <w:tab/>
-        </w:r>
-        <w:r>
-          <w:rPr>
-            <w:noProof/>
-            <w:webHidden/>
-          </w:rPr>
-          <w:fldChar w:fldCharType="begin"/>
-        </w:r>
-        <w:r>
-          <w:rPr>
-            <w:noProof/>
-            <w:webHidden/>
-          </w:rPr>
-          <w:instrText xml:space="preserve"> PAGEREF _Toc224735106 \h </w:instrText>
-        </w:r>
-        <w:r>
-          <w:rPr>
-            <w:noProof/>
-            <w:webHidden/>
-          </w:rPr>
-        </w:r>
-        <w:r>
-          <w:rPr>
-            <w:noProof/>
-            <w:webHidden/>
-          </w:rPr>
-          <w:fldChar w:fldCharType="separate"/>
-        </w:r>
-        <w:r>
-          <w:rPr>
-            <w:noProof/>
-            <w:webHidden/>
-          </w:rPr>
-          <w:t>25</w:t>
-        </w:r>
-        <w:r>
-          <w:rPr>
-            <w:noProof/>
-            <w:webHidden/>
-          </w:rPr>
-          <w:fldChar w:fldCharType="end"/>
-        </w:r>
-      </w:hyperlink>
-    </w:p>
-    <w:p>
-      <w:pPr>
-        <w:pStyle w:val="TJ2"/>
-        <w:tabs>
-          <w:tab w:val="left" w:pos="1200"/>
-        </w:tabs>
-        <w:rPr>
-          <w:rFonts w:asciiTheme="minorHAnsi" w:eastAsiaTheme="minorEastAsia" w:hAnsiTheme="minorHAnsi" w:cstheme="minorBidi"/>
-          <w:noProof/>
-          <w:lang w:eastAsia="hu-HU"/>
-        </w:rPr>
-      </w:pPr>
-      <w:hyperlink w:anchor="_Toc224735107" w:history="1">
-        <w:r>
-          <w:rPr>
-            <w:rStyle w:val="Hiperhivatkozs"/>
-            <w:noProof/>
-          </w:rPr>
-          <w:t>14.1</w:t>
-        </w:r>
-        <w:r>
-          <w:rPr>
-            <w:rFonts w:asciiTheme="minorHAnsi" w:eastAsiaTheme="minorEastAsia" w:hAnsiTheme="minorHAnsi" w:cstheme="minorBidi"/>
-            <w:noProof/>
-            <w:lang w:eastAsia="hu-HU"/>
-          </w:rPr>
-          <w:tab/>
-        </w:r>
-        <w:r>
-          <w:rPr>
-            <w:rStyle w:val="Hiperhivatkozs"/>
-            <w:noProof/>
-          </w:rPr>
-          <w:t>Időpontfoglalások lekérése:</w:t>
-        </w:r>
-        <w:r>
-          <w:rPr>
-            <w:noProof/>
-            <w:webHidden/>
-          </w:rPr>
-          <w:tab/>
-        </w:r>
-        <w:r>
-          <w:rPr>
-            <w:noProof/>
-            <w:webHidden/>
-          </w:rPr>
-          <w:fldChar w:fldCharType="begin"/>
-        </w:r>
-        <w:r>
-          <w:rPr>
-            <w:noProof/>
-            <w:webHidden/>
-          </w:rPr>
-          <w:instrText xml:space="preserve"> PAGEREF _Toc224735107 \h </w:instrText>
-        </w:r>
-        <w:r>
-          <w:rPr>
-            <w:noProof/>
-            <w:webHidden/>
-          </w:rPr>
-        </w:r>
-        <w:r>
-          <w:rPr>
-            <w:noProof/>
-            <w:webHidden/>
-          </w:rPr>
-          <w:fldChar w:fldCharType="separate"/>
-        </w:r>
-        <w:r>
-          <w:rPr>
-            <w:noProof/>
-            <w:webHidden/>
-          </w:rPr>
-          <w:t>25</w:t>
-        </w:r>
-        <w:r>
-          <w:rPr>
-            <w:noProof/>
-            <w:webHidden/>
-          </w:rPr>
-          <w:fldChar w:fldCharType="end"/>
-        </w:r>
-      </w:hyperlink>
-    </w:p>
-    <w:p>
-      <w:pPr>
-        <w:pStyle w:val="TJ2"/>
-        <w:tabs>
-          <w:tab w:val="left" w:pos="1200"/>
-        </w:tabs>
-        <w:rPr>
-          <w:rFonts w:asciiTheme="minorHAnsi" w:eastAsiaTheme="minorEastAsia" w:hAnsiTheme="minorHAnsi" w:cstheme="minorBidi"/>
-          <w:noProof/>
-          <w:lang w:eastAsia="hu-HU"/>
-        </w:rPr>
-      </w:pPr>
-      <w:hyperlink w:anchor="_Toc224735108" w:history="1">
-        <w:r>
-          <w:rPr>
-            <w:rStyle w:val="Hiperhivatkozs"/>
-            <w:noProof/>
-          </w:rPr>
-          <w:t>14.2</w:t>
-        </w:r>
-        <w:r>
-          <w:rPr>
-            <w:rFonts w:asciiTheme="minorHAnsi" w:eastAsiaTheme="minorEastAsia" w:hAnsiTheme="minorHAnsi" w:cstheme="minorBidi"/>
-            <w:noProof/>
-            <w:lang w:eastAsia="hu-HU"/>
-          </w:rPr>
-          <w:tab/>
-        </w:r>
-        <w:r>
-          <w:rPr>
-            <w:rStyle w:val="Hiperhivatkozs"/>
-            <w:noProof/>
-          </w:rPr>
-          <w:t>Időpontfoglalás adatainak módosítása:</w:t>
-        </w:r>
-        <w:r>
-          <w:rPr>
-            <w:noProof/>
-            <w:webHidden/>
-          </w:rPr>
-          <w:tab/>
-        </w:r>
-        <w:r>
-          <w:rPr>
-            <w:noProof/>
-            <w:webHidden/>
-          </w:rPr>
-          <w:fldChar w:fldCharType="begin"/>
-        </w:r>
-        <w:r>
-          <w:rPr>
-            <w:noProof/>
-            <w:webHidden/>
-          </w:rPr>
-          <w:instrText xml:space="preserve"> PAGEREF _Toc224735108 \h </w:instrText>
-        </w:r>
-        <w:r>
-          <w:rPr>
-            <w:noProof/>
-            <w:webHidden/>
-          </w:rPr>
-        </w:r>
-        <w:r>
-          <w:rPr>
-            <w:noProof/>
-            <w:webHidden/>
-          </w:rPr>
-          <w:fldChar w:fldCharType="separate"/>
-        </w:r>
-        <w:r>
-          <w:rPr>
-            <w:noProof/>
-            <w:webHidden/>
-          </w:rPr>
-          <w:t>26</w:t>
-        </w:r>
-        <w:r>
-          <w:rPr>
-            <w:noProof/>
-            <w:webHidden/>
-          </w:rPr>
-          <w:fldChar w:fldCharType="end"/>
-        </w:r>
-      </w:hyperlink>
-    </w:p>
-    <w:p>
-      <w:pPr>
-        <w:pStyle w:val="TJ2"/>
-        <w:tabs>
-          <w:tab w:val="left" w:pos="1200"/>
-        </w:tabs>
-        <w:rPr>
-          <w:rFonts w:asciiTheme="minorHAnsi" w:eastAsiaTheme="minorEastAsia" w:hAnsiTheme="minorHAnsi" w:cstheme="minorBidi"/>
-          <w:noProof/>
-          <w:lang w:eastAsia="hu-HU"/>
-        </w:rPr>
-      </w:pPr>
-      <w:hyperlink w:anchor="_Toc224735109" w:history="1">
-        <w:r>
-          <w:rPr>
-            <w:rStyle w:val="Hiperhivatkozs"/>
-            <w:noProof/>
-          </w:rPr>
-          <w:t>14.3</w:t>
-        </w:r>
-        <w:r>
-          <w:rPr>
-            <w:rFonts w:asciiTheme="minorHAnsi" w:eastAsiaTheme="minorEastAsia" w:hAnsiTheme="minorHAnsi" w:cstheme="minorBidi"/>
-            <w:noProof/>
-            <w:lang w:eastAsia="hu-HU"/>
-          </w:rPr>
-          <w:tab/>
-        </w:r>
-        <w:r>
-          <w:rPr>
-            <w:rStyle w:val="Hiperhivatkozs"/>
-            <w:noProof/>
-          </w:rPr>
-          <w:t>Időpont törlése:</w:t>
-        </w:r>
-        <w:r>
-          <w:rPr>
-            <w:noProof/>
-            <w:webHidden/>
-          </w:rPr>
-          <w:tab/>
-        </w:r>
-        <w:r>
-          <w:rPr>
-            <w:noProof/>
-            <w:webHidden/>
-          </w:rPr>
-          <w:fldChar w:fldCharType="begin"/>
-        </w:r>
-        <w:r>
-          <w:rPr>
-            <w:noProof/>
-            <w:webHidden/>
-          </w:rPr>
-          <w:instrText xml:space="preserve"> PAGEREF _Toc224735109 \h </w:instrText>
-        </w:r>
-        <w:r>
-          <w:rPr>
-            <w:noProof/>
-            <w:webHidden/>
-          </w:rPr>
-        </w:r>
-        <w:r>
-          <w:rPr>
-            <w:noProof/>
-            <w:webHidden/>
-          </w:rPr>
-          <w:fldChar w:fldCharType="separate"/>
-        </w:r>
-        <w:r>
-          <w:rPr>
-            <w:noProof/>
-            <w:webHidden/>
-          </w:rPr>
-          <w:t>27</w:t>
-        </w:r>
-        <w:r>
-          <w:rPr>
-            <w:noProof/>
-            <w:webHidden/>
-          </w:rPr>
-          <w:fldChar w:fldCharType="end"/>
-        </w:r>
-      </w:hyperlink>
-    </w:p>
-    <w:p>
-      <w:pPr>
-        <w:pStyle w:val="TJ2"/>
-        <w:tabs>
-          <w:tab w:val="left" w:pos="1200"/>
-        </w:tabs>
-        <w:rPr>
-          <w:rFonts w:asciiTheme="minorHAnsi" w:eastAsiaTheme="minorEastAsia" w:hAnsiTheme="minorHAnsi" w:cstheme="minorBidi"/>
-          <w:noProof/>
-          <w:lang w:eastAsia="hu-HU"/>
-        </w:rPr>
-      </w:pPr>
-      <w:hyperlink w:anchor="_Toc224735110" w:history="1">
-        <w:r>
-          <w:rPr>
-            <w:rStyle w:val="Hiperhivatkozs"/>
-            <w:noProof/>
-          </w:rPr>
-          <w:t>14.4</w:t>
-        </w:r>
-        <w:r>
-          <w:rPr>
-            <w:rFonts w:asciiTheme="minorHAnsi" w:eastAsiaTheme="minorEastAsia" w:hAnsiTheme="minorHAnsi" w:cstheme="minorBidi"/>
-            <w:noProof/>
-            <w:lang w:eastAsia="hu-HU"/>
-          </w:rPr>
-          <w:tab/>
-        </w:r>
-        <w:r>
-          <w:rPr>
-            <w:rStyle w:val="Hiperhivatkozs"/>
-            <w:noProof/>
-          </w:rPr>
-          <w:t>Időpont lekérése:</w:t>
-        </w:r>
-        <w:r>
-          <w:rPr>
-            <w:noProof/>
-            <w:webHidden/>
-          </w:rPr>
-          <w:tab/>
-        </w:r>
-        <w:r>
-          <w:rPr>
-            <w:noProof/>
-            <w:webHidden/>
-          </w:rPr>
-          <w:fldChar w:fldCharType="begin"/>
-        </w:r>
-        <w:r>
-          <w:rPr>
-            <w:noProof/>
-            <w:webHidden/>
-          </w:rPr>
-          <w:instrText xml:space="preserve"> PAGEREF _Toc224735110 \h </w:instrText>
-        </w:r>
-        <w:r>
-          <w:rPr>
-            <w:noProof/>
-            <w:webHidden/>
-          </w:rPr>
-        </w:r>
-        <w:r>
-          <w:rPr>
-            <w:noProof/>
-            <w:webHidden/>
-          </w:rPr>
-          <w:fldChar w:fldCharType="separate"/>
-        </w:r>
-        <w:r>
-          <w:rPr>
-            <w:noProof/>
-            <w:webHidden/>
-          </w:rPr>
-          <w:t>28</w:t>
-        </w:r>
-        <w:r>
-          <w:rPr>
-            <w:noProof/>
-            <w:webHidden/>
-          </w:rPr>
-          <w:fldChar w:fldCharType="end"/>
-        </w:r>
-      </w:hyperlink>
-    </w:p>
-    <w:p>
-      <w:pPr>
-        <w:pStyle w:val="TJ2"/>
-        <w:tabs>
-          <w:tab w:val="left" w:pos="1200"/>
-        </w:tabs>
-        <w:rPr>
-          <w:rFonts w:asciiTheme="minorHAnsi" w:eastAsiaTheme="minorEastAsia" w:hAnsiTheme="minorHAnsi" w:cstheme="minorBidi"/>
-          <w:noProof/>
-          <w:lang w:eastAsia="hu-HU"/>
-        </w:rPr>
-      </w:pPr>
-      <w:hyperlink w:anchor="_Toc224735111" w:history="1">
-        <w:r>
-          <w:rPr>
-            <w:rStyle w:val="Hiperhivatkozs"/>
-            <w:noProof/>
-          </w:rPr>
-          <w:t>14.5</w:t>
-        </w:r>
-        <w:r>
-          <w:rPr>
-            <w:rFonts w:asciiTheme="minorHAnsi" w:eastAsiaTheme="minorEastAsia" w:hAnsiTheme="minorHAnsi" w:cstheme="minorBidi"/>
-            <w:noProof/>
-            <w:lang w:eastAsia="hu-HU"/>
-          </w:rPr>
-          <w:tab/>
-        </w:r>
-        <w:r>
-          <w:rPr>
-            <w:rStyle w:val="Hiperhivatkozs"/>
-            <w:noProof/>
-          </w:rPr>
-          <w:t>Új szabad szervizidőpont hozzáadása:</w:t>
-        </w:r>
-        <w:r>
-          <w:rPr>
-            <w:noProof/>
-            <w:webHidden/>
-          </w:rPr>
-          <w:tab/>
-        </w:r>
-        <w:r>
-          <w:rPr>
-            <w:noProof/>
-            <w:webHidden/>
-          </w:rPr>
-          <w:fldChar w:fldCharType="begin"/>
-        </w:r>
-        <w:r>
-          <w:rPr>
-            <w:noProof/>
-            <w:webHidden/>
-          </w:rPr>
-          <w:instrText xml:space="preserve"> PAGEREF _Toc224735111 \h </w:instrText>
-        </w:r>
-        <w:r>
-          <w:rPr>
-            <w:noProof/>
-            <w:webHidden/>
-          </w:rPr>
-        </w:r>
-        <w:r>
-          <w:rPr>
-            <w:noProof/>
-            <w:webHidden/>
-          </w:rPr>
-          <w:fldChar w:fldCharType="separate"/>
-        </w:r>
-        <w:r>
-          <w:rPr>
-            <w:noProof/>
-            <w:webHidden/>
-          </w:rPr>
-          <w:t>29</w:t>
-        </w:r>
-        <w:r>
-          <w:rPr>
-            <w:noProof/>
-            <w:webHidden/>
-          </w:rPr>
-          <w:fldChar w:fldCharType="end"/>
-        </w:r>
-      </w:hyperlink>
-    </w:p>
-    <w:p>
-      <w:r>
-        <w:fldChar w:fldCharType="end"/>
-      </w:r>
-    </w:p>
-    <w:p>
-      <w:pPr>
-        <w:spacing w:after="0"/>
-      </w:pPr>
-      <w:r>
-        <w:br w:type="page"/>
-      </w:r>
-    </w:p>
     <w:p>
       <w:pPr>
         <w:pStyle w:val="Cmsor2"/>
         <w:numPr>
           <w:ilvl w:val="0"/>
-          <w:numId w:val="15"/>
+          <w:numId w:val="34"/>
         </w:numPr>
       </w:pPr>
       <w:bookmarkStart w:id="124" w:name="_Toc224735084"/>
@@ -19173,7 +16738,7 @@
         <w:pStyle w:val="Cmsor2"/>
         <w:numPr>
           <w:ilvl w:val="0"/>
-          <w:numId w:val="15"/>
+          <w:numId w:val="34"/>
         </w:numPr>
       </w:pPr>
       <w:bookmarkStart w:id="128" w:name="_Toc224735085"/>
@@ -19738,7 +17303,7 @@
         <w:pStyle w:val="Cmsor2"/>
         <w:numPr>
           <w:ilvl w:val="0"/>
-          <w:numId w:val="15"/>
+          <w:numId w:val="34"/>
         </w:numPr>
       </w:pPr>
       <w:bookmarkStart w:id="132" w:name="_Toc224735088"/>
@@ -20418,7 +17983,7 @@
         <w:pStyle w:val="Cmsor2"/>
         <w:numPr>
           <w:ilvl w:val="0"/>
-          <w:numId w:val="15"/>
+          <w:numId w:val="34"/>
         </w:numPr>
       </w:pPr>
       <w:bookmarkStart w:id="136" w:name="_Toc224735089"/>
@@ -21570,7 +19135,7 @@
         <w:pStyle w:val="Cmsor2"/>
         <w:numPr>
           <w:ilvl w:val="0"/>
-          <w:numId w:val="15"/>
+          <w:numId w:val="34"/>
         </w:numPr>
       </w:pPr>
       <w:bookmarkStart w:id="140" w:name="_Toc224735097"/>
@@ -35384,6 +32949,95 @@
     </w:lvl>
   </w:abstractNum>
   <w:abstractNum w:abstractNumId="2" w15:restartNumberingAfterBreak="0">
+    <w:nsid w:val="03841983"/>
+    <w:multiLevelType w:val="hybridMultilevel"/>
+    <w:tmpl w:val="06869528"/>
+    <w:lvl w:ilvl="0" w:tplc="040E000F">
+      <w:start w:val="1"/>
+      <w:numFmt w:val="decimal"/>
+      <w:lvlText w:val="%1."/>
+      <w:lvlJc w:val="left"/>
+      <w:pPr>
+        <w:ind w:left="720" w:hanging="360"/>
+      </w:pPr>
+      <w:rPr>
+        <w:rFonts w:hint="default"/>
+      </w:rPr>
+    </w:lvl>
+    <w:lvl w:ilvl="1" w:tplc="040E0019" w:tentative="1">
+      <w:start w:val="1"/>
+      <w:numFmt w:val="lowerLetter"/>
+      <w:lvlText w:val="%2."/>
+      <w:lvlJc w:val="left"/>
+      <w:pPr>
+        <w:ind w:left="1440" w:hanging="360"/>
+      </w:pPr>
+    </w:lvl>
+    <w:lvl w:ilvl="2" w:tplc="040E001B" w:tentative="1">
+      <w:start w:val="1"/>
+      <w:numFmt w:val="lowerRoman"/>
+      <w:lvlText w:val="%3."/>
+      <w:lvlJc w:val="right"/>
+      <w:pPr>
+        <w:ind w:left="2160" w:hanging="180"/>
+      </w:pPr>
+    </w:lvl>
+    <w:lvl w:ilvl="3" w:tplc="040E000F" w:tentative="1">
+      <w:start w:val="1"/>
+      <w:numFmt w:val="decimal"/>
+      <w:lvlText w:val="%4."/>
+      <w:lvlJc w:val="left"/>
+      <w:pPr>
+        <w:ind w:left="2880" w:hanging="360"/>
+      </w:pPr>
+    </w:lvl>
+    <w:lvl w:ilvl="4" w:tplc="040E0019" w:tentative="1">
+      <w:start w:val="1"/>
+      <w:numFmt w:val="lowerLetter"/>
+      <w:lvlText w:val="%5."/>
+      <w:lvlJc w:val="left"/>
+      <w:pPr>
+        <w:ind w:left="3600" w:hanging="360"/>
+      </w:pPr>
+    </w:lvl>
+    <w:lvl w:ilvl="5" w:tplc="040E001B" w:tentative="1">
+      <w:start w:val="1"/>
+      <w:numFmt w:val="lowerRoman"/>
+      <w:lvlText w:val="%6."/>
+      <w:lvlJc w:val="right"/>
+      <w:pPr>
+        <w:ind w:left="4320" w:hanging="180"/>
+      </w:pPr>
+    </w:lvl>
+    <w:lvl w:ilvl="6" w:tplc="040E000F" w:tentative="1">
+      <w:start w:val="1"/>
+      <w:numFmt w:val="decimal"/>
+      <w:lvlText w:val="%7."/>
+      <w:lvlJc w:val="left"/>
+      <w:pPr>
+        <w:ind w:left="5040" w:hanging="360"/>
+      </w:pPr>
+    </w:lvl>
+    <w:lvl w:ilvl="7" w:tplc="040E0019" w:tentative="1">
+      <w:start w:val="1"/>
+      <w:numFmt w:val="lowerLetter"/>
+      <w:lvlText w:val="%8."/>
+      <w:lvlJc w:val="left"/>
+      <w:pPr>
+        <w:ind w:left="5760" w:hanging="360"/>
+      </w:pPr>
+    </w:lvl>
+    <w:lvl w:ilvl="8" w:tplc="040E001B" w:tentative="1">
+      <w:start w:val="1"/>
+      <w:numFmt w:val="lowerRoman"/>
+      <w:lvlText w:val="%9."/>
+      <w:lvlJc w:val="right"/>
+      <w:pPr>
+        <w:ind w:left="6480" w:hanging="180"/>
+      </w:pPr>
+    </w:lvl>
+  </w:abstractNum>
+  <w:abstractNum w:abstractNumId="3" w15:restartNumberingAfterBreak="0">
     <w:nsid w:val="06C26B6C"/>
     <w:multiLevelType w:val="multilevel"/>
     <w:tmpl w:val="A6463C60"/>
@@ -35506,7 +33160,7 @@
       </w:rPr>
     </w:lvl>
   </w:abstractNum>
-  <w:abstractNum w:abstractNumId="3" w15:restartNumberingAfterBreak="0">
+  <w:abstractNum w:abstractNumId="4" w15:restartNumberingAfterBreak="0">
     <w:nsid w:val="0BB70F61"/>
     <w:multiLevelType w:val="hybridMultilevel"/>
     <w:tmpl w:val="5F48A102"/>
@@ -35560,7 +33214,7 @@
       <w:lvlJc w:val="left"/>
     </w:lvl>
   </w:abstractNum>
-  <w:abstractNum w:abstractNumId="4" w15:restartNumberingAfterBreak="0">
+  <w:abstractNum w:abstractNumId="5" w15:restartNumberingAfterBreak="0">
     <w:nsid w:val="10012B73"/>
     <w:multiLevelType w:val="multilevel"/>
     <w:tmpl w:val="7F8A313C"/>
@@ -35678,7 +33332,7 @@
       </w:rPr>
     </w:lvl>
   </w:abstractNum>
-  <w:abstractNum w:abstractNumId="5" w15:restartNumberingAfterBreak="0">
+  <w:abstractNum w:abstractNumId="6" w15:restartNumberingAfterBreak="0">
     <w:nsid w:val="182743D5"/>
     <w:multiLevelType w:val="multilevel"/>
     <w:tmpl w:val="1A686B4A"/>
@@ -35782,7 +33436,7 @@
       </w:rPr>
     </w:lvl>
   </w:abstractNum>
-  <w:abstractNum w:abstractNumId="6" w15:restartNumberingAfterBreak="0">
+  <w:abstractNum w:abstractNumId="7" w15:restartNumberingAfterBreak="0">
     <w:nsid w:val="19FF0778"/>
     <w:multiLevelType w:val="hybridMultilevel"/>
     <w:tmpl w:val="405C5F40"/>
@@ -35894,7 +33548,7 @@
       </w:rPr>
     </w:lvl>
   </w:abstractNum>
-  <w:abstractNum w:abstractNumId="7" w15:restartNumberingAfterBreak="0">
+  <w:abstractNum w:abstractNumId="8" w15:restartNumberingAfterBreak="0">
     <w:nsid w:val="219D2B5A"/>
     <w:multiLevelType w:val="hybridMultilevel"/>
     <w:tmpl w:val="993E7308"/>
@@ -36006,7 +33660,7 @@
       </w:rPr>
     </w:lvl>
   </w:abstractNum>
-  <w:abstractNum w:abstractNumId="8" w15:restartNumberingAfterBreak="0">
+  <w:abstractNum w:abstractNumId="9" w15:restartNumberingAfterBreak="0">
     <w:nsid w:val="221F4A44"/>
     <w:multiLevelType w:val="multilevel"/>
     <w:tmpl w:val="C2BA00A0"/>
@@ -36110,7 +33764,7 @@
       </w:rPr>
     </w:lvl>
   </w:abstractNum>
-  <w:abstractNum w:abstractNumId="9" w15:restartNumberingAfterBreak="0">
+  <w:abstractNum w:abstractNumId="10" w15:restartNumberingAfterBreak="0">
     <w:nsid w:val="25BD6B69"/>
     <w:multiLevelType w:val="multilevel"/>
     <w:tmpl w:val="E89673F6"/>
@@ -36214,7 +33868,7 @@
       </w:rPr>
     </w:lvl>
   </w:abstractNum>
-  <w:abstractNum w:abstractNumId="10" w15:restartNumberingAfterBreak="0">
+  <w:abstractNum w:abstractNumId="11" w15:restartNumberingAfterBreak="0">
     <w:nsid w:val="2B65713D"/>
     <w:multiLevelType w:val="multilevel"/>
     <w:tmpl w:val="EB62A0B0"/>
@@ -36318,7 +33972,93 @@
       </w:rPr>
     </w:lvl>
   </w:abstractNum>
-  <w:abstractNum w:abstractNumId="11" w15:restartNumberingAfterBreak="0">
+  <w:abstractNum w:abstractNumId="12" w15:restartNumberingAfterBreak="0">
+    <w:nsid w:val="2E0236E6"/>
+    <w:multiLevelType w:val="hybridMultilevel"/>
+    <w:tmpl w:val="EE1095B6"/>
+    <w:lvl w:ilvl="0" w:tplc="040E000F">
+      <w:start w:val="1"/>
+      <w:numFmt w:val="decimal"/>
+      <w:lvlText w:val="%1."/>
+      <w:lvlJc w:val="left"/>
+      <w:pPr>
+        <w:ind w:left="1176" w:hanging="360"/>
+      </w:pPr>
+    </w:lvl>
+    <w:lvl w:ilvl="1" w:tplc="040E0019" w:tentative="1">
+      <w:start w:val="1"/>
+      <w:numFmt w:val="lowerLetter"/>
+      <w:lvlText w:val="%2."/>
+      <w:lvlJc w:val="left"/>
+      <w:pPr>
+        <w:ind w:left="1896" w:hanging="360"/>
+      </w:pPr>
+    </w:lvl>
+    <w:lvl w:ilvl="2" w:tplc="040E001B" w:tentative="1">
+      <w:start w:val="1"/>
+      <w:numFmt w:val="lowerRoman"/>
+      <w:lvlText w:val="%3."/>
+      <w:lvlJc w:val="right"/>
+      <w:pPr>
+        <w:ind w:left="2616" w:hanging="180"/>
+      </w:pPr>
+    </w:lvl>
+    <w:lvl w:ilvl="3" w:tplc="040E000F" w:tentative="1">
+      <w:start w:val="1"/>
+      <w:numFmt w:val="decimal"/>
+      <w:lvlText w:val="%4."/>
+      <w:lvlJc w:val="left"/>
+      <w:pPr>
+        <w:ind w:left="3336" w:hanging="360"/>
+      </w:pPr>
+    </w:lvl>
+    <w:lvl w:ilvl="4" w:tplc="040E0019" w:tentative="1">
+      <w:start w:val="1"/>
+      <w:numFmt w:val="lowerLetter"/>
+      <w:lvlText w:val="%5."/>
+      <w:lvlJc w:val="left"/>
+      <w:pPr>
+        <w:ind w:left="4056" w:hanging="360"/>
+      </w:pPr>
+    </w:lvl>
+    <w:lvl w:ilvl="5" w:tplc="040E001B" w:tentative="1">
+      <w:start w:val="1"/>
+      <w:numFmt w:val="lowerRoman"/>
+      <w:lvlText w:val="%6."/>
+      <w:lvlJc w:val="right"/>
+      <w:pPr>
+        <w:ind w:left="4776" w:hanging="180"/>
+      </w:pPr>
+    </w:lvl>
+    <w:lvl w:ilvl="6" w:tplc="040E000F" w:tentative="1">
+      <w:start w:val="1"/>
+      <w:numFmt w:val="decimal"/>
+      <w:lvlText w:val="%7."/>
+      <w:lvlJc w:val="left"/>
+      <w:pPr>
+        <w:ind w:left="5496" w:hanging="360"/>
+      </w:pPr>
+    </w:lvl>
+    <w:lvl w:ilvl="7" w:tplc="040E0019" w:tentative="1">
+      <w:start w:val="1"/>
+      <w:numFmt w:val="lowerLetter"/>
+      <w:lvlText w:val="%8."/>
+      <w:lvlJc w:val="left"/>
+      <w:pPr>
+        <w:ind w:left="6216" w:hanging="360"/>
+      </w:pPr>
+    </w:lvl>
+    <w:lvl w:ilvl="8" w:tplc="040E001B" w:tentative="1">
+      <w:start w:val="1"/>
+      <w:numFmt w:val="lowerRoman"/>
+      <w:lvlText w:val="%9."/>
+      <w:lvlJc w:val="right"/>
+      <w:pPr>
+        <w:ind w:left="6936" w:hanging="180"/>
+      </w:pPr>
+    </w:lvl>
+  </w:abstractNum>
+  <w:abstractNum w:abstractNumId="13" w15:restartNumberingAfterBreak="0">
     <w:nsid w:val="2E8C6C63"/>
     <w:multiLevelType w:val="hybridMultilevel"/>
     <w:tmpl w:val="96BC1972"/>
@@ -36431,7 +34171,7 @@
       </w:rPr>
     </w:lvl>
   </w:abstractNum>
-  <w:abstractNum w:abstractNumId="12" w15:restartNumberingAfterBreak="0">
+  <w:abstractNum w:abstractNumId="14" w15:restartNumberingAfterBreak="0">
     <w:nsid w:val="3D6E604A"/>
     <w:multiLevelType w:val="multilevel"/>
     <w:tmpl w:val="A9E2E134"/>
@@ -36547,7 +34287,7 @@
       </w:pPr>
     </w:lvl>
   </w:abstractNum>
-  <w:abstractNum w:abstractNumId="13" w15:restartNumberingAfterBreak="0">
+  <w:abstractNum w:abstractNumId="15" w15:restartNumberingAfterBreak="0">
     <w:nsid w:val="403742B1"/>
     <w:multiLevelType w:val="hybridMultilevel"/>
     <w:tmpl w:val="E9F60690"/>
@@ -36660,7 +34400,7 @@
       </w:rPr>
     </w:lvl>
   </w:abstractNum>
-  <w:abstractNum w:abstractNumId="14" w15:restartNumberingAfterBreak="0">
+  <w:abstractNum w:abstractNumId="16" w15:restartNumberingAfterBreak="0">
     <w:nsid w:val="44595355"/>
     <w:multiLevelType w:val="multilevel"/>
     <w:tmpl w:val="4C2807C2"/>
@@ -36764,7 +34504,7 @@
       </w:rPr>
     </w:lvl>
   </w:abstractNum>
-  <w:abstractNum w:abstractNumId="15" w15:restartNumberingAfterBreak="0">
+  <w:abstractNum w:abstractNumId="17" w15:restartNumberingAfterBreak="0">
     <w:nsid w:val="49730045"/>
     <w:multiLevelType w:val="multilevel"/>
     <w:tmpl w:val="22580586"/>
@@ -36877,7 +34617,7 @@
       </w:rPr>
     </w:lvl>
   </w:abstractNum>
-  <w:abstractNum w:abstractNumId="16" w15:restartNumberingAfterBreak="0">
+  <w:abstractNum w:abstractNumId="18" w15:restartNumberingAfterBreak="0">
     <w:nsid w:val="4A032562"/>
     <w:multiLevelType w:val="hybridMultilevel"/>
     <w:tmpl w:val="BD9C8038"/>
@@ -36989,7 +34729,7 @@
       </w:rPr>
     </w:lvl>
   </w:abstractNum>
-  <w:abstractNum w:abstractNumId="17" w15:restartNumberingAfterBreak="0">
+  <w:abstractNum w:abstractNumId="19" w15:restartNumberingAfterBreak="0">
     <w:nsid w:val="4D033C83"/>
     <w:multiLevelType w:val="hybridMultilevel"/>
     <w:tmpl w:val="1C880074"/>
@@ -37100,7 +34840,7 @@
       </w:rPr>
     </w:lvl>
   </w:abstractNum>
-  <w:abstractNum w:abstractNumId="18" w15:restartNumberingAfterBreak="0">
+  <w:abstractNum w:abstractNumId="20" w15:restartNumberingAfterBreak="0">
     <w:nsid w:val="4EA673CB"/>
     <w:multiLevelType w:val="hybridMultilevel"/>
     <w:tmpl w:val="7F14BC7A"/>
@@ -37212,7 +34952,7 @@
       </w:rPr>
     </w:lvl>
   </w:abstractNum>
-  <w:abstractNum w:abstractNumId="19" w15:restartNumberingAfterBreak="0">
+  <w:abstractNum w:abstractNumId="21" w15:restartNumberingAfterBreak="0">
     <w:nsid w:val="50883937"/>
     <w:multiLevelType w:val="multilevel"/>
     <w:tmpl w:val="4B6AA1E4"/>
@@ -37325,7 +35065,7 @@
       </w:rPr>
     </w:lvl>
   </w:abstractNum>
-  <w:abstractNum w:abstractNumId="20" w15:restartNumberingAfterBreak="0">
+  <w:abstractNum w:abstractNumId="22" w15:restartNumberingAfterBreak="0">
     <w:nsid w:val="55492653"/>
     <w:multiLevelType w:val="multilevel"/>
     <w:tmpl w:val="D59AECA8"/>
@@ -37429,7 +35169,7 @@
       </w:rPr>
     </w:lvl>
   </w:abstractNum>
-  <w:abstractNum w:abstractNumId="21" w15:restartNumberingAfterBreak="0">
+  <w:abstractNum w:abstractNumId="23" w15:restartNumberingAfterBreak="0">
     <w:nsid w:val="56C05A14"/>
     <w:multiLevelType w:val="multilevel"/>
     <w:tmpl w:val="0742E9C2"/>
@@ -37533,7 +35273,7 @@
       </w:rPr>
     </w:lvl>
   </w:abstractNum>
-  <w:abstractNum w:abstractNumId="22" w15:restartNumberingAfterBreak="0">
+  <w:abstractNum w:abstractNumId="24" w15:restartNumberingAfterBreak="0">
     <w:nsid w:val="5F4D5D86"/>
     <w:multiLevelType w:val="multilevel"/>
     <w:tmpl w:val="40906630"/>
@@ -37656,7 +35396,96 @@
       </w:rPr>
     </w:lvl>
   </w:abstractNum>
-  <w:abstractNum w:abstractNumId="23" w15:restartNumberingAfterBreak="0">
+  <w:abstractNum w:abstractNumId="25" w15:restartNumberingAfterBreak="0">
+    <w:nsid w:val="661878F7"/>
+    <w:multiLevelType w:val="hybridMultilevel"/>
+    <w:tmpl w:val="FD7E702E"/>
+    <w:lvl w:ilvl="0" w:tplc="040E000F">
+      <w:start w:val="1"/>
+      <w:numFmt w:val="decimal"/>
+      <w:lvlText w:val="%1."/>
+      <w:lvlJc w:val="left"/>
+      <w:pPr>
+        <w:ind w:left="720" w:hanging="360"/>
+      </w:pPr>
+      <w:rPr>
+        <w:rFonts w:hint="default"/>
+      </w:rPr>
+    </w:lvl>
+    <w:lvl w:ilvl="1" w:tplc="040E0019" w:tentative="1">
+      <w:start w:val="1"/>
+      <w:numFmt w:val="lowerLetter"/>
+      <w:lvlText w:val="%2."/>
+      <w:lvlJc w:val="left"/>
+      <w:pPr>
+        <w:ind w:left="1440" w:hanging="360"/>
+      </w:pPr>
+    </w:lvl>
+    <w:lvl w:ilvl="2" w:tplc="040E001B" w:tentative="1">
+      <w:start w:val="1"/>
+      <w:numFmt w:val="lowerRoman"/>
+      <w:lvlText w:val="%3."/>
+      <w:lvlJc w:val="right"/>
+      <w:pPr>
+        <w:ind w:left="2160" w:hanging="180"/>
+      </w:pPr>
+    </w:lvl>
+    <w:lvl w:ilvl="3" w:tplc="040E000F" w:tentative="1">
+      <w:start w:val="1"/>
+      <w:numFmt w:val="decimal"/>
+      <w:lvlText w:val="%4."/>
+      <w:lvlJc w:val="left"/>
+      <w:pPr>
+        <w:ind w:left="2880" w:hanging="360"/>
+      </w:pPr>
+    </w:lvl>
+    <w:lvl w:ilvl="4" w:tplc="040E0019" w:tentative="1">
+      <w:start w:val="1"/>
+      <w:numFmt w:val="lowerLetter"/>
+      <w:lvlText w:val="%5."/>
+      <w:lvlJc w:val="left"/>
+      <w:pPr>
+        <w:ind w:left="3600" w:hanging="360"/>
+      </w:pPr>
+    </w:lvl>
+    <w:lvl w:ilvl="5" w:tplc="040E001B" w:tentative="1">
+      <w:start w:val="1"/>
+      <w:numFmt w:val="lowerRoman"/>
+      <w:lvlText w:val="%6."/>
+      <w:lvlJc w:val="right"/>
+      <w:pPr>
+        <w:ind w:left="4320" w:hanging="180"/>
+      </w:pPr>
+    </w:lvl>
+    <w:lvl w:ilvl="6" w:tplc="040E000F" w:tentative="1">
+      <w:start w:val="1"/>
+      <w:numFmt w:val="decimal"/>
+      <w:lvlText w:val="%7."/>
+      <w:lvlJc w:val="left"/>
+      <w:pPr>
+        <w:ind w:left="5040" w:hanging="360"/>
+      </w:pPr>
+    </w:lvl>
+    <w:lvl w:ilvl="7" w:tplc="040E0019" w:tentative="1">
+      <w:start w:val="1"/>
+      <w:numFmt w:val="lowerLetter"/>
+      <w:lvlText w:val="%8."/>
+      <w:lvlJc w:val="left"/>
+      <w:pPr>
+        <w:ind w:left="5760" w:hanging="360"/>
+      </w:pPr>
+    </w:lvl>
+    <w:lvl w:ilvl="8" w:tplc="040E001B" w:tentative="1">
+      <w:start w:val="1"/>
+      <w:numFmt w:val="lowerRoman"/>
+      <w:lvlText w:val="%9."/>
+      <w:lvlJc w:val="right"/>
+      <w:pPr>
+        <w:ind w:left="6480" w:hanging="180"/>
+      </w:pPr>
+    </w:lvl>
+  </w:abstractNum>
+  <w:abstractNum w:abstractNumId="26" w15:restartNumberingAfterBreak="0">
     <w:nsid w:val="6BB727D7"/>
     <w:multiLevelType w:val="multilevel"/>
     <w:tmpl w:val="5E9C086E"/>
@@ -37760,7 +35589,7 @@
       </w:rPr>
     </w:lvl>
   </w:abstractNum>
-  <w:abstractNum w:abstractNumId="24" w15:restartNumberingAfterBreak="0">
+  <w:abstractNum w:abstractNumId="27" w15:restartNumberingAfterBreak="0">
     <w:nsid w:val="6E19139A"/>
     <w:multiLevelType w:val="multilevel"/>
     <w:tmpl w:val="976EFF62"/>
@@ -37873,7 +35702,7 @@
       </w:rPr>
     </w:lvl>
   </w:abstractNum>
-  <w:abstractNum w:abstractNumId="25" w15:restartNumberingAfterBreak="0">
+  <w:abstractNum w:abstractNumId="28" w15:restartNumberingAfterBreak="0">
     <w:nsid w:val="733805BE"/>
     <w:multiLevelType w:val="multilevel"/>
     <w:tmpl w:val="06649D2C"/>
@@ -37977,7 +35806,7 @@
       </w:rPr>
     </w:lvl>
   </w:abstractNum>
-  <w:abstractNum w:abstractNumId="26" w15:restartNumberingAfterBreak="0">
+  <w:abstractNum w:abstractNumId="29" w15:restartNumberingAfterBreak="0">
     <w:nsid w:val="74803501"/>
     <w:multiLevelType w:val="hybridMultilevel"/>
     <w:tmpl w:val="3CA26B96"/>
@@ -38031,7 +35860,7 @@
       <w:lvlJc w:val="left"/>
     </w:lvl>
   </w:abstractNum>
-  <w:abstractNum w:abstractNumId="27" w15:restartNumberingAfterBreak="0">
+  <w:abstractNum w:abstractNumId="30" w15:restartNumberingAfterBreak="0">
     <w:nsid w:val="77FA050B"/>
     <w:multiLevelType w:val="hybridMultilevel"/>
     <w:tmpl w:val="6F32661C"/>
@@ -38144,7 +35973,7 @@
       </w:rPr>
     </w:lvl>
   </w:abstractNum>
-  <w:abstractNum w:abstractNumId="28" w15:restartNumberingAfterBreak="0">
+  <w:abstractNum w:abstractNumId="31" w15:restartNumberingAfterBreak="0">
     <w:nsid w:val="789C4A82"/>
     <w:multiLevelType w:val="multilevel"/>
     <w:tmpl w:val="2E027D98"/>
@@ -38248,7 +36077,7 @@
       </w:rPr>
     </w:lvl>
   </w:abstractNum>
-  <w:abstractNum w:abstractNumId="29" w15:restartNumberingAfterBreak="0">
+  <w:abstractNum w:abstractNumId="32" w15:restartNumberingAfterBreak="0">
     <w:nsid w:val="7BCE58ED"/>
     <w:multiLevelType w:val="multilevel"/>
     <w:tmpl w:val="964C897E"/>
@@ -38352,7 +36181,7 @@
       </w:rPr>
     </w:lvl>
   </w:abstractNum>
-  <w:abstractNum w:abstractNumId="30" w15:restartNumberingAfterBreak="0">
+  <w:abstractNum w:abstractNumId="33" w15:restartNumberingAfterBreak="0">
     <w:nsid w:val="7E9C0859"/>
     <w:multiLevelType w:val="multilevel"/>
     <w:tmpl w:val="F0D0F904"/>
@@ -38457,103 +36286,112 @@
     </w:lvl>
   </w:abstractNum>
   <w:num w:numId="1" w16cid:durableId="510946596">
+    <w:abstractNumId w:val="8"/>
+  </w:num>
+  <w:num w:numId="2" w16cid:durableId="1258948589">
+    <w:abstractNumId w:val="19"/>
+  </w:num>
+  <w:num w:numId="3" w16cid:durableId="1514998300">
+    <w:abstractNumId w:val="18"/>
+  </w:num>
+  <w:num w:numId="4" w16cid:durableId="835530726">
+    <w:abstractNumId w:val="20"/>
+  </w:num>
+  <w:num w:numId="5" w16cid:durableId="1249193012">
     <w:abstractNumId w:val="7"/>
   </w:num>
-  <w:num w:numId="2" w16cid:durableId="1258948589">
+  <w:num w:numId="6" w16cid:durableId="350959035">
+    <w:abstractNumId w:val="14"/>
+  </w:num>
+  <w:num w:numId="7" w16cid:durableId="1427001115">
+    <w:abstractNumId w:val="13"/>
+  </w:num>
+  <w:num w:numId="8" w16cid:durableId="562955145">
     <w:abstractNumId w:val="17"/>
   </w:num>
-  <w:num w:numId="3" w16cid:durableId="1514998300">
-    <w:abstractNumId w:val="16"/>
-  </w:num>
-  <w:num w:numId="4" w16cid:durableId="835530726">
-    <w:abstractNumId w:val="18"/>
-  </w:num>
-  <w:num w:numId="5" w16cid:durableId="1249193012">
-    <w:abstractNumId w:val="6"/>
-  </w:num>
-  <w:num w:numId="6" w16cid:durableId="350959035">
-    <w:abstractNumId w:val="12"/>
-  </w:num>
-  <w:num w:numId="7" w16cid:durableId="1427001115">
-    <w:abstractNumId w:val="11"/>
-  </w:num>
-  <w:num w:numId="8" w16cid:durableId="562955145">
-    <w:abstractNumId w:val="15"/>
-  </w:num>
   <w:num w:numId="9" w16cid:durableId="1863937486">
-    <w:abstractNumId w:val="22"/>
+    <w:abstractNumId w:val="24"/>
   </w:num>
   <w:num w:numId="10" w16cid:durableId="12923202">
-    <w:abstractNumId w:val="24"/>
+    <w:abstractNumId w:val="27"/>
   </w:num>
   <w:num w:numId="11" w16cid:durableId="664627922">
-    <w:abstractNumId w:val="2"/>
+    <w:abstractNumId w:val="3"/>
   </w:num>
   <w:num w:numId="12" w16cid:durableId="1896621197">
-    <w:abstractNumId w:val="3"/>
+    <w:abstractNumId w:val="4"/>
     <w:lvlOverride w:ilvl="0">
       <w:startOverride w:val="1"/>
     </w:lvlOverride>
   </w:num>
   <w:num w:numId="13" w16cid:durableId="1539121876">
-    <w:abstractNumId w:val="26"/>
+    <w:abstractNumId w:val="29"/>
     <w:lvlOverride w:ilvl="0">
       <w:startOverride w:val="1"/>
     </w:lvlOverride>
   </w:num>
   <w:num w:numId="14" w16cid:durableId="1965304218">
-    <w:abstractNumId w:val="13"/>
+    <w:abstractNumId w:val="15"/>
   </w:num>
   <w:num w:numId="15" w16cid:durableId="1692877755">
-    <w:abstractNumId w:val="4"/>
+    <w:abstractNumId w:val="5"/>
   </w:num>
   <w:num w:numId="16" w16cid:durableId="484249971">
     <w:abstractNumId w:val="1"/>
   </w:num>
   <w:num w:numId="17" w16cid:durableId="1328820979">
-    <w:abstractNumId w:val="29"/>
+    <w:abstractNumId w:val="32"/>
   </w:num>
   <w:num w:numId="18" w16cid:durableId="1546410504">
-    <w:abstractNumId w:val="30"/>
+    <w:abstractNumId w:val="33"/>
   </w:num>
   <w:num w:numId="19" w16cid:durableId="1519544087">
+    <w:abstractNumId w:val="26"/>
+  </w:num>
+  <w:num w:numId="20" w16cid:durableId="690453156">
+    <w:abstractNumId w:val="16"/>
+  </w:num>
+  <w:num w:numId="21" w16cid:durableId="1245796529">
+    <w:abstractNumId w:val="31"/>
+  </w:num>
+  <w:num w:numId="22" w16cid:durableId="2063021016">
+    <w:abstractNumId w:val="22"/>
+  </w:num>
+  <w:num w:numId="23" w16cid:durableId="72170352">
     <w:abstractNumId w:val="23"/>
   </w:num>
-  <w:num w:numId="20" w16cid:durableId="690453156">
-    <w:abstractNumId w:val="14"/>
-  </w:num>
-  <w:num w:numId="21" w16cid:durableId="1245796529">
-    <w:abstractNumId w:val="28"/>
-  </w:num>
-  <w:num w:numId="22" w16cid:durableId="2063021016">
-    <w:abstractNumId w:val="20"/>
-  </w:num>
-  <w:num w:numId="23" w16cid:durableId="72170352">
-    <w:abstractNumId w:val="21"/>
-  </w:num>
   <w:num w:numId="24" w16cid:durableId="292568035">
-    <w:abstractNumId w:val="5"/>
+    <w:abstractNumId w:val="6"/>
   </w:num>
   <w:num w:numId="25" w16cid:durableId="528953538">
     <w:abstractNumId w:val="0"/>
   </w:num>
   <w:num w:numId="26" w16cid:durableId="1122269303">
+    <w:abstractNumId w:val="10"/>
+  </w:num>
+  <w:num w:numId="27" w16cid:durableId="1036002011">
     <w:abstractNumId w:val="9"/>
   </w:num>
-  <w:num w:numId="27" w16cid:durableId="1036002011">
-    <w:abstractNumId w:val="8"/>
-  </w:num>
   <w:num w:numId="28" w16cid:durableId="54015460">
-    <w:abstractNumId w:val="10"/>
+    <w:abstractNumId w:val="11"/>
   </w:num>
   <w:num w:numId="29" w16cid:durableId="2055078895">
+    <w:abstractNumId w:val="28"/>
+  </w:num>
+  <w:num w:numId="30" w16cid:durableId="154534637">
+    <w:abstractNumId w:val="21"/>
+  </w:num>
+  <w:num w:numId="31" w16cid:durableId="477380564">
+    <w:abstractNumId w:val="30"/>
+  </w:num>
+  <w:num w:numId="32" w16cid:durableId="2105026385">
+    <w:abstractNumId w:val="2"/>
+  </w:num>
+  <w:num w:numId="33" w16cid:durableId="1883705874">
     <w:abstractNumId w:val="25"/>
   </w:num>
-  <w:num w:numId="30" w16cid:durableId="154534637">
-    <w:abstractNumId w:val="19"/>
-  </w:num>
-  <w:num w:numId="31" w16cid:durableId="477380564">
-    <w:abstractNumId w:val="27"/>
+  <w:num w:numId="34" w16cid:durableId="1862357792">
+    <w:abstractNumId w:val="12"/>
   </w:num>
   <w:numIdMacAtCleanup w:val="31"/>
 </w:numbering>

</xml_diff>